<commit_message>
docs: update learning diary with Part 1 and Part 2 progress
</commit_message>
<xml_diff>
--- a/Learning_diary.docx
+++ b/Learning_diary.docx
@@ -1,834 +1,170 @@
 
 <file path=word/document.xml><?xml version="1.0" encoding="utf-8"?>
-<w:document xmlns:wpc="http://schemas.microsoft.com/office/word/2010/wordprocessingCanvas" xmlns:cx="http://schemas.microsoft.com/office/drawing/2014/chartex" xmlns:cx1="http://schemas.microsoft.com/office/drawing/2015/9/8/chartex" xmlns:cx2="http://schemas.microsoft.com/office/drawing/2015/10/21/chartex" xmlns:cx3="http://schemas.microsoft.com/office/drawing/2016/5/9/chartex" xmlns:cx4="http://schemas.microsoft.com/office/drawing/2016/5/10/chartex" xmlns:cx5="http://schemas.microsoft.com/office/drawing/2016/5/11/chartex" xmlns:cx6="http://schemas.microsoft.com/office/drawing/2016/5/12/chartex" xmlns:cx7="http://schemas.microsoft.com/office/drawing/2016/5/13/chartex" xmlns:cx8="http://schemas.microsoft.com/office/drawing/2016/5/14/chartex" xmlns:mc="http://schemas.openxmlformats.org/markup-compatibility/2006" xmlns:aink="http://schemas.microsoft.com/office/drawing/2016/ink" xmlns:am3d="http://schemas.microsoft.com/office/drawing/2017/model3d" xmlns:o="urn:schemas-microsoft-com:office:office" xmlns:r="http://schemas.openxmlformats.org/officeDocument/2006/relationships" xmlns:m="http://schemas.openxmlformats.org/officeDocument/2006/math" xmlns:v="urn:schemas-microsoft-com:vml" xmlns:wp14="http://schemas.microsoft.com/office/word/2010/wordprocessingDrawing" xmlns:wp="http://schemas.openxmlformats.org/drawingml/2006/wordprocessingDrawing" xmlns:w10="urn:schemas-microsoft-com:office:word" xmlns:w="http://schemas.openxmlformats.org/wordprocessingml/2006/main" xmlns:w14="http://schemas.microsoft.com/office/word/2010/wordml" xmlns:w15="http://schemas.microsoft.com/office/word/2012/wordml" xmlns:w16cid="http://schemas.microsoft.com/office/word/2016/wordml/cid" xmlns:w16se="http://schemas.microsoft.com/office/word/2015/wordml/symex" xmlns:wpg="http://schemas.microsoft.com/office/word/2010/wordprocessingGroup" xmlns:wpi="http://schemas.microsoft.com/office/word/2010/wordprocessingInk" xmlns:wne="http://schemas.microsoft.com/office/word/2006/wordml" xmlns:wps="http://schemas.microsoft.com/office/word/2010/wordprocessingShape" mc:Ignorable="w14 w15 w16se w16cid wp14">
+<w:document xmlns:wpc="http://schemas.microsoft.com/office/word/2010/wordprocessingCanvas" xmlns:cx="http://schemas.microsoft.com/office/drawing/2014/chartex" xmlns:cx1="http://schemas.microsoft.com/office/drawing/2015/9/8/chartex" xmlns:cx2="http://schemas.microsoft.com/office/drawing/2015/10/21/chartex" xmlns:cx3="http://schemas.microsoft.com/office/drawing/2016/5/9/chartex" xmlns:cx4="http://schemas.microsoft.com/office/drawing/2016/5/10/chartex" xmlns:cx5="http://schemas.microsoft.com/office/drawing/2016/5/11/chartex" xmlns:cx6="http://schemas.microsoft.com/office/drawing/2016/5/12/chartex" xmlns:cx7="http://schemas.microsoft.com/office/drawing/2016/5/13/chartex" xmlns:cx8="http://schemas.microsoft.com/office/drawing/2016/5/14/chartex" xmlns:mc="http://schemas.openxmlformats.org/markup-compatibility/2006" xmlns:aink="http://schemas.microsoft.com/office/drawing/2016/ink" xmlns:am3d="http://schemas.microsoft.com/office/drawing/2017/model3d" xmlns:o="urn:schemas-microsoft-com:office:office" xmlns:oel="http://schemas.microsoft.com/office/2019/extlst" xmlns:r="http://schemas.openxmlformats.org/officeDocument/2006/relationships" xmlns:m="http://schemas.openxmlformats.org/officeDocument/2006/math" xmlns:v="urn:schemas-microsoft-com:vml" xmlns:wp14="http://schemas.microsoft.com/office/word/2010/wordprocessingDrawing" xmlns:wp="http://schemas.openxmlformats.org/drawingml/2006/wordprocessingDrawing" xmlns:w10="urn:schemas-microsoft-com:office:word" xmlns:w="http://schemas.openxmlformats.org/wordprocessingml/2006/main" xmlns:w14="http://schemas.microsoft.com/office/word/2010/wordml" xmlns:w15="http://schemas.microsoft.com/office/word/2012/wordml" xmlns:w16cex="http://schemas.microsoft.com/office/word/2018/wordml/cex" xmlns:w16cid="http://schemas.microsoft.com/office/word/2016/wordml/cid" xmlns:w16="http://schemas.microsoft.com/office/word/2018/wordml" xmlns:w16du="http://schemas.microsoft.com/office/word/2023/wordml/word16du" xmlns:w16sdtdh="http://schemas.microsoft.com/office/word/2020/wordml/sdtdatahash" xmlns:w16sdtfl="http://schemas.microsoft.com/office/word/2024/wordml/sdtformatlock" xmlns:w16se="http://schemas.microsoft.com/office/word/2015/wordml/symex" xmlns:wpg="http://schemas.microsoft.com/office/word/2010/wordprocessingGroup" xmlns:wpi="http://schemas.microsoft.com/office/word/2010/wordprocessingInk" xmlns:wne="http://schemas.microsoft.com/office/word/2006/wordml" xmlns:wps="http://schemas.microsoft.com/office/word/2010/wordprocessingShape" mc:Ignorable="w14 w15 w16se w16cid w16 w16cex w16sdtdh w16sdtfl w16du wp14">
   <w:body>
     <w:p>
-      <w:pPr>
-        <w:pStyle w:val="Otsikko"/>
-        <w:jc w:val="both"/>
-        <w:rPr>
-          <w:rFonts w:ascii="Times New Roman" w:hAnsi="Times New Roman" w:cs="Times New Roman"/>
-          <w:b w:val="0"/>
-          <w:sz w:val="24"/>
-          <w:szCs w:val="24"/>
-          <w:lang w:val="en-US"/>
-        </w:rPr>
-      </w:pPr>
-      <w:proofErr w:type="spellStart"/>
       <w:r>
-        <w:rPr>
-          <w:rFonts w:ascii="Times New Roman" w:hAnsi="Times New Roman" w:cs="Times New Roman"/>
-          <w:b w:val="0"/>
-          <w:sz w:val="24"/>
-          <w:szCs w:val="24"/>
-          <w:lang w:val="en-US"/>
-        </w:rPr>
-        <w:t>Lappeenrannan</w:t>
-      </w:r>
-      <w:proofErr w:type="spellEnd"/>
-      <w:r>
-        <w:rPr>
-          <w:rFonts w:ascii="Times New Roman" w:hAnsi="Times New Roman" w:cs="Times New Roman"/>
-          <w:b w:val="0"/>
-          <w:sz w:val="24"/>
-          <w:szCs w:val="24"/>
-          <w:lang w:val="en-US"/>
-        </w:rPr>
-        <w:t xml:space="preserve"> </w:t>
-      </w:r>
-      <w:proofErr w:type="spellStart"/>
-      <w:r>
-        <w:rPr>
-          <w:rFonts w:ascii="Times New Roman" w:hAnsi="Times New Roman" w:cs="Times New Roman"/>
-          <w:b w:val="0"/>
-          <w:sz w:val="24"/>
-          <w:szCs w:val="24"/>
-          <w:lang w:val="en-US"/>
-        </w:rPr>
-        <w:t>teknillinen</w:t>
-      </w:r>
-      <w:proofErr w:type="spellEnd"/>
-      <w:r>
-        <w:rPr>
-          <w:rFonts w:ascii="Times New Roman" w:hAnsi="Times New Roman" w:cs="Times New Roman"/>
-          <w:b w:val="0"/>
-          <w:sz w:val="24"/>
-          <w:szCs w:val="24"/>
-          <w:lang w:val="en-US"/>
-        </w:rPr>
-        <w:t xml:space="preserve"> </w:t>
-      </w:r>
-      <w:proofErr w:type="spellStart"/>
-      <w:r>
-        <w:rPr>
-          <w:rFonts w:ascii="Times New Roman" w:hAnsi="Times New Roman" w:cs="Times New Roman"/>
-          <w:b w:val="0"/>
-          <w:sz w:val="24"/>
-          <w:szCs w:val="24"/>
-          <w:lang w:val="en-US"/>
-        </w:rPr>
-        <w:t>yliopisto</w:t>
-      </w:r>
-      <w:proofErr w:type="spellEnd"/>
-    </w:p>
-    <w:p>
-      <w:pPr>
-        <w:pStyle w:val="Otsikko"/>
-        <w:jc w:val="both"/>
-        <w:rPr>
-          <w:rFonts w:ascii="Times New Roman" w:hAnsi="Times New Roman" w:cs="Times New Roman"/>
-          <w:b w:val="0"/>
-          <w:sz w:val="24"/>
-          <w:szCs w:val="24"/>
-          <w:lang w:val="en-US"/>
-        </w:rPr>
-      </w:pPr>
-      <w:r>
-        <w:rPr>
-          <w:rFonts w:ascii="Times New Roman" w:hAnsi="Times New Roman" w:cs="Times New Roman"/>
-          <w:b w:val="0"/>
-          <w:sz w:val="24"/>
-          <w:szCs w:val="24"/>
-          <w:lang w:val="en-US"/>
-        </w:rPr>
-        <w:t>School of Business and Management</w:t>
+        <w:t>1.9.2026</w:t>
       </w:r>
     </w:p>
     <w:p>
       <w:pPr>
-        <w:pStyle w:val="Otsikko"/>
-        <w:jc w:val="both"/>
-        <w:rPr>
-          <w:rFonts w:ascii="Times New Roman" w:hAnsi="Times New Roman" w:cs="Times New Roman"/>
-          <w:b w:val="0"/>
-          <w:sz w:val="24"/>
-          <w:szCs w:val="24"/>
-          <w:lang w:val="en-US"/>
-        </w:rPr>
-      </w:pPr>
-    </w:p>
-    <w:p>
-      <w:pPr>
-        <w:pStyle w:val="Otsikko"/>
-        <w:jc w:val="left"/>
-        <w:rPr>
-          <w:rFonts w:ascii="Times New Roman" w:hAnsi="Times New Roman"/>
-          <w:b w:val="0"/>
-          <w:sz w:val="24"/>
-          <w:szCs w:val="24"/>
-          <w:lang w:val="en-US"/>
-        </w:rPr>
-      </w:pPr>
-    </w:p>
-    <w:p>
-      <w:pPr>
-        <w:pStyle w:val="Otsikko"/>
-        <w:jc w:val="left"/>
-        <w:rPr>
-          <w:sz w:val="24"/>
-          <w:szCs w:val="24"/>
-          <w:lang w:val="en-US"/>
-        </w:rPr>
-      </w:pPr>
-    </w:p>
-    <w:p>
-      <w:pPr>
-        <w:pStyle w:val="Otsikko"/>
-        <w:jc w:val="left"/>
-        <w:rPr>
-          <w:sz w:val="24"/>
-          <w:szCs w:val="24"/>
-          <w:lang w:val="en-US"/>
-        </w:rPr>
-      </w:pPr>
-    </w:p>
-    <w:p>
-      <w:pPr>
-        <w:pStyle w:val="Otsikko"/>
-        <w:jc w:val="left"/>
-        <w:rPr>
-          <w:sz w:val="24"/>
-          <w:szCs w:val="24"/>
-          <w:lang w:val="en-US"/>
-        </w:rPr>
-      </w:pPr>
-    </w:p>
-    <w:p>
-      <w:pPr>
-        <w:pStyle w:val="Otsikko"/>
-        <w:jc w:val="left"/>
-        <w:rPr>
-          <w:sz w:val="24"/>
-          <w:szCs w:val="24"/>
-          <w:lang w:val="en-US"/>
-        </w:rPr>
-      </w:pPr>
-    </w:p>
-    <w:p>
-      <w:pPr>
-        <w:pStyle w:val="Otsikko"/>
-        <w:jc w:val="both"/>
-        <w:rPr>
-          <w:rFonts w:ascii="Times New Roman" w:hAnsi="Times New Roman" w:cs="Times New Roman"/>
-          <w:b w:val="0"/>
-          <w:sz w:val="24"/>
-          <w:szCs w:val="24"/>
-          <w:lang w:val="en-US"/>
-        </w:rPr>
-      </w:pPr>
-      <w:proofErr w:type="spellStart"/>
+        <w:ind w:firstLine="708"/>
+      </w:pPr>
       <w:r>
-        <w:rPr>
-          <w:rFonts w:ascii="Times New Roman" w:hAnsi="Times New Roman" w:cs="Times New Roman"/>
-          <w:b w:val="0"/>
-          <w:sz w:val="24"/>
-          <w:szCs w:val="24"/>
-          <w:lang w:val="en-US"/>
-        </w:rPr>
-        <w:t>Sofware</w:t>
-      </w:r>
-      <w:proofErr w:type="spellEnd"/>
-      <w:r>
-        <w:rPr>
-          <w:rFonts w:ascii="Times New Roman" w:hAnsi="Times New Roman" w:cs="Times New Roman"/>
-          <w:b w:val="0"/>
-          <w:sz w:val="24"/>
-          <w:szCs w:val="24"/>
-          <w:lang w:val="en-US"/>
-        </w:rPr>
-        <w:t xml:space="preserve"> Development Skills</w:t>
+        <w:t>Instalar Android studio y configurarlo además de crear el git con todas sus carpetas para dejarlo todo apunto para empezar a trabajar lo antes posible.</w:t>
       </w:r>
     </w:p>
     <w:p>
       <w:pPr>
-        <w:pStyle w:val="Otsikko"/>
-        <w:jc w:val="left"/>
-        <w:rPr>
-          <w:rFonts w:ascii="Times New Roman" w:hAnsi="Times New Roman" w:cs="Times New Roman"/>
-          <w:b w:val="0"/>
-          <w:sz w:val="24"/>
-          <w:szCs w:val="24"/>
-          <w:lang w:val="en-US"/>
-        </w:rPr>
+        <w:ind w:firstLine="708"/>
       </w:pPr>
     </w:p>
     <w:p>
       <w:pPr>
-        <w:pStyle w:val="Otsikko"/>
-        <w:jc w:val="left"/>
+        <w:spacing w:after="160" w:line="259" w:lineRule="auto"/>
         <w:rPr>
-          <w:rFonts w:ascii="Times New Roman" w:hAnsi="Times New Roman" w:cs="Times New Roman"/>
-          <w:sz w:val="24"/>
-          <w:szCs w:val="24"/>
-          <w:lang w:val="en-US"/>
+          <w:lang w:bidi="he-IL"/>
         </w:rPr>
       </w:pPr>
       <w:r>
         <w:rPr>
-          <w:rFonts w:ascii="Times New Roman" w:hAnsi="Times New Roman" w:cs="Times New Roman"/>
-          <w:sz w:val="24"/>
-          <w:szCs w:val="24"/>
-          <w:lang w:val="en-US"/>
+          <w:lang w:bidi="he-IL"/>
         </w:rPr>
-        <w:t>&lt;Insert name here&gt;, &lt;Insert s</w:t>
-      </w:r>
-      <w:r>
-        <w:rPr>
-          <w:rFonts w:ascii="Times New Roman" w:hAnsi="Times New Roman" w:cs="Times New Roman"/>
-          <w:sz w:val="24"/>
-          <w:szCs w:val="24"/>
-          <w:lang w:val="en-US"/>
-        </w:rPr>
-        <w:t>tudent number here&gt;</w:t>
+        <w:t>7.9.2026</w:t>
       </w:r>
     </w:p>
     <w:p>
       <w:pPr>
-        <w:pStyle w:val="Otsikko"/>
-        <w:jc w:val="left"/>
+        <w:spacing w:after="160" w:line="259" w:lineRule="auto"/>
+        <w:ind w:firstLine="708"/>
         <w:rPr>
-          <w:rFonts w:ascii="Times New Roman" w:hAnsi="Times New Roman" w:cs="Times New Roman"/>
-          <w:b w:val="0"/>
-          <w:sz w:val="24"/>
-          <w:szCs w:val="24"/>
-          <w:lang w:val="en-US"/>
-        </w:rPr>
-      </w:pPr>
-    </w:p>
-    <w:p>
-      <w:pPr>
-        <w:pStyle w:val="Otsikko"/>
-        <w:jc w:val="left"/>
-        <w:rPr>
-          <w:rFonts w:ascii="Times New Roman" w:hAnsi="Times New Roman" w:cs="Times New Roman"/>
-          <w:b w:val="0"/>
-          <w:sz w:val="24"/>
-          <w:szCs w:val="24"/>
-          <w:lang w:val="en-US"/>
-        </w:rPr>
-      </w:pPr>
-    </w:p>
-    <w:p>
-      <w:pPr>
-        <w:pStyle w:val="Otsikko"/>
-        <w:jc w:val="left"/>
-        <w:rPr>
-          <w:rFonts w:ascii="Times New Roman" w:hAnsi="Times New Roman" w:cs="Times New Roman"/>
-          <w:lang w:val="en-US"/>
+          <w:lang w:bidi="he-IL"/>
         </w:rPr>
       </w:pPr>
       <w:r>
         <w:rPr>
-          <w:rFonts w:ascii="Times New Roman" w:hAnsi="Times New Roman" w:cs="Times New Roman"/>
-          <w:lang w:val="en-US"/>
+          <w:lang w:bidi="he-IL"/>
         </w:rPr>
-        <w:t xml:space="preserve">LEARNING DIARY, </w:t>
-      </w:r>
-      <w:r>
-        <w:rPr>
-          <w:rFonts w:ascii="Times New Roman" w:hAnsi="Times New Roman" w:cs="Times New Roman"/>
-          <w:lang w:val="en-US"/>
-        </w:rPr>
-        <w:t>&lt;CHOSEN MODULE NAME&gt; MODULE</w:t>
+        <w:t>I set up my development environment using Android Studio with Java and an Empty Views Activity template inside my course repository. I designed the user interface (activity_main.xml) using a ConstraintLayout, adding numeric input fields, a button, and a result text view, making sure to configure the layout constraints properly.</w:t>
       </w:r>
     </w:p>
     <w:p>
       <w:pPr>
-        <w:pStyle w:val="Otsikko5"/>
-        <w:numPr>
-          <w:ilvl w:val="0"/>
-          <w:numId w:val="0"/>
-        </w:numPr>
-        <w:jc w:val="left"/>
+        <w:spacing w:after="160" w:line="259" w:lineRule="auto"/>
+        <w:ind w:firstLine="708"/>
         <w:rPr>
-          <w:sz w:val="24"/>
-          <w:szCs w:val="24"/>
-          <w:lang w:val="en-US"/>
+          <w:lang w:bidi="he-IL"/>
         </w:rPr>
       </w:pPr>
+      <w:r>
+        <w:rPr>
+          <w:lang w:bidi="he-IL"/>
+        </w:rPr>
+        <w:t>Instead of using the emulator, I connected my own physical smartphone via USB debugging to test the application directly on real hardware. I implemented the backend logic in MainActivity.java by binding UI components with findViewById(), handling button click listeners, reading user inputs, and performing basic arithmetic validation.</w:t>
+      </w:r>
     </w:p>
     <w:p>
       <w:pPr>
+        <w:ind w:firstLine="708"/>
+      </w:pPr>
+      <w:r>
+        <w:rPr>
+          <w:lang w:bidi="he-IL"/>
+        </w:rPr>
+        <w:t>Finally, I successfully tested the addition app feature on my device, verified that everything worked as expected, and prepared my professional Git commit and push to reflect today's progress.</w:t>
+      </w:r>
+    </w:p>
+    <w:p>
+      <w:pPr>
+        <w:ind w:firstLine="708"/>
+      </w:pPr>
+    </w:p>
+    <w:p>
+      <w:pPr>
+        <w:ind w:firstLine="708"/>
+      </w:pPr>
+    </w:p>
+    <w:p>
+      <w:pPr>
+        <w:spacing w:after="160" w:line="259" w:lineRule="auto"/>
+        <w:rPr>
+          <w:lang w:bidi="he-IL"/>
+        </w:rPr>
+      </w:pPr>
+      <w:r>
+        <w:rPr>
+          <w:lang w:bidi="he-IL"/>
+        </w:rPr>
+        <w:t>9.9.2026</w:t>
+      </w:r>
+    </w:p>
+    <w:p>
+      <w:pPr>
+        <w:spacing w:after="160" w:line="259" w:lineRule="auto"/>
+        <w:ind w:firstLine="708"/>
+        <w:rPr>
+          <w:lang w:bidi="he-IL"/>
+        </w:rPr>
+      </w:pPr>
+      <w:r>
+        <w:rPr>
+          <w:lang w:bidi="he-IL"/>
+        </w:rPr>
+        <w:t>I started working on Part 2 of the course by setting up an independent project called "Activity 2" inside my coursework directory to keep my projects organized. I designed two screens using ConstraintLayout: a main screen with two action buttons and a second screen containing a TextView.</w:t>
+      </w:r>
+    </w:p>
+    <w:p>
+      <w:pPr>
+        <w:spacing w:after="160" w:line="259" w:lineRule="auto"/>
+        <w:ind w:firstLine="708"/>
+        <w:rPr>
+          <w:lang w:bidi="he-IL"/>
+        </w:rPr>
+      </w:pPr>
+      <w:r>
+        <w:rPr>
+          <w:lang w:bidi="he-IL"/>
+        </w:rPr>
+        <w:t>I learned how Android handles navigation and component interaction using both explicit and implicit intents. First, I implemented an explicit intent to navigate from MainActivity to SecondActivity, passing extra data through key-value pairs (putExtra) so that the second screen displays "HELLO WORLD!". Then, I created an implicit intent (ACTION_VIEW) to open an external web browser with a specific URL.</w:t>
+      </w:r>
+    </w:p>
+    <w:p>
+      <w:pPr>
+        <w:spacing w:after="160" w:line="259" w:lineRule="auto"/>
+        <w:ind w:firstLine="708"/>
+        <w:rPr>
+          <w:lang w:bidi="he-IL"/>
+        </w:rPr>
+      </w:pPr>
+      <w:r>
+        <w:rPr>
+          <w:lang w:bidi="he-IL"/>
+        </w:rPr>
+        <w:t>I tested the application directly on my physical Android device using USB debugging. During testing, I noticed the web intent did not open the browser due to package visibility policies on modern Android versions, but I solved it by updating the code execution safely. Finally, I tested both navigation flows successfully and pushed the project to GitHub.</w:t>
+      </w:r>
+    </w:p>
+    <w:p>
+      <w:pPr>
+        <w:spacing w:after="160" w:line="259" w:lineRule="auto"/>
+        <w:ind w:firstLine="708"/>
+        <w:rPr>
+          <w:lang w:bidi="he-IL"/>
+        </w:rPr>
+      </w:pPr>
+    </w:p>
+    <w:p>
+      <w:pPr>
+        <w:ind w:firstLine="708"/>
+      </w:pPr>
+    </w:p>
+    <w:p>
+      <w:pPr>
+        <w:pStyle w:val="Textoindependiente"/>
         <w:rPr>
           <w:lang w:val="en-US"/>
         </w:rPr>
       </w:pPr>
-    </w:p>
-    <w:p>
-      <w:pPr>
-        <w:rPr>
-          <w:lang w:val="en-US"/>
-        </w:rPr>
-      </w:pPr>
-    </w:p>
-    <w:p>
-      <w:pPr>
-        <w:rPr>
-          <w:lang w:val="en-US"/>
-        </w:rPr>
-      </w:pPr>
-    </w:p>
-    <w:p>
-      <w:pPr>
-        <w:rPr>
-          <w:lang w:val="en-US"/>
-        </w:rPr>
-      </w:pPr>
-    </w:p>
-    <w:p>
-      <w:pPr>
-        <w:rPr>
-          <w:lang w:val="en-US"/>
-        </w:rPr>
-      </w:pPr>
-    </w:p>
-    <w:p>
-      <w:pPr>
-        <w:pStyle w:val="Hakemistonotsikko"/>
-        <w:spacing w:line="360" w:lineRule="auto"/>
-        <w:rPr>
-          <w:lang w:val="en-US"/>
-        </w:rPr>
-      </w:pPr>
-    </w:p>
-    <w:p>
-      <w:pPr>
-        <w:pStyle w:val="Hakemistonotsikko"/>
-        <w:spacing w:line="360" w:lineRule="auto"/>
-        <w:rPr>
-          <w:lang w:val="en-US"/>
-        </w:rPr>
-      </w:pPr>
-    </w:p>
-    <w:p>
-      <w:pPr>
-        <w:pStyle w:val="Hakemistonotsikko"/>
-        <w:rPr>
-          <w:lang w:val="en-US"/>
-        </w:rPr>
-      </w:pPr>
-    </w:p>
-    <w:p>
-      <w:pPr>
-        <w:pStyle w:val="Leipteksti"/>
-        <w:rPr>
-          <w:b/>
-          <w:bCs/>
-          <w:sz w:val="28"/>
-          <w:szCs w:val="28"/>
-          <w:lang w:val="en-US"/>
-        </w:rPr>
-      </w:pPr>
-      <w:r>
-        <w:rPr>
-          <w:b/>
-          <w:bCs/>
-          <w:sz w:val="28"/>
-          <w:szCs w:val="28"/>
-          <w:lang w:val="en-US"/>
-        </w:rPr>
-        <w:br w:type="page"/>
-      </w:r>
-      <w:r>
-        <w:rPr>
-          <w:b/>
-          <w:bCs/>
-          <w:sz w:val="28"/>
-          <w:szCs w:val="28"/>
-          <w:lang w:val="en-US"/>
-        </w:rPr>
-        <w:lastRenderedPageBreak/>
-        <w:t>LEARNING DIARY</w:t>
-      </w:r>
-    </w:p>
-    <w:p>
-      <w:pPr>
-        <w:pStyle w:val="Leipteksti"/>
-        <w:rPr>
-          <w:b/>
-          <w:bCs/>
-          <w:lang w:val="en-US"/>
-        </w:rPr>
-      </w:pPr>
-    </w:p>
-    <w:p>
-      <w:pPr>
-        <w:pStyle w:val="Leipteksti"/>
-        <w:rPr>
-          <w:b/>
-          <w:bCs/>
-          <w:lang w:val="en-US"/>
-        </w:rPr>
-      </w:pPr>
-      <w:r>
-        <w:rPr>
-          <w:b/>
-          <w:bCs/>
-          <w:lang w:val="en-US"/>
-        </w:rPr>
-        <w:t>EXAMPLE STYLE 1</w:t>
-      </w:r>
-    </w:p>
-    <w:p>
-      <w:pPr>
-        <w:pStyle w:val="Leipteksti"/>
-        <w:rPr>
-          <w:lang w:val="en-US"/>
-        </w:rPr>
-      </w:pPr>
-      <w:r>
-        <w:rPr>
-          <w:lang w:val="en-US"/>
-        </w:rPr>
-        <w:t>10.9.2018</w:t>
-      </w:r>
-      <w:r>
-        <w:rPr>
-          <w:lang w:val="en-US"/>
-        </w:rPr>
-        <w:br/>
-      </w:r>
-      <w:r>
-        <w:rPr>
-          <w:lang w:val="en-US"/>
-        </w:rPr>
-        <w:br/>
-        <w:t xml:space="preserve">I </w:t>
-      </w:r>
-      <w:r>
-        <w:rPr>
-          <w:lang w:val="en-US"/>
-        </w:rPr>
-        <w:t xml:space="preserve">checked </w:t>
-      </w:r>
-      <w:r>
-        <w:rPr>
-          <w:lang w:val="en-US"/>
-        </w:rPr>
-        <w:t xml:space="preserve">the general information and understood the </w:t>
-      </w:r>
-      <w:proofErr w:type="gramStart"/>
-      <w:r>
-        <w:rPr>
-          <w:lang w:val="en-US"/>
-        </w:rPr>
-        <w:t>main focus</w:t>
-      </w:r>
-      <w:proofErr w:type="gramEnd"/>
-      <w:r>
-        <w:rPr>
-          <w:lang w:val="en-US"/>
-        </w:rPr>
-        <w:t xml:space="preserve"> of t</w:t>
-      </w:r>
-      <w:r>
-        <w:rPr>
-          <w:lang w:val="en-US"/>
-        </w:rPr>
-        <w:t xml:space="preserve">he course, which is to find my passion as a software developer and create a unique project to represent my skills. I chose frontend module because it was the most interesting project offered. I’ve also tried to set up my environment, but I could not decide which code editor I would like to use.  I learned to set up a git repository and did my first commit, everything went smoothly after I clicked the banner to watch intro to GIT. </w:t>
-      </w:r>
-      <w:r>
-        <w:rPr>
-          <w:lang w:val="en-US"/>
-        </w:rPr>
-        <w:t xml:space="preserve"> </w:t>
-      </w:r>
-    </w:p>
-    <w:p>
-      <w:pPr>
-        <w:pStyle w:val="Leipteksti"/>
-        <w:rPr>
-          <w:lang w:val="en-US"/>
-        </w:rPr>
-      </w:pPr>
-    </w:p>
-    <w:p>
-      <w:pPr>
-        <w:pStyle w:val="Leipteksti"/>
-        <w:rPr>
-          <w:lang w:val="en-US"/>
-        </w:rPr>
-      </w:pPr>
-      <w:r>
-        <w:rPr>
-          <w:lang w:val="en-US"/>
-        </w:rPr>
-        <w:t>11.9.201</w:t>
-      </w:r>
-      <w:r>
-        <w:rPr>
-          <w:lang w:val="en-US"/>
-        </w:rPr>
-        <w:t>8</w:t>
-      </w:r>
-    </w:p>
-    <w:p>
-      <w:pPr>
-        <w:pStyle w:val="Leipteksti"/>
-        <w:rPr>
-          <w:lang w:val="en-US"/>
-        </w:rPr>
-      </w:pPr>
-      <w:r>
-        <w:rPr>
-          <w:lang w:val="en-US"/>
-        </w:rPr>
-        <w:br/>
-        <w:t xml:space="preserve">I have chosen VS Code as my code editor for this course, I learned how to set up addons by googling how to do it. I searched the web for best addons and chose the best addons that I think fits me best.  </w:t>
-      </w:r>
-      <w:r>
-        <w:rPr>
-          <w:lang w:val="en-US"/>
-        </w:rPr>
-        <w:t>I started to watch the first part of the example project to understand the technologies better.</w:t>
-      </w:r>
-    </w:p>
-    <w:p>
-      <w:pPr>
-        <w:pStyle w:val="Leipteksti"/>
-        <w:rPr>
-          <w:lang w:val="en-US"/>
-        </w:rPr>
-      </w:pPr>
-    </w:p>
-    <w:p>
-      <w:pPr>
-        <w:pStyle w:val="Leipteksti"/>
-        <w:rPr>
-          <w:lang w:val="en-US"/>
-        </w:rPr>
-      </w:pPr>
-      <w:r>
-        <w:rPr>
-          <w:lang w:val="en-US"/>
-        </w:rPr>
-        <w:t xml:space="preserve">I did my </w:t>
-      </w:r>
-      <w:r>
-        <w:rPr>
-          <w:lang w:val="en-US"/>
-        </w:rPr>
-        <w:t xml:space="preserve">second </w:t>
-      </w:r>
-      <w:r>
-        <w:rPr>
-          <w:lang w:val="en-US"/>
-        </w:rPr>
-        <w:t>commit but somehow it did not go as</w:t>
-      </w:r>
-      <w:r>
-        <w:rPr>
-          <w:lang w:val="en-US"/>
-        </w:rPr>
-        <w:t xml:space="preserve"> I planned. I went to </w:t>
-      </w:r>
-      <w:proofErr w:type="spellStart"/>
-      <w:r>
-        <w:rPr>
-          <w:lang w:val="en-US"/>
-        </w:rPr>
-        <w:t>stackoverflow</w:t>
-      </w:r>
-      <w:proofErr w:type="spellEnd"/>
-      <w:r>
-        <w:rPr>
-          <w:lang w:val="en-US"/>
-        </w:rPr>
-        <w:t xml:space="preserve"> and found quite many threads about version control problems. I was able to figure out what was the problem and continued to watch the first part till the end.</w:t>
-      </w:r>
-    </w:p>
-    <w:p>
-      <w:pPr>
-        <w:pStyle w:val="Leipteksti"/>
-        <w:rPr>
-          <w:b/>
-          <w:lang w:val="en-US"/>
-        </w:rPr>
-      </w:pPr>
-      <w:r>
-        <w:rPr>
-          <w:lang w:val="en-US"/>
-        </w:rPr>
-        <w:br w:type="page"/>
-      </w:r>
-      <w:r>
-        <w:rPr>
-          <w:b/>
-          <w:lang w:val="en-US"/>
-        </w:rPr>
-        <w:lastRenderedPageBreak/>
-        <w:t>EXAMPLE STYLE 2</w:t>
-      </w:r>
-    </w:p>
-    <w:p>
-      <w:pPr>
-        <w:pStyle w:val="Leipteksti"/>
-        <w:rPr>
-          <w:b/>
-          <w:lang w:val="en-US"/>
-        </w:rPr>
-      </w:pPr>
-    </w:p>
-    <w:p>
-      <w:pPr>
-        <w:pStyle w:val="Leipteksti"/>
-        <w:rPr>
-          <w:lang w:val="en-US"/>
-        </w:rPr>
-      </w:pPr>
-      <w:r>
-        <w:rPr>
-          <w:lang w:val="en-US"/>
-        </w:rPr>
-        <w:t>10.9.2018</w:t>
-      </w:r>
-    </w:p>
-    <w:p>
-      <w:pPr>
-        <w:pStyle w:val="Leipteksti"/>
-        <w:rPr>
-          <w:lang w:val="en-US"/>
-        </w:rPr>
-      </w:pPr>
-    </w:p>
-    <w:p>
-      <w:pPr>
-        <w:pStyle w:val="Leipteksti"/>
-        <w:rPr>
-          <w:lang w:val="en-US"/>
-        </w:rPr>
-      </w:pPr>
-      <w:r>
-        <w:rPr>
-          <w:lang w:val="en-US"/>
-        </w:rPr>
-        <w:t>I learned about,</w:t>
-      </w:r>
-    </w:p>
-    <w:p>
-      <w:pPr>
-        <w:pStyle w:val="Leipteksti"/>
-        <w:rPr>
-          <w:lang w:val="en-US"/>
-        </w:rPr>
-      </w:pPr>
-    </w:p>
-    <w:p>
-      <w:pPr>
-        <w:pStyle w:val="Leipteksti"/>
-        <w:rPr>
-          <w:lang w:val="en-US"/>
-        </w:rPr>
-      </w:pPr>
-      <w:r>
-        <w:rPr>
-          <w:lang w:val="en-US"/>
-        </w:rPr>
-        <w:t>version control, but mostly it was just refreshing my memory. What I learned was…</w:t>
-      </w:r>
-    </w:p>
-    <w:p>
-      <w:pPr>
-        <w:pStyle w:val="Leipteksti"/>
-        <w:rPr>
-          <w:lang w:val="en-US"/>
-        </w:rPr>
-      </w:pPr>
-    </w:p>
-    <w:p>
-      <w:pPr>
-        <w:pStyle w:val="Leipteksti"/>
-        <w:rPr>
-          <w:lang w:val="en-US"/>
-        </w:rPr>
-      </w:pPr>
-      <w:r>
-        <w:rPr>
-          <w:lang w:val="en-US"/>
-        </w:rPr>
-        <w:t>how to develop as a becoming software professional. I find &lt;something&gt; interesting, because…</w:t>
-      </w:r>
-    </w:p>
-    <w:p>
-      <w:pPr>
-        <w:pStyle w:val="Leipteksti"/>
-        <w:rPr>
-          <w:lang w:val="en-US"/>
-        </w:rPr>
-      </w:pPr>
-    </w:p>
-    <w:p>
-      <w:pPr>
-        <w:pStyle w:val="Leipteksti"/>
-        <w:rPr>
-          <w:lang w:val="en-US"/>
-        </w:rPr>
-      </w:pPr>
-      <w:r>
-        <w:rPr>
-          <w:lang w:val="en-US"/>
-        </w:rPr>
-        <w:t>how to set up Atom environment with addons. There was one problem that took me a lot of time to solve. The problem was about …</w:t>
-      </w:r>
-    </w:p>
-    <w:p>
-      <w:pPr>
-        <w:pStyle w:val="Leipteksti"/>
-        <w:rPr>
-          <w:lang w:val="en-US"/>
-        </w:rPr>
-      </w:pPr>
-    </w:p>
-    <w:p>
-      <w:pPr>
-        <w:pStyle w:val="Leipteksti"/>
-        <w:rPr>
-          <w:lang w:val="en-US"/>
-        </w:rPr>
-      </w:pPr>
-      <w:r>
-        <w:rPr>
-          <w:lang w:val="en-US"/>
-        </w:rPr>
-        <w:t>Etc.</w:t>
-      </w:r>
-    </w:p>
-    <w:p>
-      <w:pPr>
-        <w:pStyle w:val="Leipteksti"/>
-        <w:rPr>
-          <w:lang w:val="en-US"/>
-        </w:rPr>
-      </w:pPr>
-    </w:p>
-    <w:p>
-      <w:pPr>
-        <w:pStyle w:val="Leipteksti"/>
-        <w:rPr>
-          <w:b/>
-          <w:lang w:val="en-US"/>
-        </w:rPr>
-      </w:pPr>
-      <w:r>
-        <w:rPr>
-          <w:b/>
-          <w:lang w:val="en-US"/>
-        </w:rPr>
-        <w:t>EXAMPLE STYLE 3</w:t>
-      </w:r>
-    </w:p>
-    <w:p>
-      <w:pPr>
-        <w:pStyle w:val="Leipteksti"/>
-        <w:rPr>
-          <w:b/>
-          <w:lang w:val="en-US"/>
-        </w:rPr>
-      </w:pPr>
-    </w:p>
-    <w:p>
-      <w:pPr>
-        <w:pStyle w:val="Leipteksti"/>
-        <w:rPr>
-          <w:lang w:val="en-US"/>
-        </w:rPr>
-      </w:pPr>
-      <w:r>
-        <w:rPr>
-          <w:lang w:val="en-US"/>
-        </w:rPr>
-        <w:t>Freeform.</w:t>
-      </w:r>
-      <w:bookmarkStart w:id="0" w:name="_GoBack"/>
-      <w:bookmarkEnd w:id="0"/>
-    </w:p>
-    <w:p>
-      <w:pPr>
-        <w:pStyle w:val="Leipteksti"/>
-        <w:rPr>
-          <w:lang w:val="en-US"/>
-        </w:rPr>
-      </w:pPr>
-    </w:p>
-    <w:p>
-      <w:pPr>
-        <w:pStyle w:val="Leipteksti"/>
-        <w:rPr>
-          <w:lang w:val="en-US"/>
-        </w:rPr>
-      </w:pPr>
-      <w:r>
-        <w:rPr>
-          <w:lang w:val="en-US"/>
-        </w:rPr>
-        <w:t xml:space="preserve">Something else, but reasonable. </w:t>
-      </w:r>
-      <w:r>
-        <w:rPr>
-          <w:lang w:val="en-US"/>
-        </w:rPr>
-        <w:t>You must document what you have done, learned and when this have happened.</w:t>
-      </w:r>
     </w:p>
     <w:sectPr>
       <w:headerReference w:type="default" r:id="rId10"/>
@@ -843,7 +179,7 @@
 </file>
 
 <file path=word/endnotes.xml><?xml version="1.0" encoding="utf-8"?>
-<w:endnotes xmlns:wpc="http://schemas.microsoft.com/office/word/2010/wordprocessingCanvas" xmlns:cx="http://schemas.microsoft.com/office/drawing/2014/chartex" xmlns:cx1="http://schemas.microsoft.com/office/drawing/2015/9/8/chartex" xmlns:cx2="http://schemas.microsoft.com/office/drawing/2015/10/21/chartex" xmlns:cx3="http://schemas.microsoft.com/office/drawing/2016/5/9/chartex" xmlns:cx4="http://schemas.microsoft.com/office/drawing/2016/5/10/chartex" xmlns:cx5="http://schemas.microsoft.com/office/drawing/2016/5/11/chartex" xmlns:cx6="http://schemas.microsoft.com/office/drawing/2016/5/12/chartex" xmlns:cx7="http://schemas.microsoft.com/office/drawing/2016/5/13/chartex" xmlns:cx8="http://schemas.microsoft.com/office/drawing/2016/5/14/chartex" xmlns:mc="http://schemas.openxmlformats.org/markup-compatibility/2006" xmlns:aink="http://schemas.microsoft.com/office/drawing/2016/ink" xmlns:am3d="http://schemas.microsoft.com/office/drawing/2017/model3d" xmlns:o="urn:schemas-microsoft-com:office:office" xmlns:r="http://schemas.openxmlformats.org/officeDocument/2006/relationships" xmlns:m="http://schemas.openxmlformats.org/officeDocument/2006/math" xmlns:v="urn:schemas-microsoft-com:vml" xmlns:wp14="http://schemas.microsoft.com/office/word/2010/wordprocessingDrawing" xmlns:wp="http://schemas.openxmlformats.org/drawingml/2006/wordprocessingDrawing" xmlns:w10="urn:schemas-microsoft-com:office:word" xmlns:w="http://schemas.openxmlformats.org/wordprocessingml/2006/main" xmlns:w14="http://schemas.microsoft.com/office/word/2010/wordml" xmlns:w15="http://schemas.microsoft.com/office/word/2012/wordml" xmlns:w16cid="http://schemas.microsoft.com/office/word/2016/wordml/cid" xmlns:w16se="http://schemas.microsoft.com/office/word/2015/wordml/symex" xmlns:wpg="http://schemas.microsoft.com/office/word/2010/wordprocessingGroup" xmlns:wpi="http://schemas.microsoft.com/office/word/2010/wordprocessingInk" xmlns:wne="http://schemas.microsoft.com/office/word/2006/wordml" xmlns:wps="http://schemas.microsoft.com/office/word/2010/wordprocessingShape" mc:Ignorable="w14 w15 w16se w16cid wp14">
+<w:endnotes xmlns:wpc="http://schemas.microsoft.com/office/word/2010/wordprocessingCanvas" xmlns:cx="http://schemas.microsoft.com/office/drawing/2014/chartex" xmlns:cx1="http://schemas.microsoft.com/office/drawing/2015/9/8/chartex" xmlns:cx2="http://schemas.microsoft.com/office/drawing/2015/10/21/chartex" xmlns:cx3="http://schemas.microsoft.com/office/drawing/2016/5/9/chartex" xmlns:cx4="http://schemas.microsoft.com/office/drawing/2016/5/10/chartex" xmlns:cx5="http://schemas.microsoft.com/office/drawing/2016/5/11/chartex" xmlns:cx6="http://schemas.microsoft.com/office/drawing/2016/5/12/chartex" xmlns:cx7="http://schemas.microsoft.com/office/drawing/2016/5/13/chartex" xmlns:cx8="http://schemas.microsoft.com/office/drawing/2016/5/14/chartex" xmlns:mc="http://schemas.openxmlformats.org/markup-compatibility/2006" xmlns:aink="http://schemas.microsoft.com/office/drawing/2016/ink" xmlns:am3d="http://schemas.microsoft.com/office/drawing/2017/model3d" xmlns:o="urn:schemas-microsoft-com:office:office" xmlns:oel="http://schemas.microsoft.com/office/2019/extlst" xmlns:r="http://schemas.openxmlformats.org/officeDocument/2006/relationships" xmlns:m="http://schemas.openxmlformats.org/officeDocument/2006/math" xmlns:v="urn:schemas-microsoft-com:vml" xmlns:wp14="http://schemas.microsoft.com/office/word/2010/wordprocessingDrawing" xmlns:wp="http://schemas.openxmlformats.org/drawingml/2006/wordprocessingDrawing" xmlns:w10="urn:schemas-microsoft-com:office:word" xmlns:w="http://schemas.openxmlformats.org/wordprocessingml/2006/main" xmlns:w14="http://schemas.microsoft.com/office/word/2010/wordml" xmlns:w15="http://schemas.microsoft.com/office/word/2012/wordml" xmlns:w16cex="http://schemas.microsoft.com/office/word/2018/wordml/cex" xmlns:w16cid="http://schemas.microsoft.com/office/word/2016/wordml/cid" xmlns:w16="http://schemas.microsoft.com/office/word/2018/wordml" xmlns:w16du="http://schemas.microsoft.com/office/word/2023/wordml/word16du" xmlns:w16sdtdh="http://schemas.microsoft.com/office/word/2020/wordml/sdtdatahash" xmlns:w16sdtfl="http://schemas.microsoft.com/office/word/2024/wordml/sdtformatlock" xmlns:w16se="http://schemas.microsoft.com/office/word/2015/wordml/symex" xmlns:wpg="http://schemas.microsoft.com/office/word/2010/wordprocessingGroup" xmlns:wpi="http://schemas.microsoft.com/office/word/2010/wordprocessingInk" xmlns:wne="http://schemas.microsoft.com/office/word/2006/wordml" xmlns:wps="http://schemas.microsoft.com/office/word/2010/wordprocessingShape" mc:Ignorable="w14 w15 w16se w16cid w16 w16cex w16sdtdh w16sdtfl w16du wp14">
   <w:endnote w:type="separator" w:id="-1">
     <w:p>
       <w:r>
@@ -862,10 +198,10 @@
 </file>
 
 <file path=word/footer1.xml><?xml version="1.0" encoding="utf-8"?>
-<w:ftr xmlns:wpc="http://schemas.microsoft.com/office/word/2010/wordprocessingCanvas" xmlns:cx="http://schemas.microsoft.com/office/drawing/2014/chartex" xmlns:cx1="http://schemas.microsoft.com/office/drawing/2015/9/8/chartex" xmlns:cx2="http://schemas.microsoft.com/office/drawing/2015/10/21/chartex" xmlns:cx3="http://schemas.microsoft.com/office/drawing/2016/5/9/chartex" xmlns:cx4="http://schemas.microsoft.com/office/drawing/2016/5/10/chartex" xmlns:cx5="http://schemas.microsoft.com/office/drawing/2016/5/11/chartex" xmlns:cx6="http://schemas.microsoft.com/office/drawing/2016/5/12/chartex" xmlns:cx7="http://schemas.microsoft.com/office/drawing/2016/5/13/chartex" xmlns:cx8="http://schemas.microsoft.com/office/drawing/2016/5/14/chartex" xmlns:mc="http://schemas.openxmlformats.org/markup-compatibility/2006" xmlns:aink="http://schemas.microsoft.com/office/drawing/2016/ink" xmlns:am3d="http://schemas.microsoft.com/office/drawing/2017/model3d" xmlns:o="urn:schemas-microsoft-com:office:office" xmlns:r="http://schemas.openxmlformats.org/officeDocument/2006/relationships" xmlns:m="http://schemas.openxmlformats.org/officeDocument/2006/math" xmlns:v="urn:schemas-microsoft-com:vml" xmlns:wp14="http://schemas.microsoft.com/office/word/2010/wordprocessingDrawing" xmlns:wp="http://schemas.openxmlformats.org/drawingml/2006/wordprocessingDrawing" xmlns:w10="urn:schemas-microsoft-com:office:word" xmlns:w="http://schemas.openxmlformats.org/wordprocessingml/2006/main" xmlns:w14="http://schemas.microsoft.com/office/word/2010/wordml" xmlns:w15="http://schemas.microsoft.com/office/word/2012/wordml" xmlns:w16cid="http://schemas.microsoft.com/office/word/2016/wordml/cid" xmlns:w16se="http://schemas.microsoft.com/office/word/2015/wordml/symex" xmlns:wpg="http://schemas.microsoft.com/office/word/2010/wordprocessingGroup" xmlns:wpi="http://schemas.microsoft.com/office/word/2010/wordprocessingInk" xmlns:wne="http://schemas.microsoft.com/office/word/2006/wordml" xmlns:wps="http://schemas.microsoft.com/office/word/2010/wordprocessingShape" mc:Ignorable="w14 w15 w16se w16cid wp14">
+<w:ftr xmlns:wpc="http://schemas.microsoft.com/office/word/2010/wordprocessingCanvas" xmlns:cx="http://schemas.microsoft.com/office/drawing/2014/chartex" xmlns:cx1="http://schemas.microsoft.com/office/drawing/2015/9/8/chartex" xmlns:cx2="http://schemas.microsoft.com/office/drawing/2015/10/21/chartex" xmlns:cx3="http://schemas.microsoft.com/office/drawing/2016/5/9/chartex" xmlns:cx4="http://schemas.microsoft.com/office/drawing/2016/5/10/chartex" xmlns:cx5="http://schemas.microsoft.com/office/drawing/2016/5/11/chartex" xmlns:cx6="http://schemas.microsoft.com/office/drawing/2016/5/12/chartex" xmlns:cx7="http://schemas.microsoft.com/office/drawing/2016/5/13/chartex" xmlns:cx8="http://schemas.microsoft.com/office/drawing/2016/5/14/chartex" xmlns:mc="http://schemas.openxmlformats.org/markup-compatibility/2006" xmlns:aink="http://schemas.microsoft.com/office/drawing/2016/ink" xmlns:am3d="http://schemas.microsoft.com/office/drawing/2017/model3d" xmlns:o="urn:schemas-microsoft-com:office:office" xmlns:oel="http://schemas.microsoft.com/office/2019/extlst" xmlns:r="http://schemas.openxmlformats.org/officeDocument/2006/relationships" xmlns:m="http://schemas.openxmlformats.org/officeDocument/2006/math" xmlns:v="urn:schemas-microsoft-com:vml" xmlns:wp14="http://schemas.microsoft.com/office/word/2010/wordprocessingDrawing" xmlns:wp="http://schemas.openxmlformats.org/drawingml/2006/wordprocessingDrawing" xmlns:w10="urn:schemas-microsoft-com:office:word" xmlns:w="http://schemas.openxmlformats.org/wordprocessingml/2006/main" xmlns:w14="http://schemas.microsoft.com/office/word/2010/wordml" xmlns:w15="http://schemas.microsoft.com/office/word/2012/wordml" xmlns:w16cex="http://schemas.microsoft.com/office/word/2018/wordml/cex" xmlns:w16cid="http://schemas.microsoft.com/office/word/2016/wordml/cid" xmlns:w16="http://schemas.microsoft.com/office/word/2018/wordml" xmlns:w16du="http://schemas.microsoft.com/office/word/2023/wordml/word16du" xmlns:w16sdtdh="http://schemas.microsoft.com/office/word/2020/wordml/sdtdatahash" xmlns:w16sdtfl="http://schemas.microsoft.com/office/word/2024/wordml/sdtformatlock" xmlns:w16se="http://schemas.microsoft.com/office/word/2015/wordml/symex" xmlns:wpg="http://schemas.microsoft.com/office/word/2010/wordprocessingGroup" xmlns:wpi="http://schemas.microsoft.com/office/word/2010/wordprocessingInk" xmlns:wne="http://schemas.microsoft.com/office/word/2006/wordml" xmlns:wps="http://schemas.microsoft.com/office/word/2010/wordprocessingShape" mc:Ignorable="w14 w15 w16se w16cid w16 w16cex w16sdtdh w16sdtfl w16du wp14">
   <w:p>
     <w:pPr>
-      <w:pStyle w:val="Alatunniste"/>
+      <w:pStyle w:val="Piedepgina"/>
       <w:jc w:val="center"/>
       <w:rPr>
         <w:sz w:val="20"/>
@@ -875,19 +211,19 @@
   </w:p>
   <w:p>
     <w:pPr>
-      <w:pStyle w:val="Alatunniste"/>
+      <w:pStyle w:val="Piedepgina"/>
     </w:pPr>
   </w:p>
   <w:p>
     <w:pPr>
-      <w:pStyle w:val="Alatunniste"/>
+      <w:pStyle w:val="Piedepgina"/>
     </w:pPr>
   </w:p>
 </w:ftr>
 </file>
 
 <file path=word/footnotes.xml><?xml version="1.0" encoding="utf-8"?>
-<w:footnotes xmlns:wpc="http://schemas.microsoft.com/office/word/2010/wordprocessingCanvas" xmlns:cx="http://schemas.microsoft.com/office/drawing/2014/chartex" xmlns:cx1="http://schemas.microsoft.com/office/drawing/2015/9/8/chartex" xmlns:cx2="http://schemas.microsoft.com/office/drawing/2015/10/21/chartex" xmlns:cx3="http://schemas.microsoft.com/office/drawing/2016/5/9/chartex" xmlns:cx4="http://schemas.microsoft.com/office/drawing/2016/5/10/chartex" xmlns:cx5="http://schemas.microsoft.com/office/drawing/2016/5/11/chartex" xmlns:cx6="http://schemas.microsoft.com/office/drawing/2016/5/12/chartex" xmlns:cx7="http://schemas.microsoft.com/office/drawing/2016/5/13/chartex" xmlns:cx8="http://schemas.microsoft.com/office/drawing/2016/5/14/chartex" xmlns:mc="http://schemas.openxmlformats.org/markup-compatibility/2006" xmlns:aink="http://schemas.microsoft.com/office/drawing/2016/ink" xmlns:am3d="http://schemas.microsoft.com/office/drawing/2017/model3d" xmlns:o="urn:schemas-microsoft-com:office:office" xmlns:r="http://schemas.openxmlformats.org/officeDocument/2006/relationships" xmlns:m="http://schemas.openxmlformats.org/officeDocument/2006/math" xmlns:v="urn:schemas-microsoft-com:vml" xmlns:wp14="http://schemas.microsoft.com/office/word/2010/wordprocessingDrawing" xmlns:wp="http://schemas.openxmlformats.org/drawingml/2006/wordprocessingDrawing" xmlns:w10="urn:schemas-microsoft-com:office:word" xmlns:w="http://schemas.openxmlformats.org/wordprocessingml/2006/main" xmlns:w14="http://schemas.microsoft.com/office/word/2010/wordml" xmlns:w15="http://schemas.microsoft.com/office/word/2012/wordml" xmlns:w16cid="http://schemas.microsoft.com/office/word/2016/wordml/cid" xmlns:w16se="http://schemas.microsoft.com/office/word/2015/wordml/symex" xmlns:wpg="http://schemas.microsoft.com/office/word/2010/wordprocessingGroup" xmlns:wpi="http://schemas.microsoft.com/office/word/2010/wordprocessingInk" xmlns:wne="http://schemas.microsoft.com/office/word/2006/wordml" xmlns:wps="http://schemas.microsoft.com/office/word/2010/wordprocessingShape" mc:Ignorable="w14 w15 w16se w16cid wp14">
+<w:footnotes xmlns:wpc="http://schemas.microsoft.com/office/word/2010/wordprocessingCanvas" xmlns:cx="http://schemas.microsoft.com/office/drawing/2014/chartex" xmlns:cx1="http://schemas.microsoft.com/office/drawing/2015/9/8/chartex" xmlns:cx2="http://schemas.microsoft.com/office/drawing/2015/10/21/chartex" xmlns:cx3="http://schemas.microsoft.com/office/drawing/2016/5/9/chartex" xmlns:cx4="http://schemas.microsoft.com/office/drawing/2016/5/10/chartex" xmlns:cx5="http://schemas.microsoft.com/office/drawing/2016/5/11/chartex" xmlns:cx6="http://schemas.microsoft.com/office/drawing/2016/5/12/chartex" xmlns:cx7="http://schemas.microsoft.com/office/drawing/2016/5/13/chartex" xmlns:cx8="http://schemas.microsoft.com/office/drawing/2016/5/14/chartex" xmlns:mc="http://schemas.openxmlformats.org/markup-compatibility/2006" xmlns:aink="http://schemas.microsoft.com/office/drawing/2016/ink" xmlns:am3d="http://schemas.microsoft.com/office/drawing/2017/model3d" xmlns:o="urn:schemas-microsoft-com:office:office" xmlns:oel="http://schemas.microsoft.com/office/2019/extlst" xmlns:r="http://schemas.openxmlformats.org/officeDocument/2006/relationships" xmlns:m="http://schemas.openxmlformats.org/officeDocument/2006/math" xmlns:v="urn:schemas-microsoft-com:vml" xmlns:wp14="http://schemas.microsoft.com/office/word/2010/wordprocessingDrawing" xmlns:wp="http://schemas.openxmlformats.org/drawingml/2006/wordprocessingDrawing" xmlns:w10="urn:schemas-microsoft-com:office:word" xmlns:w="http://schemas.openxmlformats.org/wordprocessingml/2006/main" xmlns:w14="http://schemas.microsoft.com/office/word/2010/wordml" xmlns:w15="http://schemas.microsoft.com/office/word/2012/wordml" xmlns:w16cex="http://schemas.microsoft.com/office/word/2018/wordml/cex" xmlns:w16cid="http://schemas.microsoft.com/office/word/2016/wordml/cid" xmlns:w16="http://schemas.microsoft.com/office/word/2018/wordml" xmlns:w16du="http://schemas.microsoft.com/office/word/2023/wordml/word16du" xmlns:w16sdtdh="http://schemas.microsoft.com/office/word/2020/wordml/sdtdatahash" xmlns:w16sdtfl="http://schemas.microsoft.com/office/word/2024/wordml/sdtformatlock" xmlns:w16se="http://schemas.microsoft.com/office/word/2015/wordml/symex" xmlns:wpg="http://schemas.microsoft.com/office/word/2010/wordprocessingGroup" xmlns:wpi="http://schemas.microsoft.com/office/word/2010/wordprocessingInk" xmlns:wne="http://schemas.microsoft.com/office/word/2006/wordml" xmlns:wps="http://schemas.microsoft.com/office/word/2010/wordprocessingShape" mc:Ignorable="w14 w15 w16se w16cid w16 w16cex w16sdtdh w16sdtfl w16du wp14">
   <w:footnote w:type="separator" w:id="-1">
     <w:p>
       <w:r>
@@ -906,10 +242,10 @@
 </file>
 
 <file path=word/header1.xml><?xml version="1.0" encoding="utf-8"?>
-<w:hdr xmlns:wpc="http://schemas.microsoft.com/office/word/2010/wordprocessingCanvas" xmlns:cx="http://schemas.microsoft.com/office/drawing/2014/chartex" xmlns:cx1="http://schemas.microsoft.com/office/drawing/2015/9/8/chartex" xmlns:cx2="http://schemas.microsoft.com/office/drawing/2015/10/21/chartex" xmlns:cx3="http://schemas.microsoft.com/office/drawing/2016/5/9/chartex" xmlns:cx4="http://schemas.microsoft.com/office/drawing/2016/5/10/chartex" xmlns:cx5="http://schemas.microsoft.com/office/drawing/2016/5/11/chartex" xmlns:cx6="http://schemas.microsoft.com/office/drawing/2016/5/12/chartex" xmlns:cx7="http://schemas.microsoft.com/office/drawing/2016/5/13/chartex" xmlns:cx8="http://schemas.microsoft.com/office/drawing/2016/5/14/chartex" xmlns:mc="http://schemas.openxmlformats.org/markup-compatibility/2006" xmlns:aink="http://schemas.microsoft.com/office/drawing/2016/ink" xmlns:am3d="http://schemas.microsoft.com/office/drawing/2017/model3d" xmlns:o="urn:schemas-microsoft-com:office:office" xmlns:r="http://schemas.openxmlformats.org/officeDocument/2006/relationships" xmlns:m="http://schemas.openxmlformats.org/officeDocument/2006/math" xmlns:v="urn:schemas-microsoft-com:vml" xmlns:wp14="http://schemas.microsoft.com/office/word/2010/wordprocessingDrawing" xmlns:wp="http://schemas.openxmlformats.org/drawingml/2006/wordprocessingDrawing" xmlns:w10="urn:schemas-microsoft-com:office:word" xmlns:w="http://schemas.openxmlformats.org/wordprocessingml/2006/main" xmlns:w14="http://schemas.microsoft.com/office/word/2010/wordml" xmlns:w15="http://schemas.microsoft.com/office/word/2012/wordml" xmlns:w16cid="http://schemas.microsoft.com/office/word/2016/wordml/cid" xmlns:w16se="http://schemas.microsoft.com/office/word/2015/wordml/symex" xmlns:wpg="http://schemas.microsoft.com/office/word/2010/wordprocessingGroup" xmlns:wpi="http://schemas.microsoft.com/office/word/2010/wordprocessingInk" xmlns:wne="http://schemas.microsoft.com/office/word/2006/wordml" xmlns:wps="http://schemas.microsoft.com/office/word/2010/wordprocessingShape" mc:Ignorable="w14 w15 w16se w16cid wp14">
+<w:hdr xmlns:wpc="http://schemas.microsoft.com/office/word/2010/wordprocessingCanvas" xmlns:cx="http://schemas.microsoft.com/office/drawing/2014/chartex" xmlns:cx1="http://schemas.microsoft.com/office/drawing/2015/9/8/chartex" xmlns:cx2="http://schemas.microsoft.com/office/drawing/2015/10/21/chartex" xmlns:cx3="http://schemas.microsoft.com/office/drawing/2016/5/9/chartex" xmlns:cx4="http://schemas.microsoft.com/office/drawing/2016/5/10/chartex" xmlns:cx5="http://schemas.microsoft.com/office/drawing/2016/5/11/chartex" xmlns:cx6="http://schemas.microsoft.com/office/drawing/2016/5/12/chartex" xmlns:cx7="http://schemas.microsoft.com/office/drawing/2016/5/13/chartex" xmlns:cx8="http://schemas.microsoft.com/office/drawing/2016/5/14/chartex" xmlns:mc="http://schemas.openxmlformats.org/markup-compatibility/2006" xmlns:aink="http://schemas.microsoft.com/office/drawing/2016/ink" xmlns:am3d="http://schemas.microsoft.com/office/drawing/2017/model3d" xmlns:o="urn:schemas-microsoft-com:office:office" xmlns:oel="http://schemas.microsoft.com/office/2019/extlst" xmlns:r="http://schemas.openxmlformats.org/officeDocument/2006/relationships" xmlns:m="http://schemas.openxmlformats.org/officeDocument/2006/math" xmlns:v="urn:schemas-microsoft-com:vml" xmlns:wp14="http://schemas.microsoft.com/office/word/2010/wordprocessingDrawing" xmlns:wp="http://schemas.openxmlformats.org/drawingml/2006/wordprocessingDrawing" xmlns:w10="urn:schemas-microsoft-com:office:word" xmlns:w="http://schemas.openxmlformats.org/wordprocessingml/2006/main" xmlns:w14="http://schemas.microsoft.com/office/word/2010/wordml" xmlns:w15="http://schemas.microsoft.com/office/word/2012/wordml" xmlns:w16cex="http://schemas.microsoft.com/office/word/2018/wordml/cex" xmlns:w16cid="http://schemas.microsoft.com/office/word/2016/wordml/cid" xmlns:w16="http://schemas.microsoft.com/office/word/2018/wordml" xmlns:w16du="http://schemas.microsoft.com/office/word/2023/wordml/word16du" xmlns:w16sdtdh="http://schemas.microsoft.com/office/word/2020/wordml/sdtdatahash" xmlns:w16sdtfl="http://schemas.microsoft.com/office/word/2024/wordml/sdtformatlock" xmlns:w16se="http://schemas.microsoft.com/office/word/2015/wordml/symex" xmlns:wpg="http://schemas.microsoft.com/office/word/2010/wordprocessingGroup" xmlns:wpi="http://schemas.microsoft.com/office/word/2010/wordprocessingInk" xmlns:wne="http://schemas.microsoft.com/office/word/2006/wordml" xmlns:wps="http://schemas.microsoft.com/office/word/2010/wordprocessingShape" mc:Ignorable="w14 w15 w16se w16cid w16 w16cex w16sdtdh w16sdtfl w16du wp14">
   <w:p>
     <w:pPr>
-      <w:pStyle w:val="Yltunniste"/>
+      <w:pStyle w:val="Encabezado"/>
       <w:jc w:val="center"/>
     </w:pPr>
   </w:p>
@@ -917,7 +253,7 @@
 </file>
 
 <file path=word/numbering.xml><?xml version="1.0" encoding="utf-8"?>
-<w:numbering xmlns:wpc="http://schemas.microsoft.com/office/word/2010/wordprocessingCanvas" xmlns:cx="http://schemas.microsoft.com/office/drawing/2014/chartex" xmlns:cx1="http://schemas.microsoft.com/office/drawing/2015/9/8/chartex" xmlns:cx2="http://schemas.microsoft.com/office/drawing/2015/10/21/chartex" xmlns:cx3="http://schemas.microsoft.com/office/drawing/2016/5/9/chartex" xmlns:cx4="http://schemas.microsoft.com/office/drawing/2016/5/10/chartex" xmlns:cx5="http://schemas.microsoft.com/office/drawing/2016/5/11/chartex" xmlns:cx6="http://schemas.microsoft.com/office/drawing/2016/5/12/chartex" xmlns:cx7="http://schemas.microsoft.com/office/drawing/2016/5/13/chartex" xmlns:cx8="http://schemas.microsoft.com/office/drawing/2016/5/14/chartex" xmlns:mc="http://schemas.openxmlformats.org/markup-compatibility/2006" xmlns:aink="http://schemas.microsoft.com/office/drawing/2016/ink" xmlns:am3d="http://schemas.microsoft.com/office/drawing/2017/model3d" xmlns:o="urn:schemas-microsoft-com:office:office" xmlns:r="http://schemas.openxmlformats.org/officeDocument/2006/relationships" xmlns:m="http://schemas.openxmlformats.org/officeDocument/2006/math" xmlns:v="urn:schemas-microsoft-com:vml" xmlns:wp14="http://schemas.microsoft.com/office/word/2010/wordprocessingDrawing" xmlns:wp="http://schemas.openxmlformats.org/drawingml/2006/wordprocessingDrawing" xmlns:w10="urn:schemas-microsoft-com:office:word" xmlns:w="http://schemas.openxmlformats.org/wordprocessingml/2006/main" xmlns:w14="http://schemas.microsoft.com/office/word/2010/wordml" xmlns:w15="http://schemas.microsoft.com/office/word/2012/wordml" xmlns:w16cid="http://schemas.microsoft.com/office/word/2016/wordml/cid" xmlns:w16se="http://schemas.microsoft.com/office/word/2015/wordml/symex" xmlns:wpg="http://schemas.microsoft.com/office/word/2010/wordprocessingGroup" xmlns:wpi="http://schemas.microsoft.com/office/word/2010/wordprocessingInk" xmlns:wne="http://schemas.microsoft.com/office/word/2006/wordml" xmlns:wps="http://schemas.microsoft.com/office/word/2010/wordprocessingShape" mc:Ignorable="w14 w15 w16se w16cid wp14">
+<w:numbering xmlns:wpc="http://schemas.microsoft.com/office/word/2010/wordprocessingCanvas" xmlns:cx="http://schemas.microsoft.com/office/drawing/2014/chartex" xmlns:cx1="http://schemas.microsoft.com/office/drawing/2015/9/8/chartex" xmlns:cx2="http://schemas.microsoft.com/office/drawing/2015/10/21/chartex" xmlns:cx3="http://schemas.microsoft.com/office/drawing/2016/5/9/chartex" xmlns:cx4="http://schemas.microsoft.com/office/drawing/2016/5/10/chartex" xmlns:cx5="http://schemas.microsoft.com/office/drawing/2016/5/11/chartex" xmlns:cx6="http://schemas.microsoft.com/office/drawing/2016/5/12/chartex" xmlns:cx7="http://schemas.microsoft.com/office/drawing/2016/5/13/chartex" xmlns:cx8="http://schemas.microsoft.com/office/drawing/2016/5/14/chartex" xmlns:mc="http://schemas.openxmlformats.org/markup-compatibility/2006" xmlns:aink="http://schemas.microsoft.com/office/drawing/2016/ink" xmlns:am3d="http://schemas.microsoft.com/office/drawing/2017/model3d" xmlns:o="urn:schemas-microsoft-com:office:office" xmlns:oel="http://schemas.microsoft.com/office/2019/extlst" xmlns:r="http://schemas.openxmlformats.org/officeDocument/2006/relationships" xmlns:m="http://schemas.openxmlformats.org/officeDocument/2006/math" xmlns:v="urn:schemas-microsoft-com:vml" xmlns:wp14="http://schemas.microsoft.com/office/word/2010/wordprocessingDrawing" xmlns:wp="http://schemas.openxmlformats.org/drawingml/2006/wordprocessingDrawing" xmlns:w10="urn:schemas-microsoft-com:office:word" xmlns:w="http://schemas.openxmlformats.org/wordprocessingml/2006/main" xmlns:w14="http://schemas.microsoft.com/office/word/2010/wordml" xmlns:w15="http://schemas.microsoft.com/office/word/2012/wordml" xmlns:w16cex="http://schemas.microsoft.com/office/word/2018/wordml/cex" xmlns:w16cid="http://schemas.microsoft.com/office/word/2016/wordml/cid" xmlns:w16="http://schemas.microsoft.com/office/word/2018/wordml" xmlns:w16du="http://schemas.microsoft.com/office/word/2023/wordml/word16du" xmlns:w16sdtdh="http://schemas.microsoft.com/office/word/2020/wordml/sdtdatahash" xmlns:w16sdtfl="http://schemas.microsoft.com/office/word/2024/wordml/sdtformatlock" xmlns:w16se="http://schemas.microsoft.com/office/word/2015/wordml/symex" xmlns:wpg="http://schemas.microsoft.com/office/word/2010/wordprocessingGroup" xmlns:wpi="http://schemas.microsoft.com/office/word/2010/wordprocessingInk" xmlns:wne="http://schemas.microsoft.com/office/word/2006/wordml" xmlns:wps="http://schemas.microsoft.com/office/word/2010/wordprocessingShape" mc:Ignorable="w14 w15 w16se w16cid w16 w16cex w16sdtdh w16sdtfl w16du wp14">
   <w:abstractNum w:abstractNumId="0" w15:restartNumberingAfterBreak="0">
     <w:nsid w:val="3B530E8E"/>
     <w:multiLevelType w:val="hybridMultilevel"/>
@@ -1734,7 +1070,7 @@
     <w:lvl w:ilvl="0">
       <w:start w:val="1"/>
       <w:numFmt w:val="decimal"/>
-      <w:pStyle w:val="Otsikko1"/>
+      <w:pStyle w:val="Ttulo1"/>
       <w:lvlText w:val="%1"/>
       <w:lvlJc w:val="left"/>
       <w:pPr>
@@ -1747,7 +1083,7 @@
     <w:lvl w:ilvl="1">
       <w:start w:val="1"/>
       <w:numFmt w:val="decimal"/>
-      <w:pStyle w:val="Otsikko2"/>
+      <w:pStyle w:val="Ttulo2"/>
       <w:lvlText w:val="%1.%2"/>
       <w:lvlJc w:val="left"/>
       <w:pPr>
@@ -1760,7 +1096,7 @@
     <w:lvl w:ilvl="2">
       <w:start w:val="1"/>
       <w:numFmt w:val="decimal"/>
-      <w:pStyle w:val="Otsikko3"/>
+      <w:pStyle w:val="Ttulo3"/>
       <w:lvlText w:val="%1.%2.%3"/>
       <w:lvlJc w:val="left"/>
       <w:pPr>
@@ -1773,7 +1109,7 @@
     <w:lvl w:ilvl="3">
       <w:start w:val="1"/>
       <w:numFmt w:val="decimal"/>
-      <w:pStyle w:val="Otsikko4"/>
+      <w:pStyle w:val="Ttulo4"/>
       <w:lvlText w:val="%1.%2.%3.%4"/>
       <w:lvlJc w:val="left"/>
       <w:pPr>
@@ -1786,7 +1122,7 @@
     <w:lvl w:ilvl="4">
       <w:start w:val="1"/>
       <w:numFmt w:val="decimal"/>
-      <w:pStyle w:val="Otsikko5"/>
+      <w:pStyle w:val="Ttulo5"/>
       <w:lvlText w:val="%1.%2.%3.%4.%5"/>
       <w:lvlJc w:val="left"/>
       <w:pPr>
@@ -1799,7 +1135,7 @@
     <w:lvl w:ilvl="5">
       <w:start w:val="1"/>
       <w:numFmt w:val="decimal"/>
-      <w:pStyle w:val="Otsikko6"/>
+      <w:pStyle w:val="Ttulo6"/>
       <w:lvlText w:val="%1.%2.%3.%4.%5.%6"/>
       <w:lvlJc w:val="left"/>
       <w:pPr>
@@ -1812,7 +1148,7 @@
     <w:lvl w:ilvl="6">
       <w:start w:val="1"/>
       <w:numFmt w:val="decimal"/>
-      <w:pStyle w:val="Otsikko7"/>
+      <w:pStyle w:val="Ttulo7"/>
       <w:lvlText w:val="%1.%2.%3.%4.%5.%6.%7"/>
       <w:lvlJc w:val="left"/>
       <w:pPr>
@@ -1825,7 +1161,7 @@
     <w:lvl w:ilvl="7">
       <w:start w:val="1"/>
       <w:numFmt w:val="decimal"/>
-      <w:pStyle w:val="Otsikko8"/>
+      <w:pStyle w:val="Ttulo8"/>
       <w:lvlText w:val="%1.%2.%3.%4.%5.%6.%7.%8"/>
       <w:lvlJc w:val="left"/>
       <w:pPr>
@@ -1838,7 +1174,7 @@
     <w:lvl w:ilvl="8">
       <w:start w:val="1"/>
       <w:numFmt w:val="decimal"/>
-      <w:pStyle w:val="Otsikko9"/>
+      <w:pStyle w:val="Ttulo9"/>
       <w:lvlText w:val="%1.%2.%3.%4.%5.%6.%7.%8.%9"/>
       <w:lvlJc w:val="left"/>
       <w:pPr>
@@ -1849,45 +1185,45 @@
       </w:pPr>
     </w:lvl>
   </w:abstractNum>
-  <w:num w:numId="1">
+  <w:num w:numId="1" w16cid:durableId="1934779034">
     <w:abstractNumId w:val="5"/>
   </w:num>
-  <w:num w:numId="2">
+  <w:num w:numId="2" w16cid:durableId="1309482109">
     <w:abstractNumId w:val="1"/>
   </w:num>
-  <w:num w:numId="3">
+  <w:num w:numId="3" w16cid:durableId="407507450">
     <w:abstractNumId w:val="7"/>
   </w:num>
-  <w:num w:numId="4">
+  <w:num w:numId="4" w16cid:durableId="2145653396">
     <w:abstractNumId w:val="0"/>
   </w:num>
-  <w:num w:numId="5">
+  <w:num w:numId="5" w16cid:durableId="927419239">
     <w:abstractNumId w:val="4"/>
   </w:num>
-  <w:num w:numId="6">
+  <w:num w:numId="6" w16cid:durableId="466289380">
     <w:abstractNumId w:val="6"/>
   </w:num>
-  <w:num w:numId="7">
+  <w:num w:numId="7" w16cid:durableId="17702983">
     <w:abstractNumId w:val="3"/>
   </w:num>
-  <w:num w:numId="8">
+  <w:num w:numId="8" w16cid:durableId="1500121395">
     <w:abstractNumId w:val="2"/>
   </w:num>
 </w:numbering>
 </file>
 
 <file path=word/styles.xml><?xml version="1.0" encoding="utf-8"?>
-<w:styles xmlns:mc="http://schemas.openxmlformats.org/markup-compatibility/2006" xmlns:r="http://schemas.openxmlformats.org/officeDocument/2006/relationships" xmlns:w="http://schemas.openxmlformats.org/wordprocessingml/2006/main" xmlns:w14="http://schemas.microsoft.com/office/word/2010/wordml" xmlns:w15="http://schemas.microsoft.com/office/word/2012/wordml" xmlns:w16cid="http://schemas.microsoft.com/office/word/2016/wordml/cid" xmlns:w16se="http://schemas.microsoft.com/office/word/2015/wordml/symex" mc:Ignorable="w14 w15 w16se w16cid">
+<w:styles xmlns:mc="http://schemas.openxmlformats.org/markup-compatibility/2006" xmlns:r="http://schemas.openxmlformats.org/officeDocument/2006/relationships" xmlns:w="http://schemas.openxmlformats.org/wordprocessingml/2006/main" xmlns:w14="http://schemas.microsoft.com/office/word/2010/wordml" xmlns:w15="http://schemas.microsoft.com/office/word/2012/wordml" xmlns:w16cex="http://schemas.microsoft.com/office/word/2018/wordml/cex" xmlns:w16cid="http://schemas.microsoft.com/office/word/2016/wordml/cid" xmlns:w16="http://schemas.microsoft.com/office/word/2018/wordml" xmlns:w16du="http://schemas.microsoft.com/office/word/2023/wordml/word16du" xmlns:w16sdtdh="http://schemas.microsoft.com/office/word/2020/wordml/sdtdatahash" xmlns:w16sdtfl="http://schemas.microsoft.com/office/word/2024/wordml/sdtformatlock" xmlns:w16se="http://schemas.microsoft.com/office/word/2015/wordml/symex" mc:Ignorable="w14 w15 w16se w16cid w16 w16cex w16sdtdh w16sdtfl w16du">
   <w:docDefaults>
     <w:rPrDefault>
       <w:rPr>
         <w:rFonts w:ascii="Times New Roman" w:eastAsia="Times New Roman" w:hAnsi="Times New Roman" w:cs="Times New Roman"/>
-        <w:lang w:bidi="ar-SA"/>
+        <w:lang w:val="es-ES" w:eastAsia="es-ES" w:bidi="ar-SA"/>
       </w:rPr>
     </w:rPrDefault>
     <w:pPrDefault/>
   </w:docDefaults>
-  <w:latentStyles w:defLockedState="0" w:defUIPriority="0" w:defSemiHidden="0" w:defUnhideWhenUsed="0" w:defQFormat="0" w:count="375">
+  <w:latentStyles w:defLockedState="0" w:defUIPriority="0" w:defSemiHidden="0" w:defUnhideWhenUsed="0" w:defQFormat="0" w:count="376">
     <w:lsdException w:name="Normal" w:qFormat="1"/>
     <w:lsdException w:name="heading 1" w:qFormat="1"/>
     <w:lsdException w:name="heading 2" w:qFormat="1"/>
@@ -2166,8 +1502,9 @@
     <w:lsdException w:name="Smart Hyperlink" w:semiHidden="1" w:uiPriority="99" w:unhideWhenUsed="1"/>
     <w:lsdException w:name="Hashtag" w:semiHidden="1" w:uiPriority="99" w:unhideWhenUsed="1"/>
     <w:lsdException w:name="Unresolved Mention" w:semiHidden="1" w:uiPriority="99" w:unhideWhenUsed="1"/>
+    <w:lsdException w:name="Smart Link" w:semiHidden="1" w:uiPriority="99" w:unhideWhenUsed="1"/>
   </w:latentStyles>
-  <w:style w:type="paragraph" w:default="1" w:styleId="Normaali">
+  <w:style w:type="paragraph" w:default="1" w:styleId="Normal">
     <w:name w:val="Normal"/>
     <w:qFormat/>
     <w:rPr>
@@ -2176,10 +1513,10 @@
       <w:lang w:val="fi-FI" w:eastAsia="en-US"/>
     </w:rPr>
   </w:style>
-  <w:style w:type="paragraph" w:styleId="Otsikko1">
+  <w:style w:type="paragraph" w:styleId="Ttulo1">
     <w:name w:val="heading 1"/>
-    <w:basedOn w:val="Normaali"/>
-    <w:next w:val="Normaali"/>
+    <w:basedOn w:val="Normal"/>
+    <w:next w:val="Normal"/>
     <w:qFormat/>
     <w:pPr>
       <w:keepNext/>
@@ -2199,10 +1536,10 @@
       <w:szCs w:val="32"/>
     </w:rPr>
   </w:style>
-  <w:style w:type="paragraph" w:styleId="Otsikko2">
+  <w:style w:type="paragraph" w:styleId="Ttulo2">
     <w:name w:val="heading 2"/>
-    <w:basedOn w:val="Normaali"/>
-    <w:next w:val="Normaali"/>
+    <w:basedOn w:val="Normal"/>
+    <w:next w:val="Normal"/>
     <w:qFormat/>
     <w:pPr>
       <w:keepNext/>
@@ -2221,10 +1558,10 @@
       <w:szCs w:val="26"/>
     </w:rPr>
   </w:style>
-  <w:style w:type="paragraph" w:styleId="Otsikko3">
+  <w:style w:type="paragraph" w:styleId="Ttulo3">
     <w:name w:val="heading 3"/>
-    <w:basedOn w:val="Normaali"/>
-    <w:next w:val="Normaali"/>
+    <w:basedOn w:val="Normal"/>
+    <w:next w:val="Normal"/>
     <w:qFormat/>
     <w:pPr>
       <w:keepNext/>
@@ -2239,10 +1576,10 @@
       <w:bCs/>
     </w:rPr>
   </w:style>
-  <w:style w:type="paragraph" w:styleId="Otsikko4">
+  <w:style w:type="paragraph" w:styleId="Ttulo4">
     <w:name w:val="heading 4"/>
-    <w:basedOn w:val="Normaali"/>
-    <w:next w:val="Normaali"/>
+    <w:basedOn w:val="Normal"/>
+    <w:next w:val="Normal"/>
     <w:qFormat/>
     <w:pPr>
       <w:keepNext/>
@@ -2259,10 +1596,10 @@
       <w:szCs w:val="26"/>
     </w:rPr>
   </w:style>
-  <w:style w:type="paragraph" w:styleId="Otsikko5">
+  <w:style w:type="paragraph" w:styleId="Ttulo5">
     <w:name w:val="heading 5"/>
-    <w:basedOn w:val="Normaali"/>
-    <w:next w:val="Normaali"/>
+    <w:basedOn w:val="Normal"/>
+    <w:next w:val="Normal"/>
     <w:qFormat/>
     <w:pPr>
       <w:keepNext/>
@@ -2279,10 +1616,10 @@
       <w:szCs w:val="32"/>
     </w:rPr>
   </w:style>
-  <w:style w:type="paragraph" w:styleId="Otsikko6">
+  <w:style w:type="paragraph" w:styleId="Ttulo6">
     <w:name w:val="heading 6"/>
-    <w:basedOn w:val="Normaali"/>
-    <w:next w:val="Normaali"/>
+    <w:basedOn w:val="Normal"/>
+    <w:next w:val="Normal"/>
     <w:qFormat/>
     <w:pPr>
       <w:keepNext/>
@@ -2299,10 +1636,10 @@
       <w:szCs w:val="28"/>
     </w:rPr>
   </w:style>
-  <w:style w:type="paragraph" w:styleId="Otsikko7">
+  <w:style w:type="paragraph" w:styleId="Ttulo7">
     <w:name w:val="heading 7"/>
-    <w:basedOn w:val="Normaali"/>
-    <w:next w:val="Normaali"/>
+    <w:basedOn w:val="Normal"/>
+    <w:next w:val="Normal"/>
     <w:qFormat/>
     <w:pPr>
       <w:numPr>
@@ -2313,10 +1650,10 @@
       <w:outlineLvl w:val="6"/>
     </w:pPr>
   </w:style>
-  <w:style w:type="paragraph" w:styleId="Otsikko8">
+  <w:style w:type="paragraph" w:styleId="Ttulo8">
     <w:name w:val="heading 8"/>
-    <w:basedOn w:val="Normaali"/>
-    <w:next w:val="Normaali"/>
+    <w:basedOn w:val="Normal"/>
+    <w:next w:val="Normal"/>
     <w:qFormat/>
     <w:pPr>
       <w:numPr>
@@ -2331,10 +1668,10 @@
       <w:iCs/>
     </w:rPr>
   </w:style>
-  <w:style w:type="paragraph" w:styleId="Otsikko9">
+  <w:style w:type="paragraph" w:styleId="Ttulo9">
     <w:name w:val="heading 9"/>
-    <w:basedOn w:val="Normaali"/>
-    <w:next w:val="Normaali"/>
+    <w:basedOn w:val="Normal"/>
+    <w:next w:val="Normal"/>
     <w:qFormat/>
     <w:pPr>
       <w:numPr>
@@ -2350,13 +1687,13 @@
       <w:szCs w:val="22"/>
     </w:rPr>
   </w:style>
-  <w:style w:type="character" w:default="1" w:styleId="Kappaleenoletusfontti">
+  <w:style w:type="character" w:default="1" w:styleId="Fuentedeprrafopredeter">
     <w:name w:val="Default Paragraph Font"/>
     <w:uiPriority w:val="1"/>
     <w:semiHidden/>
     <w:unhideWhenUsed/>
   </w:style>
-  <w:style w:type="table" w:default="1" w:styleId="Normaalitaulukko">
+  <w:style w:type="table" w:default="1" w:styleId="Tablanormal">
     <w:name w:val="Normal Table"/>
     <w:uiPriority w:val="99"/>
     <w:semiHidden/>
@@ -2371,128 +1708,128 @@
       </w:tblCellMar>
     </w:tblPr>
   </w:style>
-  <w:style w:type="numbering" w:default="1" w:styleId="Eiluetteloa">
+  <w:style w:type="numbering" w:default="1" w:styleId="Sinlista">
     <w:name w:val="No List"/>
     <w:uiPriority w:val="99"/>
     <w:semiHidden/>
     <w:unhideWhenUsed/>
   </w:style>
-  <w:style w:type="paragraph" w:styleId="Leipteksti">
+  <w:style w:type="paragraph" w:styleId="Textoindependiente">
     <w:name w:val="Body Text"/>
-    <w:basedOn w:val="Normaali"/>
-    <w:link w:val="LeiptekstiChar"/>
+    <w:basedOn w:val="Normal"/>
+    <w:link w:val="TextoindependienteCar"/>
     <w:pPr>
       <w:spacing w:line="360" w:lineRule="auto"/>
       <w:jc w:val="both"/>
     </w:pPr>
   </w:style>
-  <w:style w:type="character" w:styleId="Hyperlinkki">
+  <w:style w:type="character" w:styleId="Hipervnculo">
     <w:name w:val="Hyperlink"/>
     <w:rPr>
       <w:color w:val="0000FF"/>
       <w:u w:val="single"/>
     </w:rPr>
   </w:style>
-  <w:style w:type="paragraph" w:styleId="Hakemisto1">
+  <w:style w:type="paragraph" w:styleId="ndice1">
     <w:name w:val="index 1"/>
-    <w:basedOn w:val="Normaali"/>
-    <w:next w:val="Normaali"/>
+    <w:basedOn w:val="Normal"/>
+    <w:next w:val="Normal"/>
     <w:autoRedefine/>
     <w:semiHidden/>
     <w:pPr>
       <w:ind w:left="240" w:hanging="240"/>
     </w:pPr>
   </w:style>
-  <w:style w:type="paragraph" w:styleId="Hakemisto2">
+  <w:style w:type="paragraph" w:styleId="ndice2">
     <w:name w:val="index 2"/>
-    <w:basedOn w:val="Normaali"/>
-    <w:next w:val="Normaali"/>
+    <w:basedOn w:val="Normal"/>
+    <w:next w:val="Normal"/>
     <w:autoRedefine/>
     <w:semiHidden/>
     <w:pPr>
       <w:ind w:left="480" w:hanging="240"/>
     </w:pPr>
   </w:style>
-  <w:style w:type="paragraph" w:styleId="Hakemisto3">
+  <w:style w:type="paragraph" w:styleId="ndice3">
     <w:name w:val="index 3"/>
-    <w:basedOn w:val="Normaali"/>
-    <w:next w:val="Normaali"/>
+    <w:basedOn w:val="Normal"/>
+    <w:next w:val="Normal"/>
     <w:autoRedefine/>
     <w:semiHidden/>
     <w:pPr>
       <w:ind w:left="720" w:hanging="240"/>
     </w:pPr>
   </w:style>
-  <w:style w:type="paragraph" w:styleId="Hakemisto4">
+  <w:style w:type="paragraph" w:styleId="ndice4">
     <w:name w:val="index 4"/>
-    <w:basedOn w:val="Normaali"/>
-    <w:next w:val="Normaali"/>
+    <w:basedOn w:val="Normal"/>
+    <w:next w:val="Normal"/>
     <w:autoRedefine/>
     <w:semiHidden/>
     <w:pPr>
       <w:ind w:left="960" w:hanging="240"/>
     </w:pPr>
   </w:style>
-  <w:style w:type="paragraph" w:styleId="Hakemisto5">
+  <w:style w:type="paragraph" w:styleId="ndice5">
     <w:name w:val="index 5"/>
-    <w:basedOn w:val="Normaali"/>
-    <w:next w:val="Normaali"/>
+    <w:basedOn w:val="Normal"/>
+    <w:next w:val="Normal"/>
     <w:autoRedefine/>
     <w:semiHidden/>
     <w:pPr>
       <w:ind w:left="1200" w:hanging="240"/>
     </w:pPr>
   </w:style>
-  <w:style w:type="paragraph" w:styleId="Hakemisto6">
+  <w:style w:type="paragraph" w:styleId="ndice6">
     <w:name w:val="index 6"/>
-    <w:basedOn w:val="Normaali"/>
-    <w:next w:val="Normaali"/>
+    <w:basedOn w:val="Normal"/>
+    <w:next w:val="Normal"/>
     <w:autoRedefine/>
     <w:semiHidden/>
     <w:pPr>
       <w:ind w:left="1440" w:hanging="240"/>
     </w:pPr>
   </w:style>
-  <w:style w:type="paragraph" w:styleId="Hakemisto7">
+  <w:style w:type="paragraph" w:styleId="ndice7">
     <w:name w:val="index 7"/>
-    <w:basedOn w:val="Normaali"/>
-    <w:next w:val="Normaali"/>
+    <w:basedOn w:val="Normal"/>
+    <w:next w:val="Normal"/>
     <w:autoRedefine/>
     <w:semiHidden/>
     <w:pPr>
       <w:ind w:left="1680" w:hanging="240"/>
     </w:pPr>
   </w:style>
-  <w:style w:type="paragraph" w:styleId="Hakemisto8">
+  <w:style w:type="paragraph" w:styleId="ndice8">
     <w:name w:val="index 8"/>
-    <w:basedOn w:val="Normaali"/>
-    <w:next w:val="Normaali"/>
+    <w:basedOn w:val="Normal"/>
+    <w:next w:val="Normal"/>
     <w:autoRedefine/>
     <w:semiHidden/>
     <w:pPr>
       <w:ind w:left="1920" w:hanging="240"/>
     </w:pPr>
   </w:style>
-  <w:style w:type="paragraph" w:styleId="Hakemisto9">
+  <w:style w:type="paragraph" w:styleId="ndice9">
     <w:name w:val="index 9"/>
-    <w:basedOn w:val="Normaali"/>
-    <w:next w:val="Normaali"/>
+    <w:basedOn w:val="Normal"/>
+    <w:next w:val="Normal"/>
     <w:autoRedefine/>
     <w:semiHidden/>
     <w:pPr>
       <w:ind w:left="2160" w:hanging="240"/>
     </w:pPr>
   </w:style>
-  <w:style w:type="paragraph" w:styleId="Hakemistonotsikko">
+  <w:style w:type="paragraph" w:styleId="Ttulodendice">
     <w:name w:val="index heading"/>
-    <w:basedOn w:val="Normaali"/>
-    <w:next w:val="Hakemisto1"/>
+    <w:basedOn w:val="Normal"/>
+    <w:next w:val="ndice1"/>
     <w:semiHidden/>
   </w:style>
-  <w:style w:type="paragraph" w:styleId="Sisluet1">
+  <w:style w:type="paragraph" w:styleId="TDC1">
     <w:name w:val="toc 1"/>
-    <w:basedOn w:val="Normaali"/>
-    <w:next w:val="Normaali"/>
+    <w:basedOn w:val="Normal"/>
+    <w:next w:val="Normal"/>
     <w:autoRedefine/>
     <w:semiHidden/>
     <w:rsid w:val="009403CA"/>
@@ -2511,10 +1848,10 @@
       <w:noProof/>
     </w:rPr>
   </w:style>
-  <w:style w:type="paragraph" w:styleId="Sisluet2">
+  <w:style w:type="paragraph" w:styleId="TDC2">
     <w:name w:val="toc 2"/>
-    <w:basedOn w:val="Normaali"/>
-    <w:next w:val="Normaali"/>
+    <w:basedOn w:val="Normal"/>
+    <w:next w:val="Normal"/>
     <w:autoRedefine/>
     <w:semiHidden/>
     <w:rsid w:val="009403CA"/>
@@ -2530,10 +1867,10 @@
       <w:smallCaps/>
     </w:rPr>
   </w:style>
-  <w:style w:type="paragraph" w:styleId="Sisluet3">
+  <w:style w:type="paragraph" w:styleId="TDC3">
     <w:name w:val="toc 3"/>
-    <w:basedOn w:val="Normaali"/>
-    <w:next w:val="Normaali"/>
+    <w:basedOn w:val="Normal"/>
+    <w:next w:val="Normal"/>
     <w:autoRedefine/>
     <w:semiHidden/>
     <w:pPr>
@@ -2544,69 +1881,69 @@
       <w:iCs/>
     </w:rPr>
   </w:style>
-  <w:style w:type="paragraph" w:styleId="Sisluet4">
+  <w:style w:type="paragraph" w:styleId="TDC4">
     <w:name w:val="toc 4"/>
-    <w:basedOn w:val="Normaali"/>
-    <w:next w:val="Normaali"/>
+    <w:basedOn w:val="Normal"/>
+    <w:next w:val="Normal"/>
     <w:autoRedefine/>
     <w:semiHidden/>
     <w:pPr>
       <w:ind w:left="720"/>
     </w:pPr>
   </w:style>
-  <w:style w:type="paragraph" w:styleId="Sisluet5">
+  <w:style w:type="paragraph" w:styleId="TDC5">
     <w:name w:val="toc 5"/>
-    <w:basedOn w:val="Normaali"/>
-    <w:next w:val="Normaali"/>
+    <w:basedOn w:val="Normal"/>
+    <w:next w:val="Normal"/>
     <w:autoRedefine/>
     <w:semiHidden/>
     <w:pPr>
       <w:ind w:left="960"/>
     </w:pPr>
   </w:style>
-  <w:style w:type="paragraph" w:styleId="Sisluet6">
+  <w:style w:type="paragraph" w:styleId="TDC6">
     <w:name w:val="toc 6"/>
-    <w:basedOn w:val="Normaali"/>
-    <w:next w:val="Normaali"/>
+    <w:basedOn w:val="Normal"/>
+    <w:next w:val="Normal"/>
     <w:autoRedefine/>
     <w:semiHidden/>
     <w:pPr>
       <w:ind w:left="1200"/>
     </w:pPr>
   </w:style>
-  <w:style w:type="paragraph" w:styleId="Sisluet7">
+  <w:style w:type="paragraph" w:styleId="TDC7">
     <w:name w:val="toc 7"/>
-    <w:basedOn w:val="Normaali"/>
-    <w:next w:val="Normaali"/>
+    <w:basedOn w:val="Normal"/>
+    <w:next w:val="Normal"/>
     <w:autoRedefine/>
     <w:semiHidden/>
     <w:pPr>
       <w:ind w:left="1440"/>
     </w:pPr>
   </w:style>
-  <w:style w:type="paragraph" w:styleId="Sisluet8">
+  <w:style w:type="paragraph" w:styleId="TDC8">
     <w:name w:val="toc 8"/>
-    <w:basedOn w:val="Normaali"/>
-    <w:next w:val="Normaali"/>
+    <w:basedOn w:val="Normal"/>
+    <w:next w:val="Normal"/>
     <w:autoRedefine/>
     <w:semiHidden/>
     <w:pPr>
       <w:ind w:left="1680"/>
     </w:pPr>
   </w:style>
-  <w:style w:type="paragraph" w:styleId="Sisluet9">
+  <w:style w:type="paragraph" w:styleId="TDC9">
     <w:name w:val="toc 9"/>
-    <w:basedOn w:val="Normaali"/>
-    <w:next w:val="Normaali"/>
+    <w:basedOn w:val="Normal"/>
+    <w:next w:val="Normal"/>
     <w:autoRedefine/>
     <w:semiHidden/>
     <w:pPr>
       <w:ind w:left="1920"/>
     </w:pPr>
   </w:style>
-  <w:style w:type="paragraph" w:styleId="Alatunniste">
+  <w:style w:type="paragraph" w:styleId="Piedepgina">
     <w:name w:val="footer"/>
-    <w:basedOn w:val="Normaali"/>
+    <w:basedOn w:val="Normal"/>
     <w:pPr>
       <w:tabs>
         <w:tab w:val="center" w:pos="4819"/>
@@ -2614,13 +1951,13 @@
       </w:tabs>
     </w:pPr>
   </w:style>
-  <w:style w:type="character" w:styleId="Sivunumero">
+  <w:style w:type="character" w:styleId="Nmerodepgina">
     <w:name w:val="page number"/>
-    <w:basedOn w:val="Kappaleenoletusfontti"/>
-  </w:style>
-  <w:style w:type="paragraph" w:styleId="Yltunniste">
+    <w:basedOn w:val="Fuentedeprrafopredeter"/>
+  </w:style>
+  <w:style w:type="paragraph" w:styleId="Encabezado">
     <w:name w:val="header"/>
-    <w:basedOn w:val="Normaali"/>
+    <w:basedOn w:val="Normal"/>
     <w:pPr>
       <w:tabs>
         <w:tab w:val="center" w:pos="4819"/>
@@ -2628,9 +1965,9 @@
       </w:tabs>
     </w:pPr>
   </w:style>
-  <w:style w:type="paragraph" w:styleId="Otsikko">
+  <w:style w:type="paragraph" w:styleId="Ttulo">
     <w:name w:val="Title"/>
-    <w:basedOn w:val="Normaali"/>
+    <w:basedOn w:val="Normal"/>
     <w:qFormat/>
     <w:pPr>
       <w:spacing w:line="360" w:lineRule="auto"/>
@@ -2644,16 +1981,16 @@
       <w:szCs w:val="28"/>
     </w:rPr>
   </w:style>
-  <w:style w:type="paragraph" w:styleId="Vaintekstin">
+  <w:style w:type="paragraph" w:styleId="Textosinformato">
     <w:name w:val="Plain Text"/>
-    <w:basedOn w:val="Normaali"/>
+    <w:basedOn w:val="Normal"/>
     <w:rPr>
       <w:rFonts w:ascii="Courier New" w:hAnsi="Courier New" w:cs="Courier New"/>
       <w:sz w:val="20"/>
       <w:szCs w:val="20"/>
     </w:rPr>
   </w:style>
-  <w:style w:type="character" w:styleId="AvattuHyperlinkki">
+  <w:style w:type="character" w:styleId="Hipervnculovisitado">
     <w:name w:val="FollowedHyperlink"/>
     <w:rPr>
       <w:color w:val="800080"/>
@@ -2677,7 +2014,7 @@
   </w:style>
   <w:style w:type="paragraph" w:customStyle="1" w:styleId="font5">
     <w:name w:val="font5"/>
-    <w:basedOn w:val="Normaali"/>
+    <w:basedOn w:val="Normal"/>
     <w:pPr>
       <w:spacing w:before="100" w:beforeAutospacing="1" w:after="100" w:afterAutospacing="1"/>
     </w:pPr>
@@ -2691,7 +2028,7 @@
   </w:style>
   <w:style w:type="paragraph" w:customStyle="1" w:styleId="font6">
     <w:name w:val="font6"/>
-    <w:basedOn w:val="Normaali"/>
+    <w:basedOn w:val="Normal"/>
     <w:pPr>
       <w:spacing w:before="100" w:beforeAutospacing="1" w:after="100" w:afterAutospacing="1"/>
     </w:pPr>
@@ -2703,7 +2040,7 @@
   </w:style>
   <w:style w:type="paragraph" w:customStyle="1" w:styleId="xl24">
     <w:name w:val="xl24"/>
-    <w:basedOn w:val="Normaali"/>
+    <w:basedOn w:val="Normal"/>
     <w:pPr>
       <w:pBdr>
         <w:left w:val="single" w:sz="4" w:space="0" w:color="auto"/>
@@ -2721,7 +2058,7 @@
   </w:style>
   <w:style w:type="paragraph" w:customStyle="1" w:styleId="xl25">
     <w:name w:val="xl25"/>
-    <w:basedOn w:val="Normaali"/>
+    <w:basedOn w:val="Normal"/>
     <w:pPr>
       <w:shd w:val="clear" w:color="auto" w:fill="FFFFFF"/>
       <w:spacing w:before="100" w:beforeAutospacing="1" w:after="100" w:afterAutospacing="1"/>
@@ -2736,7 +2073,7 @@
   </w:style>
   <w:style w:type="paragraph" w:customStyle="1" w:styleId="xl26">
     <w:name w:val="xl26"/>
-    <w:basedOn w:val="Normaali"/>
+    <w:basedOn w:val="Normal"/>
     <w:pPr>
       <w:pBdr>
         <w:left w:val="single" w:sz="4" w:space="0" w:color="auto"/>
@@ -2746,7 +2083,7 @@
   </w:style>
   <w:style w:type="paragraph" w:customStyle="1" w:styleId="xl27">
     <w:name w:val="xl27"/>
-    <w:basedOn w:val="Normaali"/>
+    <w:basedOn w:val="Normal"/>
     <w:pPr>
       <w:pBdr>
         <w:right w:val="single" w:sz="4" w:space="0" w:color="auto"/>
@@ -2756,7 +2093,7 @@
   </w:style>
   <w:style w:type="paragraph" w:customStyle="1" w:styleId="xl28">
     <w:name w:val="xl28"/>
-    <w:basedOn w:val="Normaali"/>
+    <w:basedOn w:val="Normal"/>
     <w:pPr>
       <w:spacing w:before="100" w:beforeAutospacing="1" w:after="100" w:afterAutospacing="1"/>
       <w:jc w:val="center"/>
@@ -2769,7 +2106,7 @@
   </w:style>
   <w:style w:type="paragraph" w:customStyle="1" w:styleId="xl29">
     <w:name w:val="xl29"/>
-    <w:basedOn w:val="Normaali"/>
+    <w:basedOn w:val="Normal"/>
     <w:pPr>
       <w:pBdr>
         <w:left w:val="single" w:sz="4" w:space="0" w:color="auto"/>
@@ -2780,7 +2117,7 @@
   </w:style>
   <w:style w:type="paragraph" w:customStyle="1" w:styleId="xl30">
     <w:name w:val="xl30"/>
-    <w:basedOn w:val="Normaali"/>
+    <w:basedOn w:val="Normal"/>
     <w:pPr>
       <w:shd w:val="clear" w:color="auto" w:fill="FFFFFF"/>
       <w:spacing w:before="100" w:beforeAutospacing="1" w:after="100" w:afterAutospacing="1"/>
@@ -2794,7 +2131,7 @@
   </w:style>
   <w:style w:type="paragraph" w:customStyle="1" w:styleId="xl31">
     <w:name w:val="xl31"/>
-    <w:basedOn w:val="Normaali"/>
+    <w:basedOn w:val="Normal"/>
     <w:pPr>
       <w:shd w:val="clear" w:color="auto" w:fill="FFFFFF"/>
       <w:spacing w:before="100" w:beforeAutospacing="1" w:after="100" w:afterAutospacing="1"/>
@@ -2802,7 +2139,7 @@
   </w:style>
   <w:style w:type="paragraph" w:customStyle="1" w:styleId="xl32">
     <w:name w:val="xl32"/>
-    <w:basedOn w:val="Normaali"/>
+    <w:basedOn w:val="Normal"/>
     <w:pPr>
       <w:shd w:val="clear" w:color="auto" w:fill="FFFFFF"/>
       <w:spacing w:before="100" w:beforeAutospacing="1" w:after="100" w:afterAutospacing="1"/>
@@ -2816,7 +2153,7 @@
   </w:style>
   <w:style w:type="paragraph" w:customStyle="1" w:styleId="xl33">
     <w:name w:val="xl33"/>
-    <w:basedOn w:val="Normaali"/>
+    <w:basedOn w:val="Normal"/>
     <w:pPr>
       <w:pBdr>
         <w:right w:val="single" w:sz="4" w:space="0" w:color="auto"/>
@@ -2827,7 +2164,7 @@
   </w:style>
   <w:style w:type="paragraph" w:customStyle="1" w:styleId="xl34">
     <w:name w:val="xl34"/>
-    <w:basedOn w:val="Normaali"/>
+    <w:basedOn w:val="Normal"/>
     <w:pPr>
       <w:shd w:val="clear" w:color="auto" w:fill="333333"/>
       <w:spacing w:before="100" w:beforeAutospacing="1" w:after="100" w:afterAutospacing="1"/>
@@ -2842,7 +2179,7 @@
   </w:style>
   <w:style w:type="paragraph" w:customStyle="1" w:styleId="xl35">
     <w:name w:val="xl35"/>
-    <w:basedOn w:val="Normaali"/>
+    <w:basedOn w:val="Normal"/>
     <w:pPr>
       <w:pBdr>
         <w:left w:val="single" w:sz="4" w:space="0" w:color="auto"/>
@@ -2859,7 +2196,7 @@
   </w:style>
   <w:style w:type="paragraph" w:customStyle="1" w:styleId="xl36">
     <w:name w:val="xl36"/>
-    <w:basedOn w:val="Normaali"/>
+    <w:basedOn w:val="Normal"/>
     <w:pPr>
       <w:shd w:val="clear" w:color="auto" w:fill="333333"/>
       <w:spacing w:before="100" w:beforeAutospacing="1" w:after="100" w:afterAutospacing="1"/>
@@ -2873,7 +2210,7 @@
   </w:style>
   <w:style w:type="paragraph" w:customStyle="1" w:styleId="xl37">
     <w:name w:val="xl37"/>
-    <w:basedOn w:val="Normaali"/>
+    <w:basedOn w:val="Normal"/>
     <w:pPr>
       <w:pBdr>
         <w:left w:val="single" w:sz="4" w:space="0" w:color="auto"/>
@@ -2884,7 +2221,7 @@
   </w:style>
   <w:style w:type="paragraph" w:customStyle="1" w:styleId="xl38">
     <w:name w:val="xl38"/>
-    <w:basedOn w:val="Normaali"/>
+    <w:basedOn w:val="Normal"/>
     <w:pPr>
       <w:shd w:val="clear" w:color="auto" w:fill="333333"/>
       <w:spacing w:before="100" w:beforeAutospacing="1" w:after="100" w:afterAutospacing="1"/>
@@ -2892,7 +2229,7 @@
   </w:style>
   <w:style w:type="paragraph" w:customStyle="1" w:styleId="xl39">
     <w:name w:val="xl39"/>
-    <w:basedOn w:val="Normaali"/>
+    <w:basedOn w:val="Normal"/>
     <w:pPr>
       <w:pBdr>
         <w:right w:val="single" w:sz="4" w:space="0" w:color="auto"/>
@@ -2901,15 +2238,15 @@
       <w:spacing w:before="100" w:beforeAutospacing="1" w:after="100" w:afterAutospacing="1"/>
     </w:pPr>
   </w:style>
-  <w:style w:type="paragraph" w:styleId="Pivmr">
+  <w:style w:type="paragraph" w:styleId="Fecha">
     <w:name w:val="Date"/>
-    <w:basedOn w:val="Normaali"/>
-    <w:next w:val="Normaali"/>
+    <w:basedOn w:val="Normal"/>
+    <w:next w:val="Normal"/>
     <w:rsid w:val="00166D0D"/>
   </w:style>
   <w:style w:type="paragraph" w:customStyle="1" w:styleId="Style1">
     <w:name w:val="Style1"/>
-    <w:basedOn w:val="Otsikko3"/>
+    <w:basedOn w:val="Ttulo3"/>
     <w:autoRedefine/>
     <w:rsid w:val="00E405A1"/>
     <w:pPr>
@@ -2919,9 +2256,9 @@
       <w:rFonts w:ascii="Arial" w:hAnsi="Arial"/>
     </w:rPr>
   </w:style>
-  <w:style w:type="table" w:styleId="TaulukkoRuudukko">
+  <w:style w:type="table" w:styleId="Tablaconcuadrcula">
     <w:name w:val="Table Grid"/>
-    <w:basedOn w:val="Normaalitaulukko"/>
+    <w:basedOn w:val="Tablanormal"/>
     <w:rsid w:val="008A5436"/>
     <w:tblPr>
       <w:tblBorders>
@@ -2934,9 +2271,9 @@
       </w:tblBorders>
     </w:tblPr>
   </w:style>
-  <w:style w:type="character" w:customStyle="1" w:styleId="LeiptekstiChar">
-    <w:name w:val="Leipäteksti Char"/>
-    <w:link w:val="Leipteksti"/>
+  <w:style w:type="character" w:customStyle="1" w:styleId="TextoindependienteCar">
+    <w:name w:val="Texto independiente Car"/>
+    <w:link w:val="Textoindependiente"/>
     <w:rsid w:val="00154C31"/>
     <w:rPr>
       <w:sz w:val="24"/>
@@ -2944,7 +2281,7 @@
       <w:lang w:val="fi-FI" w:eastAsia="en-US" w:bidi="ar-SA"/>
     </w:rPr>
   </w:style>
-  <w:style w:type="character" w:styleId="Korostus">
+  <w:style w:type="character" w:styleId="nfasis">
     <w:name w:val="Emphasis"/>
     <w:qFormat/>
     <w:rsid w:val="00497E28"/>
@@ -2953,10 +2290,10 @@
       <w:iCs/>
     </w:rPr>
   </w:style>
-  <w:style w:type="paragraph" w:styleId="Seliteteksti">
+  <w:style w:type="paragraph" w:styleId="Textodeglobo">
     <w:name w:val="Balloon Text"/>
-    <w:basedOn w:val="Normaali"/>
-    <w:link w:val="SelitetekstiChar"/>
+    <w:basedOn w:val="Normal"/>
+    <w:link w:val="TextodegloboCar"/>
     <w:rsid w:val="00E83372"/>
     <w:rPr>
       <w:rFonts w:ascii="Tahoma" w:hAnsi="Tahoma" w:cs="Tahoma"/>
@@ -2964,9 +2301,9 @@
       <w:szCs w:val="16"/>
     </w:rPr>
   </w:style>
-  <w:style w:type="character" w:customStyle="1" w:styleId="SelitetekstiChar">
-    <w:name w:val="Seliteteksti Char"/>
-    <w:link w:val="Seliteteksti"/>
+  <w:style w:type="character" w:customStyle="1" w:styleId="TextodegloboCar">
+    <w:name w:val="Texto de globo Car"/>
+    <w:link w:val="Textodeglobo"/>
     <w:rsid w:val="00E83372"/>
     <w:rPr>
       <w:rFonts w:ascii="Tahoma" w:hAnsi="Tahoma" w:cs="Tahoma"/>
@@ -3274,6 +2611,24 @@
 </file>
 
 <file path=customXml/item1.xml><?xml version="1.0" encoding="utf-8"?>
+<p:properties xmlns:p="http://schemas.microsoft.com/office/2006/metadata/properties" xmlns:xsi="http://www.w3.org/2001/XMLSchema-instance" xmlns:pc="http://schemas.microsoft.com/office/infopath/2007/PartnerControls">
+  <documentManagement>
+    <PublishingExpirationDate xmlns="http://schemas.microsoft.com/sharepoint/v3" xsi:nil="true"/>
+    <PublishingStartDate xmlns="http://schemas.microsoft.com/sharepoint/v3" xsi:nil="true"/>
+  </documentManagement>
+</p:properties>
+</file>
+
+<file path=customXml/item2.xml><?xml version="1.0" encoding="utf-8"?>
+<?mso-contentType ?>
+<FormTemplates xmlns="http://schemas.microsoft.com/sharepoint/v3/contenttype/forms">
+  <Display>DocumentLibraryForm</Display>
+  <Edit>DocumentLibraryForm</Edit>
+  <New>DocumentLibraryForm</New>
+</FormTemplates>
+</file>
+
+<file path=customXml/item3.xml><?xml version="1.0" encoding="utf-8"?>
 <ct:contentTypeSchema xmlns:ct="http://schemas.microsoft.com/office/2006/metadata/contentType" xmlns:ma="http://schemas.microsoft.com/office/2006/metadata/properties/metaAttributes" ct:_="" ma:_="" ma:contentTypeName="Asiakirja" ma:contentTypeID="0x01010017418C401CCB2042A3A99A19F43F356D" ma:contentTypeVersion="1" ma:contentTypeDescription="Luo uusi asiakirja." ma:contentTypeScope="" ma:versionID="f4b075d3ca74a5dbaed73e767a156aa0">
   <xsd:schema xmlns:xsd="http://www.w3.org/2001/XMLSchema" xmlns:p="http://schemas.microsoft.com/office/2006/metadata/properties" xmlns:ns1="http://schemas.microsoft.com/sharepoint/v3" targetNamespace="http://schemas.microsoft.com/office/2006/metadata/properties" ma:root="true" ma:fieldsID="4340a008e99365d80b71206bae222996" ns1:_="">
     <xsd:import namespace="http://schemas.microsoft.com/sharepoint/v3"/>
@@ -3339,25 +2694,25 @@
 </ct:contentTypeSchema>
 </file>
 
-<file path=customXml/item2.xml><?xml version="1.0" encoding="utf-8"?>
-<?mso-contentType ?>
-<FormTemplates xmlns="http://schemas.microsoft.com/sharepoint/v3/contenttype/forms">
-  <Display>DocumentLibraryForm</Display>
-  <Edit>DocumentLibraryForm</Edit>
-  <New>DocumentLibraryForm</New>
-</FormTemplates>
+<file path=customXml/itemProps1.xml><?xml version="1.0" encoding="utf-8"?>
+<ds:datastoreItem xmlns:ds="http://schemas.openxmlformats.org/officeDocument/2006/customXml" ds:itemID="{FA8F0064-303C-446D-896E-46EEB9A79DC3}">
+  <ds:schemaRefs>
+    <ds:schemaRef ds:uri="http://schemas.microsoft.com/office/2006/metadata/properties"/>
+    <ds:schemaRef ds:uri="http://schemas.microsoft.com/office/infopath/2007/PartnerControls"/>
+    <ds:schemaRef ds:uri="http://schemas.microsoft.com/sharepoint/v3"/>
+  </ds:schemaRefs>
+</ds:datastoreItem>
 </file>
 
-<file path=customXml/item3.xml><?xml version="1.0" encoding="utf-8"?>
-<p:properties xmlns:p="http://schemas.microsoft.com/office/2006/metadata/properties" xmlns:xsi="http://www.w3.org/2001/XMLSchema-instance" xmlns:pc="http://schemas.microsoft.com/office/infopath/2007/PartnerControls">
-  <documentManagement>
-    <PublishingExpirationDate xmlns="http://schemas.microsoft.com/sharepoint/v3" xsi:nil="true"/>
-    <PublishingStartDate xmlns="http://schemas.microsoft.com/sharepoint/v3" xsi:nil="true"/>
-  </documentManagement>
-</p:properties>
+<file path=customXml/itemProps2.xml><?xml version="1.0" encoding="utf-8"?>
+<ds:datastoreItem xmlns:ds="http://schemas.openxmlformats.org/officeDocument/2006/customXml" ds:itemID="{13FBD2FA-5696-460D-A278-9A302A0F72AE}">
+  <ds:schemaRefs>
+    <ds:schemaRef ds:uri="http://schemas.microsoft.com/sharepoint/v3/contenttype/forms"/>
+  </ds:schemaRefs>
+</ds:datastoreItem>
 </file>
 
-<file path=customXml/itemProps1.xml><?xml version="1.0" encoding="utf-8"?>
+<file path=customXml/itemProps3.xml><?xml version="1.0" encoding="utf-8"?>
 <ds:datastoreItem xmlns:ds="http://schemas.openxmlformats.org/officeDocument/2006/customXml" ds:itemID="{B9A87442-5A7B-46FD-BD28-170CE9B7256F}">
   <ds:schemaRefs>
     <ds:schemaRef ds:uri="http://schemas.microsoft.com/office/2006/metadata/contentType"/>
@@ -3372,22 +2727,4 @@
     <ds:schemaRef ds:uri="http://schemas.microsoft.com/office/internal/2005/internalDocumentation"/>
   </ds:schemaRefs>
 </ds:datastoreItem>
-</file>
-
-<file path=customXml/itemProps2.xml><?xml version="1.0" encoding="utf-8"?>
-<ds:datastoreItem xmlns:ds="http://schemas.openxmlformats.org/officeDocument/2006/customXml" ds:itemID="{13FBD2FA-5696-460D-A278-9A302A0F72AE}">
-  <ds:schemaRefs>
-    <ds:schemaRef ds:uri="http://schemas.microsoft.com/sharepoint/v3/contenttype/forms"/>
-  </ds:schemaRefs>
-</ds:datastoreItem>
-</file>
-
-<file path=customXml/itemProps3.xml><?xml version="1.0" encoding="utf-8"?>
-<ds:datastoreItem xmlns:ds="http://schemas.openxmlformats.org/officeDocument/2006/customXml" ds:itemID="{FA8F0064-303C-446D-896E-46EEB9A79DC3}">
-  <ds:schemaRefs>
-    <ds:schemaRef ds:uri="http://schemas.microsoft.com/office/2006/metadata/properties"/>
-    <ds:schemaRef ds:uri="http://schemas.microsoft.com/office/infopath/2007/PartnerControls"/>
-    <ds:schemaRef ds:uri="http://schemas.microsoft.com/sharepoint/v3"/>
-  </ds:schemaRefs>
-</ds:datastoreItem>
 </file>
</xml_diff>

<commit_message>
- Add match setup screen (MainActivity) with team name validation and explicit Intent navigation. - Implement live match control screen (MatchActivity) with score tracker and live stopwatch. - Add quick incident logging for goals, booking cards, and undo action handler. - Implement final match report screen (ReportActivity) with statistics summary banner. - Create custom EventAdapter extending BaseAdapter using ViewHolder pattern and RelativeLayout. - Add vector drawables, custom theme styles, string resources, and activity manifest declarations.
</commit_message>
<xml_diff>
--- a/Learning_diary.docx
+++ b/Learning_diary.docx
@@ -157,6 +157,2003 @@
       <w:pPr>
         <w:ind w:firstLine="708"/>
       </w:pPr>
+    </w:p>
+    <w:p>
+      <w:pPr>
+        <w:pStyle w:val="Textoindependiente"/>
+        <w:rPr>
+          <w:lang w:val="es-ES"/>
+        </w:rPr>
+      </w:pPr>
+      <w:r>
+        <w:rPr>
+          <w:lang w:val="es-ES"/>
+        </w:rPr>
+        <w:t>9.9.2026</w:t>
+      </w:r>
+    </w:p>
+    <w:p>
+      <w:pPr>
+        <w:pStyle w:val="Textoindependiente"/>
+        <w:rPr>
+          <w:lang w:val="es-ES"/>
+        </w:rPr>
+      </w:pPr>
+      <w:r>
+        <w:rPr>
+          <w:lang w:val="es-ES"/>
+        </w:rPr>
+        <w:t xml:space="preserve">I </w:t>
+      </w:r>
+      <w:proofErr w:type="spellStart"/>
+      <w:r>
+        <w:rPr>
+          <w:lang w:val="es-ES"/>
+        </w:rPr>
+        <w:t>worked</w:t>
+      </w:r>
+      <w:proofErr w:type="spellEnd"/>
+      <w:r>
+        <w:rPr>
+          <w:lang w:val="es-ES"/>
+        </w:rPr>
+        <w:t xml:space="preserve"> </w:t>
+      </w:r>
+      <w:proofErr w:type="spellStart"/>
+      <w:r>
+        <w:rPr>
+          <w:lang w:val="es-ES"/>
+        </w:rPr>
+        <w:t>on</w:t>
+      </w:r>
+      <w:proofErr w:type="spellEnd"/>
+      <w:r>
+        <w:rPr>
+          <w:lang w:val="es-ES"/>
+        </w:rPr>
+        <w:t xml:space="preserve"> Part 3 </w:t>
+      </w:r>
+      <w:proofErr w:type="spellStart"/>
+      <w:r>
+        <w:rPr>
+          <w:lang w:val="es-ES"/>
+        </w:rPr>
+        <w:t>of</w:t>
+      </w:r>
+      <w:proofErr w:type="spellEnd"/>
+      <w:r>
+        <w:rPr>
+          <w:lang w:val="es-ES"/>
+        </w:rPr>
+        <w:t xml:space="preserve"> </w:t>
+      </w:r>
+      <w:proofErr w:type="spellStart"/>
+      <w:r>
+        <w:rPr>
+          <w:lang w:val="es-ES"/>
+        </w:rPr>
+        <w:t>the</w:t>
+      </w:r>
+      <w:proofErr w:type="spellEnd"/>
+      <w:r>
+        <w:rPr>
+          <w:lang w:val="es-ES"/>
+        </w:rPr>
+        <w:t xml:space="preserve"> </w:t>
+      </w:r>
+      <w:proofErr w:type="spellStart"/>
+      <w:r>
+        <w:rPr>
+          <w:lang w:val="es-ES"/>
+        </w:rPr>
+        <w:t>course</w:t>
+      </w:r>
+      <w:proofErr w:type="spellEnd"/>
+      <w:r>
+        <w:rPr>
+          <w:lang w:val="es-ES"/>
+        </w:rPr>
+        <w:t xml:space="preserve"> </w:t>
+      </w:r>
+      <w:proofErr w:type="spellStart"/>
+      <w:r>
+        <w:rPr>
+          <w:lang w:val="es-ES"/>
+        </w:rPr>
+        <w:t>by</w:t>
+      </w:r>
+      <w:proofErr w:type="spellEnd"/>
+      <w:r>
+        <w:rPr>
+          <w:lang w:val="es-ES"/>
+        </w:rPr>
+        <w:t xml:space="preserve"> </w:t>
+      </w:r>
+      <w:proofErr w:type="spellStart"/>
+      <w:r>
+        <w:rPr>
+          <w:lang w:val="es-ES"/>
+        </w:rPr>
+        <w:t>building</w:t>
+      </w:r>
+      <w:proofErr w:type="spellEnd"/>
+      <w:r>
+        <w:rPr>
+          <w:lang w:val="es-ES"/>
+        </w:rPr>
+        <w:t xml:space="preserve"> a </w:t>
+      </w:r>
+      <w:proofErr w:type="spellStart"/>
+      <w:r>
+        <w:rPr>
+          <w:lang w:val="es-ES"/>
+        </w:rPr>
+        <w:t>standalone</w:t>
+      </w:r>
+      <w:proofErr w:type="spellEnd"/>
+      <w:r>
+        <w:rPr>
+          <w:lang w:val="es-ES"/>
+        </w:rPr>
+        <w:t xml:space="preserve"> </w:t>
+      </w:r>
+      <w:proofErr w:type="spellStart"/>
+      <w:r>
+        <w:rPr>
+          <w:lang w:val="es-ES"/>
+        </w:rPr>
+        <w:t>project</w:t>
+      </w:r>
+      <w:proofErr w:type="spellEnd"/>
+      <w:r>
+        <w:rPr>
+          <w:lang w:val="es-ES"/>
+        </w:rPr>
+        <w:t xml:space="preserve"> </w:t>
+      </w:r>
+      <w:proofErr w:type="spellStart"/>
+      <w:r>
+        <w:rPr>
+          <w:lang w:val="es-ES"/>
+        </w:rPr>
+        <w:t>called</w:t>
+      </w:r>
+      <w:proofErr w:type="spellEnd"/>
+      <w:r>
+        <w:rPr>
+          <w:lang w:val="es-ES"/>
+        </w:rPr>
+        <w:t xml:space="preserve"> "</w:t>
+      </w:r>
+      <w:proofErr w:type="spellStart"/>
+      <w:r>
+        <w:rPr>
+          <w:lang w:val="es-ES"/>
+        </w:rPr>
+        <w:t>Activity</w:t>
+      </w:r>
+      <w:proofErr w:type="spellEnd"/>
+      <w:r>
+        <w:rPr>
+          <w:lang w:val="es-ES"/>
+        </w:rPr>
+        <w:t xml:space="preserve"> 3" </w:t>
+      </w:r>
+      <w:proofErr w:type="spellStart"/>
+      <w:r>
+        <w:rPr>
+          <w:lang w:val="es-ES"/>
+        </w:rPr>
+        <w:t>inside</w:t>
+      </w:r>
+      <w:proofErr w:type="spellEnd"/>
+      <w:r>
+        <w:rPr>
+          <w:lang w:val="es-ES"/>
+        </w:rPr>
+        <w:t xml:space="preserve"> </w:t>
+      </w:r>
+      <w:proofErr w:type="spellStart"/>
+      <w:r>
+        <w:rPr>
+          <w:lang w:val="es-ES"/>
+        </w:rPr>
+        <w:t>my</w:t>
+      </w:r>
+      <w:proofErr w:type="spellEnd"/>
+      <w:r>
+        <w:rPr>
+          <w:lang w:val="es-ES"/>
+        </w:rPr>
+        <w:t xml:space="preserve"> </w:t>
+      </w:r>
+      <w:proofErr w:type="spellStart"/>
+      <w:r>
+        <w:rPr>
+          <w:lang w:val="es-ES"/>
+        </w:rPr>
+        <w:t>coursework</w:t>
+      </w:r>
+      <w:proofErr w:type="spellEnd"/>
+      <w:r>
+        <w:rPr>
+          <w:lang w:val="es-ES"/>
+        </w:rPr>
+        <w:t xml:space="preserve"> </w:t>
+      </w:r>
+      <w:proofErr w:type="spellStart"/>
+      <w:r>
+        <w:rPr>
+          <w:lang w:val="es-ES"/>
+        </w:rPr>
+        <w:t>directory</w:t>
+      </w:r>
+      <w:proofErr w:type="spellEnd"/>
+      <w:r>
+        <w:rPr>
+          <w:lang w:val="es-ES"/>
+        </w:rPr>
+        <w:t xml:space="preserve">. The </w:t>
+      </w:r>
+      <w:proofErr w:type="spellStart"/>
+      <w:r>
+        <w:rPr>
+          <w:lang w:val="es-ES"/>
+        </w:rPr>
+        <w:t>goal</w:t>
+      </w:r>
+      <w:proofErr w:type="spellEnd"/>
+      <w:r>
+        <w:rPr>
+          <w:lang w:val="es-ES"/>
+        </w:rPr>
+        <w:t xml:space="preserve"> </w:t>
+      </w:r>
+      <w:proofErr w:type="spellStart"/>
+      <w:r>
+        <w:rPr>
+          <w:lang w:val="es-ES"/>
+        </w:rPr>
+        <w:t>of</w:t>
+      </w:r>
+      <w:proofErr w:type="spellEnd"/>
+      <w:r>
+        <w:rPr>
+          <w:lang w:val="es-ES"/>
+        </w:rPr>
+        <w:t xml:space="preserve"> </w:t>
+      </w:r>
+      <w:proofErr w:type="spellStart"/>
+      <w:r>
+        <w:rPr>
+          <w:lang w:val="es-ES"/>
+        </w:rPr>
+        <w:t>this</w:t>
+      </w:r>
+      <w:proofErr w:type="spellEnd"/>
+      <w:r>
+        <w:rPr>
+          <w:lang w:val="es-ES"/>
+        </w:rPr>
+        <w:t xml:space="preserve"> </w:t>
+      </w:r>
+      <w:proofErr w:type="spellStart"/>
+      <w:r>
+        <w:rPr>
+          <w:lang w:val="es-ES"/>
+        </w:rPr>
+        <w:t>application</w:t>
+      </w:r>
+      <w:proofErr w:type="spellEnd"/>
+      <w:r>
+        <w:rPr>
+          <w:lang w:val="es-ES"/>
+        </w:rPr>
+        <w:t xml:space="preserve"> </w:t>
+      </w:r>
+      <w:proofErr w:type="spellStart"/>
+      <w:r>
+        <w:rPr>
+          <w:lang w:val="es-ES"/>
+        </w:rPr>
+        <w:t>was</w:t>
+      </w:r>
+      <w:proofErr w:type="spellEnd"/>
+      <w:r>
+        <w:rPr>
+          <w:lang w:val="es-ES"/>
+        </w:rPr>
+        <w:t xml:space="preserve"> </w:t>
+      </w:r>
+      <w:proofErr w:type="spellStart"/>
+      <w:r>
+        <w:rPr>
+          <w:lang w:val="es-ES"/>
+        </w:rPr>
+        <w:t>to</w:t>
+      </w:r>
+      <w:proofErr w:type="spellEnd"/>
+      <w:r>
+        <w:rPr>
+          <w:lang w:val="es-ES"/>
+        </w:rPr>
+        <w:t xml:space="preserve"> </w:t>
+      </w:r>
+      <w:proofErr w:type="spellStart"/>
+      <w:r>
+        <w:rPr>
+          <w:lang w:val="es-ES"/>
+        </w:rPr>
+        <w:t>create</w:t>
+      </w:r>
+      <w:proofErr w:type="spellEnd"/>
+      <w:r>
+        <w:rPr>
+          <w:lang w:val="es-ES"/>
+        </w:rPr>
+        <w:t xml:space="preserve"> a </w:t>
+      </w:r>
+      <w:proofErr w:type="spellStart"/>
+      <w:r>
+        <w:rPr>
+          <w:lang w:val="es-ES"/>
+        </w:rPr>
+        <w:t>structured</w:t>
+      </w:r>
+      <w:proofErr w:type="spellEnd"/>
+      <w:r>
+        <w:rPr>
+          <w:lang w:val="es-ES"/>
+        </w:rPr>
+        <w:t xml:space="preserve"> </w:t>
+      </w:r>
+      <w:proofErr w:type="spellStart"/>
+      <w:r>
+        <w:rPr>
+          <w:lang w:val="es-ES"/>
+        </w:rPr>
+        <w:t>product</w:t>
+      </w:r>
+      <w:proofErr w:type="spellEnd"/>
+      <w:r>
+        <w:rPr>
+          <w:lang w:val="es-ES"/>
+        </w:rPr>
+        <w:t xml:space="preserve"> </w:t>
+      </w:r>
+      <w:proofErr w:type="spellStart"/>
+      <w:r>
+        <w:rPr>
+          <w:lang w:val="es-ES"/>
+        </w:rPr>
+        <w:t>list</w:t>
+      </w:r>
+      <w:proofErr w:type="spellEnd"/>
+      <w:r>
+        <w:rPr>
+          <w:lang w:val="es-ES"/>
+        </w:rPr>
+        <w:t xml:space="preserve"> and </w:t>
+      </w:r>
+      <w:proofErr w:type="spellStart"/>
+      <w:r>
+        <w:rPr>
+          <w:lang w:val="es-ES"/>
+        </w:rPr>
+        <w:t>display</w:t>
+      </w:r>
+      <w:proofErr w:type="spellEnd"/>
+      <w:r>
+        <w:rPr>
+          <w:lang w:val="es-ES"/>
+        </w:rPr>
+        <w:t xml:space="preserve"> </w:t>
+      </w:r>
+      <w:proofErr w:type="spellStart"/>
+      <w:r>
+        <w:rPr>
+          <w:lang w:val="es-ES"/>
+        </w:rPr>
+        <w:t>dynamic</w:t>
+      </w:r>
+      <w:proofErr w:type="spellEnd"/>
+      <w:r>
+        <w:rPr>
+          <w:lang w:val="es-ES"/>
+        </w:rPr>
+        <w:t xml:space="preserve"> </w:t>
+      </w:r>
+      <w:proofErr w:type="spellStart"/>
+      <w:r>
+        <w:rPr>
+          <w:lang w:val="es-ES"/>
+        </w:rPr>
+        <w:t>detail</w:t>
+      </w:r>
+      <w:proofErr w:type="spellEnd"/>
+      <w:r>
+        <w:rPr>
+          <w:lang w:val="es-ES"/>
+        </w:rPr>
+        <w:t xml:space="preserve"> </w:t>
+      </w:r>
+      <w:proofErr w:type="spellStart"/>
+      <w:r>
+        <w:rPr>
+          <w:lang w:val="es-ES"/>
+        </w:rPr>
+        <w:t>screens</w:t>
+      </w:r>
+      <w:proofErr w:type="spellEnd"/>
+      <w:r>
+        <w:rPr>
+          <w:lang w:val="es-ES"/>
+        </w:rPr>
+        <w:t xml:space="preserve"> </w:t>
+      </w:r>
+      <w:proofErr w:type="spellStart"/>
+      <w:r>
+        <w:rPr>
+          <w:lang w:val="es-ES"/>
+        </w:rPr>
+        <w:t>with</w:t>
+      </w:r>
+      <w:proofErr w:type="spellEnd"/>
+      <w:r>
+        <w:rPr>
+          <w:lang w:val="es-ES"/>
+        </w:rPr>
+        <w:t xml:space="preserve"> </w:t>
+      </w:r>
+      <w:proofErr w:type="spellStart"/>
+      <w:r>
+        <w:rPr>
+          <w:lang w:val="es-ES"/>
+        </w:rPr>
+        <w:t>scaled</w:t>
+      </w:r>
+      <w:proofErr w:type="spellEnd"/>
+      <w:r>
+        <w:rPr>
+          <w:lang w:val="es-ES"/>
+        </w:rPr>
+        <w:t xml:space="preserve"> </w:t>
+      </w:r>
+      <w:proofErr w:type="spellStart"/>
+      <w:r>
+        <w:rPr>
+          <w:lang w:val="es-ES"/>
+        </w:rPr>
+        <w:t>images</w:t>
+      </w:r>
+      <w:proofErr w:type="spellEnd"/>
+      <w:r>
+        <w:rPr>
+          <w:lang w:val="es-ES"/>
+        </w:rPr>
+        <w:t>.</w:t>
+      </w:r>
+    </w:p>
+    <w:p>
+      <w:pPr>
+        <w:pStyle w:val="Textoindependiente"/>
+        <w:rPr>
+          <w:lang w:val="es-ES"/>
+        </w:rPr>
+      </w:pPr>
+      <w:r>
+        <w:rPr>
+          <w:lang w:val="es-ES"/>
+        </w:rPr>
+        <w:lastRenderedPageBreak/>
+        <w:t xml:space="preserve">First, I </w:t>
+      </w:r>
+      <w:proofErr w:type="spellStart"/>
+      <w:r>
+        <w:rPr>
+          <w:lang w:val="es-ES"/>
+        </w:rPr>
+        <w:t>created</w:t>
+      </w:r>
+      <w:proofErr w:type="spellEnd"/>
+      <w:r>
+        <w:rPr>
+          <w:lang w:val="es-ES"/>
+        </w:rPr>
+        <w:t xml:space="preserve"> </w:t>
+      </w:r>
+      <w:proofErr w:type="spellStart"/>
+      <w:r>
+        <w:rPr>
+          <w:lang w:val="es-ES"/>
+        </w:rPr>
+        <w:t>three</w:t>
+      </w:r>
+      <w:proofErr w:type="spellEnd"/>
+      <w:r>
+        <w:rPr>
+          <w:lang w:val="es-ES"/>
+        </w:rPr>
+        <w:t xml:space="preserve"> </w:t>
+      </w:r>
+      <w:proofErr w:type="spellStart"/>
+      <w:r>
+        <w:rPr>
+          <w:lang w:val="es-ES"/>
+        </w:rPr>
+        <w:t>parallel</w:t>
+      </w:r>
+      <w:proofErr w:type="spellEnd"/>
+      <w:r>
+        <w:rPr>
+          <w:lang w:val="es-ES"/>
+        </w:rPr>
+        <w:t xml:space="preserve"> </w:t>
+      </w:r>
+      <w:proofErr w:type="spellStart"/>
+      <w:r>
+        <w:rPr>
+          <w:lang w:val="es-ES"/>
+        </w:rPr>
+        <w:t>string</w:t>
+      </w:r>
+      <w:proofErr w:type="spellEnd"/>
+      <w:r>
+        <w:rPr>
+          <w:lang w:val="es-ES"/>
+        </w:rPr>
+        <w:t xml:space="preserve"> </w:t>
+      </w:r>
+      <w:proofErr w:type="spellStart"/>
+      <w:r>
+        <w:rPr>
+          <w:lang w:val="es-ES"/>
+        </w:rPr>
+        <w:t>arrays</w:t>
+      </w:r>
+      <w:proofErr w:type="spellEnd"/>
+      <w:r>
+        <w:rPr>
+          <w:lang w:val="es-ES"/>
+        </w:rPr>
+        <w:t xml:space="preserve"> in strings.xml </w:t>
+      </w:r>
+      <w:proofErr w:type="spellStart"/>
+      <w:r>
+        <w:rPr>
+          <w:lang w:val="es-ES"/>
+        </w:rPr>
+        <w:t>to</w:t>
+      </w:r>
+      <w:proofErr w:type="spellEnd"/>
+      <w:r>
+        <w:rPr>
+          <w:lang w:val="es-ES"/>
+        </w:rPr>
+        <w:t xml:space="preserve"> store </w:t>
+      </w:r>
+      <w:proofErr w:type="spellStart"/>
+      <w:r>
+        <w:rPr>
+          <w:lang w:val="es-ES"/>
+        </w:rPr>
+        <w:t>item</w:t>
+      </w:r>
+      <w:proofErr w:type="spellEnd"/>
+      <w:r>
+        <w:rPr>
+          <w:lang w:val="es-ES"/>
+        </w:rPr>
+        <w:t xml:space="preserve"> </w:t>
+      </w:r>
+      <w:proofErr w:type="spellStart"/>
+      <w:r>
+        <w:rPr>
+          <w:lang w:val="es-ES"/>
+        </w:rPr>
+        <w:t>names</w:t>
+      </w:r>
+      <w:proofErr w:type="spellEnd"/>
+      <w:r>
+        <w:rPr>
+          <w:lang w:val="es-ES"/>
+        </w:rPr>
+        <w:t xml:space="preserve">, </w:t>
+      </w:r>
+      <w:proofErr w:type="spellStart"/>
+      <w:r>
+        <w:rPr>
+          <w:lang w:val="es-ES"/>
+        </w:rPr>
+        <w:t>prices</w:t>
+      </w:r>
+      <w:proofErr w:type="spellEnd"/>
+      <w:r>
+        <w:rPr>
+          <w:lang w:val="es-ES"/>
+        </w:rPr>
+        <w:t xml:space="preserve">, and </w:t>
+      </w:r>
+      <w:proofErr w:type="spellStart"/>
+      <w:r>
+        <w:rPr>
+          <w:lang w:val="es-ES"/>
+        </w:rPr>
+        <w:t>descriptions</w:t>
+      </w:r>
+      <w:proofErr w:type="spellEnd"/>
+      <w:r>
+        <w:rPr>
+          <w:lang w:val="es-ES"/>
+        </w:rPr>
+        <w:t xml:space="preserve">. </w:t>
+      </w:r>
+      <w:proofErr w:type="spellStart"/>
+      <w:r>
+        <w:rPr>
+          <w:lang w:val="es-ES"/>
+        </w:rPr>
+        <w:t>To</w:t>
+      </w:r>
+      <w:proofErr w:type="spellEnd"/>
+      <w:r>
+        <w:rPr>
+          <w:lang w:val="es-ES"/>
+        </w:rPr>
+        <w:t xml:space="preserve"> </w:t>
+      </w:r>
+      <w:proofErr w:type="spellStart"/>
+      <w:r>
+        <w:rPr>
+          <w:lang w:val="es-ES"/>
+        </w:rPr>
+        <w:t>display</w:t>
+      </w:r>
+      <w:proofErr w:type="spellEnd"/>
+      <w:r>
+        <w:rPr>
+          <w:lang w:val="es-ES"/>
+        </w:rPr>
+        <w:t xml:space="preserve"> </w:t>
+      </w:r>
+      <w:proofErr w:type="spellStart"/>
+      <w:r>
+        <w:rPr>
+          <w:lang w:val="es-ES"/>
+        </w:rPr>
+        <w:t>this</w:t>
+      </w:r>
+      <w:proofErr w:type="spellEnd"/>
+      <w:r>
+        <w:rPr>
+          <w:lang w:val="es-ES"/>
+        </w:rPr>
+        <w:t xml:space="preserve"> data </w:t>
+      </w:r>
+      <w:proofErr w:type="spellStart"/>
+      <w:r>
+        <w:rPr>
+          <w:lang w:val="es-ES"/>
+        </w:rPr>
+        <w:t>properly</w:t>
+      </w:r>
+      <w:proofErr w:type="spellEnd"/>
+      <w:r>
+        <w:rPr>
+          <w:lang w:val="es-ES"/>
+        </w:rPr>
+        <w:t xml:space="preserve">, I </w:t>
+      </w:r>
+      <w:proofErr w:type="spellStart"/>
+      <w:r>
+        <w:rPr>
+          <w:lang w:val="es-ES"/>
+        </w:rPr>
+        <w:t>designed</w:t>
+      </w:r>
+      <w:proofErr w:type="spellEnd"/>
+      <w:r>
+        <w:rPr>
+          <w:lang w:val="es-ES"/>
+        </w:rPr>
+        <w:t xml:space="preserve"> a </w:t>
+      </w:r>
+      <w:proofErr w:type="spellStart"/>
+      <w:r>
+        <w:rPr>
+          <w:lang w:val="es-ES"/>
+        </w:rPr>
+        <w:t>custom</w:t>
+      </w:r>
+      <w:proofErr w:type="spellEnd"/>
+      <w:r>
+        <w:rPr>
+          <w:lang w:val="es-ES"/>
+        </w:rPr>
+        <w:t xml:space="preserve"> </w:t>
+      </w:r>
+      <w:proofErr w:type="spellStart"/>
+      <w:r>
+        <w:rPr>
+          <w:lang w:val="es-ES"/>
+        </w:rPr>
+        <w:t>row</w:t>
+      </w:r>
+      <w:proofErr w:type="spellEnd"/>
+      <w:r>
+        <w:rPr>
+          <w:lang w:val="es-ES"/>
+        </w:rPr>
+        <w:t xml:space="preserve"> </w:t>
+      </w:r>
+      <w:proofErr w:type="spellStart"/>
+      <w:r>
+        <w:rPr>
+          <w:lang w:val="es-ES"/>
+        </w:rPr>
+        <w:t>layout</w:t>
+      </w:r>
+      <w:proofErr w:type="spellEnd"/>
+      <w:r>
+        <w:rPr>
+          <w:lang w:val="es-ES"/>
+        </w:rPr>
+        <w:t xml:space="preserve"> </w:t>
+      </w:r>
+      <w:proofErr w:type="spellStart"/>
+      <w:r>
+        <w:rPr>
+          <w:lang w:val="es-ES"/>
+        </w:rPr>
+        <w:t>using</w:t>
+      </w:r>
+      <w:proofErr w:type="spellEnd"/>
+      <w:r>
+        <w:rPr>
+          <w:lang w:val="es-ES"/>
+        </w:rPr>
+        <w:t xml:space="preserve"> </w:t>
+      </w:r>
+      <w:proofErr w:type="spellStart"/>
+      <w:r>
+        <w:rPr>
+          <w:lang w:val="es-ES"/>
+        </w:rPr>
+        <w:t>RelativeLayout</w:t>
+      </w:r>
+      <w:proofErr w:type="spellEnd"/>
+      <w:r>
+        <w:rPr>
+          <w:lang w:val="es-ES"/>
+        </w:rPr>
+        <w:t xml:space="preserve"> (my_list_view_detail.xml) </w:t>
+      </w:r>
+      <w:proofErr w:type="spellStart"/>
+      <w:r>
+        <w:rPr>
+          <w:lang w:val="es-ES"/>
+        </w:rPr>
+        <w:t>with</w:t>
+      </w:r>
+      <w:proofErr w:type="spellEnd"/>
+      <w:r>
+        <w:rPr>
+          <w:lang w:val="es-ES"/>
+        </w:rPr>
+        <w:t xml:space="preserve"> </w:t>
+      </w:r>
+      <w:proofErr w:type="spellStart"/>
+      <w:r>
+        <w:rPr>
+          <w:lang w:val="es-ES"/>
+        </w:rPr>
+        <w:t>multiple</w:t>
+      </w:r>
+      <w:proofErr w:type="spellEnd"/>
+      <w:r>
+        <w:rPr>
+          <w:lang w:val="es-ES"/>
+        </w:rPr>
+        <w:t xml:space="preserve"> </w:t>
+      </w:r>
+      <w:proofErr w:type="spellStart"/>
+      <w:r>
+        <w:rPr>
+          <w:lang w:val="es-ES"/>
+        </w:rPr>
+        <w:t>TextView</w:t>
+      </w:r>
+      <w:proofErr w:type="spellEnd"/>
+      <w:r>
+        <w:rPr>
+          <w:lang w:val="es-ES"/>
+        </w:rPr>
+        <w:t xml:space="preserve"> </w:t>
+      </w:r>
+      <w:proofErr w:type="spellStart"/>
+      <w:r>
+        <w:rPr>
+          <w:lang w:val="es-ES"/>
+        </w:rPr>
+        <w:t>components</w:t>
+      </w:r>
+      <w:proofErr w:type="spellEnd"/>
+      <w:r>
+        <w:rPr>
+          <w:lang w:val="es-ES"/>
+        </w:rPr>
+        <w:t xml:space="preserve">. Then, I </w:t>
+      </w:r>
+      <w:proofErr w:type="spellStart"/>
+      <w:r>
+        <w:rPr>
+          <w:lang w:val="es-ES"/>
+        </w:rPr>
+        <w:t>implemented</w:t>
+      </w:r>
+      <w:proofErr w:type="spellEnd"/>
+      <w:r>
+        <w:rPr>
+          <w:lang w:val="es-ES"/>
+        </w:rPr>
+        <w:t xml:space="preserve"> a </w:t>
+      </w:r>
+      <w:proofErr w:type="spellStart"/>
+      <w:r>
+        <w:rPr>
+          <w:lang w:val="es-ES"/>
+        </w:rPr>
+        <w:t>custom</w:t>
+      </w:r>
+      <w:proofErr w:type="spellEnd"/>
+      <w:r>
+        <w:rPr>
+          <w:lang w:val="es-ES"/>
+        </w:rPr>
+        <w:t xml:space="preserve"> </w:t>
+      </w:r>
+      <w:proofErr w:type="spellStart"/>
+      <w:r>
+        <w:rPr>
+          <w:lang w:val="es-ES"/>
+        </w:rPr>
+        <w:t>adapter</w:t>
+      </w:r>
+      <w:proofErr w:type="spellEnd"/>
+      <w:r>
+        <w:rPr>
+          <w:lang w:val="es-ES"/>
+        </w:rPr>
+        <w:t xml:space="preserve"> </w:t>
+      </w:r>
+      <w:proofErr w:type="spellStart"/>
+      <w:r>
+        <w:rPr>
+          <w:lang w:val="es-ES"/>
+        </w:rPr>
+        <w:t>extending</w:t>
+      </w:r>
+      <w:proofErr w:type="spellEnd"/>
+      <w:r>
+        <w:rPr>
+          <w:lang w:val="es-ES"/>
+        </w:rPr>
+        <w:t xml:space="preserve"> </w:t>
+      </w:r>
+      <w:proofErr w:type="spellStart"/>
+      <w:r>
+        <w:rPr>
+          <w:lang w:val="es-ES"/>
+        </w:rPr>
+        <w:t>BaseAdapter</w:t>
+      </w:r>
+      <w:proofErr w:type="spellEnd"/>
+      <w:r>
+        <w:rPr>
+          <w:lang w:val="es-ES"/>
+        </w:rPr>
+        <w:t xml:space="preserve"> (</w:t>
+      </w:r>
+      <w:proofErr w:type="spellStart"/>
+      <w:r>
+        <w:rPr>
+          <w:lang w:val="es-ES"/>
+        </w:rPr>
+        <w:t>ItemAdapter</w:t>
+      </w:r>
+      <w:proofErr w:type="spellEnd"/>
+      <w:r>
+        <w:rPr>
+          <w:lang w:val="es-ES"/>
+        </w:rPr>
+        <w:t xml:space="preserve">) </w:t>
+      </w:r>
+      <w:proofErr w:type="spellStart"/>
+      <w:r>
+        <w:rPr>
+          <w:lang w:val="es-ES"/>
+        </w:rPr>
+        <w:t>to</w:t>
+      </w:r>
+      <w:proofErr w:type="spellEnd"/>
+      <w:r>
+        <w:rPr>
+          <w:lang w:val="es-ES"/>
+        </w:rPr>
+        <w:t xml:space="preserve"> </w:t>
+      </w:r>
+      <w:proofErr w:type="spellStart"/>
+      <w:r>
+        <w:rPr>
+          <w:lang w:val="es-ES"/>
+        </w:rPr>
+        <w:t>bind</w:t>
+      </w:r>
+      <w:proofErr w:type="spellEnd"/>
+      <w:r>
+        <w:rPr>
+          <w:lang w:val="es-ES"/>
+        </w:rPr>
+        <w:t xml:space="preserve"> </w:t>
+      </w:r>
+      <w:proofErr w:type="spellStart"/>
+      <w:r>
+        <w:rPr>
+          <w:lang w:val="es-ES"/>
+        </w:rPr>
+        <w:t>each</w:t>
+      </w:r>
+      <w:proofErr w:type="spellEnd"/>
+      <w:r>
+        <w:rPr>
+          <w:lang w:val="es-ES"/>
+        </w:rPr>
+        <w:t xml:space="preserve"> </w:t>
+      </w:r>
+      <w:proofErr w:type="spellStart"/>
+      <w:r>
+        <w:rPr>
+          <w:lang w:val="es-ES"/>
+        </w:rPr>
+        <w:t>item's</w:t>
+      </w:r>
+      <w:proofErr w:type="spellEnd"/>
+      <w:r>
+        <w:rPr>
+          <w:lang w:val="es-ES"/>
+        </w:rPr>
+        <w:t xml:space="preserve"> data </w:t>
+      </w:r>
+      <w:proofErr w:type="spellStart"/>
+      <w:r>
+        <w:rPr>
+          <w:lang w:val="es-ES"/>
+        </w:rPr>
+        <w:t>to</w:t>
+      </w:r>
+      <w:proofErr w:type="spellEnd"/>
+      <w:r>
+        <w:rPr>
+          <w:lang w:val="es-ES"/>
+        </w:rPr>
+        <w:t xml:space="preserve"> </w:t>
+      </w:r>
+      <w:proofErr w:type="spellStart"/>
+      <w:r>
+        <w:rPr>
+          <w:lang w:val="es-ES"/>
+        </w:rPr>
+        <w:t>its</w:t>
+      </w:r>
+      <w:proofErr w:type="spellEnd"/>
+      <w:r>
+        <w:rPr>
+          <w:lang w:val="es-ES"/>
+        </w:rPr>
+        <w:t xml:space="preserve"> </w:t>
+      </w:r>
+      <w:proofErr w:type="spellStart"/>
+      <w:r>
+        <w:rPr>
+          <w:lang w:val="es-ES"/>
+        </w:rPr>
+        <w:t>corresponding</w:t>
+      </w:r>
+      <w:proofErr w:type="spellEnd"/>
+      <w:r>
+        <w:rPr>
+          <w:lang w:val="es-ES"/>
+        </w:rPr>
+        <w:t xml:space="preserve"> </w:t>
+      </w:r>
+      <w:proofErr w:type="spellStart"/>
+      <w:r>
+        <w:rPr>
+          <w:lang w:val="es-ES"/>
+        </w:rPr>
+        <w:t>view</w:t>
+      </w:r>
+      <w:proofErr w:type="spellEnd"/>
+      <w:r>
+        <w:rPr>
+          <w:lang w:val="es-ES"/>
+        </w:rPr>
+        <w:t xml:space="preserve"> </w:t>
+      </w:r>
+      <w:proofErr w:type="spellStart"/>
+      <w:r>
+        <w:rPr>
+          <w:lang w:val="es-ES"/>
+        </w:rPr>
+        <w:t>using</w:t>
+      </w:r>
+      <w:proofErr w:type="spellEnd"/>
+      <w:r>
+        <w:rPr>
+          <w:lang w:val="es-ES"/>
+        </w:rPr>
+        <w:t xml:space="preserve"> a </w:t>
+      </w:r>
+      <w:proofErr w:type="spellStart"/>
+      <w:r>
+        <w:rPr>
+          <w:lang w:val="es-ES"/>
+        </w:rPr>
+        <w:t>LayoutInflater</w:t>
+      </w:r>
+      <w:proofErr w:type="spellEnd"/>
+      <w:r>
+        <w:rPr>
+          <w:lang w:val="es-ES"/>
+        </w:rPr>
+        <w:t>.</w:t>
+      </w:r>
+    </w:p>
+    <w:p>
+      <w:pPr>
+        <w:pStyle w:val="Textoindependiente"/>
+        <w:rPr>
+          <w:lang w:val="es-ES"/>
+        </w:rPr>
+      </w:pPr>
+      <w:r>
+        <w:rPr>
+          <w:lang w:val="es-ES"/>
+        </w:rPr>
+        <w:t xml:space="preserve">Next, I </w:t>
+      </w:r>
+      <w:proofErr w:type="spellStart"/>
+      <w:r>
+        <w:rPr>
+          <w:lang w:val="es-ES"/>
+        </w:rPr>
+        <w:t>handled</w:t>
+      </w:r>
+      <w:proofErr w:type="spellEnd"/>
+      <w:r>
+        <w:rPr>
+          <w:lang w:val="es-ES"/>
+        </w:rPr>
+        <w:t xml:space="preserve"> </w:t>
+      </w:r>
+      <w:proofErr w:type="spellStart"/>
+      <w:r>
+        <w:rPr>
+          <w:lang w:val="es-ES"/>
+        </w:rPr>
+        <w:t>user</w:t>
+      </w:r>
+      <w:proofErr w:type="spellEnd"/>
+      <w:r>
+        <w:rPr>
+          <w:lang w:val="es-ES"/>
+        </w:rPr>
+        <w:t xml:space="preserve"> </w:t>
+      </w:r>
+      <w:proofErr w:type="spellStart"/>
+      <w:r>
+        <w:rPr>
+          <w:lang w:val="es-ES"/>
+        </w:rPr>
+        <w:t>interaction</w:t>
+      </w:r>
+      <w:proofErr w:type="spellEnd"/>
+      <w:r>
+        <w:rPr>
+          <w:lang w:val="es-ES"/>
+        </w:rPr>
+        <w:t xml:space="preserve"> </w:t>
+      </w:r>
+      <w:proofErr w:type="spellStart"/>
+      <w:r>
+        <w:rPr>
+          <w:lang w:val="es-ES"/>
+        </w:rPr>
+        <w:t>by</w:t>
+      </w:r>
+      <w:proofErr w:type="spellEnd"/>
+      <w:r>
+        <w:rPr>
+          <w:lang w:val="es-ES"/>
+        </w:rPr>
+        <w:t xml:space="preserve"> </w:t>
+      </w:r>
+      <w:proofErr w:type="spellStart"/>
+      <w:r>
+        <w:rPr>
+          <w:lang w:val="es-ES"/>
+        </w:rPr>
+        <w:t>attaching</w:t>
+      </w:r>
+      <w:proofErr w:type="spellEnd"/>
+      <w:r>
+        <w:rPr>
+          <w:lang w:val="es-ES"/>
+        </w:rPr>
+        <w:t xml:space="preserve"> </w:t>
+      </w:r>
+      <w:proofErr w:type="spellStart"/>
+      <w:r>
+        <w:rPr>
+          <w:lang w:val="es-ES"/>
+        </w:rPr>
+        <w:t>an</w:t>
+      </w:r>
+      <w:proofErr w:type="spellEnd"/>
+      <w:r>
+        <w:rPr>
+          <w:lang w:val="es-ES"/>
+        </w:rPr>
+        <w:t xml:space="preserve"> </w:t>
+      </w:r>
+      <w:proofErr w:type="spellStart"/>
+      <w:r>
+        <w:rPr>
+          <w:lang w:val="es-ES"/>
+        </w:rPr>
+        <w:t>OnItemClickListener</w:t>
+      </w:r>
+      <w:proofErr w:type="spellEnd"/>
+      <w:r>
+        <w:rPr>
+          <w:lang w:val="es-ES"/>
+        </w:rPr>
+        <w:t xml:space="preserve"> </w:t>
+      </w:r>
+      <w:proofErr w:type="spellStart"/>
+      <w:r>
+        <w:rPr>
+          <w:lang w:val="es-ES"/>
+        </w:rPr>
+        <w:t>to</w:t>
+      </w:r>
+      <w:proofErr w:type="spellEnd"/>
+      <w:r>
+        <w:rPr>
+          <w:lang w:val="es-ES"/>
+        </w:rPr>
+        <w:t xml:space="preserve"> </w:t>
+      </w:r>
+      <w:proofErr w:type="spellStart"/>
+      <w:r>
+        <w:rPr>
+          <w:lang w:val="es-ES"/>
+        </w:rPr>
+        <w:t>the</w:t>
+      </w:r>
+      <w:proofErr w:type="spellEnd"/>
+      <w:r>
+        <w:rPr>
+          <w:lang w:val="es-ES"/>
+        </w:rPr>
+        <w:t xml:space="preserve"> </w:t>
+      </w:r>
+      <w:proofErr w:type="spellStart"/>
+      <w:r>
+        <w:rPr>
+          <w:lang w:val="es-ES"/>
+        </w:rPr>
+        <w:t>ListView</w:t>
+      </w:r>
+      <w:proofErr w:type="spellEnd"/>
+      <w:r>
+        <w:rPr>
+          <w:lang w:val="es-ES"/>
+        </w:rPr>
+        <w:t xml:space="preserve">. </w:t>
+      </w:r>
+      <w:proofErr w:type="spellStart"/>
+      <w:r>
+        <w:rPr>
+          <w:lang w:val="es-ES"/>
+        </w:rPr>
+        <w:t>When</w:t>
+      </w:r>
+      <w:proofErr w:type="spellEnd"/>
+      <w:r>
+        <w:rPr>
+          <w:lang w:val="es-ES"/>
+        </w:rPr>
+        <w:t xml:space="preserve"> </w:t>
+      </w:r>
+      <w:proofErr w:type="spellStart"/>
+      <w:r>
+        <w:rPr>
+          <w:lang w:val="es-ES"/>
+        </w:rPr>
+        <w:t>an</w:t>
+      </w:r>
+      <w:proofErr w:type="spellEnd"/>
+      <w:r>
+        <w:rPr>
+          <w:lang w:val="es-ES"/>
+        </w:rPr>
+        <w:t xml:space="preserve"> </w:t>
+      </w:r>
+      <w:proofErr w:type="spellStart"/>
+      <w:r>
+        <w:rPr>
+          <w:lang w:val="es-ES"/>
+        </w:rPr>
+        <w:t>item</w:t>
+      </w:r>
+      <w:proofErr w:type="spellEnd"/>
+      <w:r>
+        <w:rPr>
+          <w:lang w:val="es-ES"/>
+        </w:rPr>
+        <w:t xml:space="preserve"> </w:t>
+      </w:r>
+      <w:proofErr w:type="spellStart"/>
+      <w:r>
+        <w:rPr>
+          <w:lang w:val="es-ES"/>
+        </w:rPr>
+        <w:t>is</w:t>
+      </w:r>
+      <w:proofErr w:type="spellEnd"/>
+      <w:r>
+        <w:rPr>
+          <w:lang w:val="es-ES"/>
+        </w:rPr>
+        <w:t xml:space="preserve"> </w:t>
+      </w:r>
+      <w:proofErr w:type="spellStart"/>
+      <w:r>
+        <w:rPr>
+          <w:lang w:val="es-ES"/>
+        </w:rPr>
+        <w:t>selected</w:t>
+      </w:r>
+      <w:proofErr w:type="spellEnd"/>
+      <w:r>
+        <w:rPr>
+          <w:lang w:val="es-ES"/>
+        </w:rPr>
+        <w:t xml:space="preserve">, </w:t>
+      </w:r>
+      <w:proofErr w:type="spellStart"/>
+      <w:r>
+        <w:rPr>
+          <w:lang w:val="es-ES"/>
+        </w:rPr>
+        <w:t>an</w:t>
+      </w:r>
+      <w:proofErr w:type="spellEnd"/>
+      <w:r>
+        <w:rPr>
+          <w:lang w:val="es-ES"/>
+        </w:rPr>
+        <w:t xml:space="preserve"> </w:t>
+      </w:r>
+      <w:proofErr w:type="spellStart"/>
+      <w:r>
+        <w:rPr>
+          <w:lang w:val="es-ES"/>
+        </w:rPr>
+        <w:t>explicit</w:t>
+      </w:r>
+      <w:proofErr w:type="spellEnd"/>
+      <w:r>
+        <w:rPr>
+          <w:lang w:val="es-ES"/>
+        </w:rPr>
+        <w:t xml:space="preserve"> </w:t>
+      </w:r>
+      <w:proofErr w:type="spellStart"/>
+      <w:r>
+        <w:rPr>
+          <w:lang w:val="es-ES"/>
+        </w:rPr>
+        <w:t>Intent</w:t>
+      </w:r>
+      <w:proofErr w:type="spellEnd"/>
+      <w:r>
+        <w:rPr>
+          <w:lang w:val="es-ES"/>
+        </w:rPr>
+        <w:t xml:space="preserve"> </w:t>
+      </w:r>
+      <w:proofErr w:type="spellStart"/>
+      <w:r>
+        <w:rPr>
+          <w:lang w:val="es-ES"/>
+        </w:rPr>
+        <w:t>passes</w:t>
+      </w:r>
+      <w:proofErr w:type="spellEnd"/>
+      <w:r>
+        <w:rPr>
+          <w:lang w:val="es-ES"/>
+        </w:rPr>
+        <w:t xml:space="preserve"> </w:t>
+      </w:r>
+      <w:proofErr w:type="spellStart"/>
+      <w:r>
+        <w:rPr>
+          <w:lang w:val="es-ES"/>
+        </w:rPr>
+        <w:t>the</w:t>
+      </w:r>
+      <w:proofErr w:type="spellEnd"/>
+      <w:r>
+        <w:rPr>
+          <w:lang w:val="es-ES"/>
+        </w:rPr>
+        <w:t xml:space="preserve"> </w:t>
+      </w:r>
+      <w:proofErr w:type="spellStart"/>
+      <w:r>
+        <w:rPr>
+          <w:lang w:val="es-ES"/>
+        </w:rPr>
+        <w:t>clicked</w:t>
+      </w:r>
+      <w:proofErr w:type="spellEnd"/>
+      <w:r>
+        <w:rPr>
+          <w:lang w:val="es-ES"/>
+        </w:rPr>
+        <w:t xml:space="preserve"> </w:t>
+      </w:r>
+      <w:proofErr w:type="spellStart"/>
+      <w:r>
+        <w:rPr>
+          <w:lang w:val="es-ES"/>
+        </w:rPr>
+        <w:t>item</w:t>
+      </w:r>
+      <w:proofErr w:type="spellEnd"/>
+      <w:r>
+        <w:rPr>
+          <w:lang w:val="es-ES"/>
+        </w:rPr>
+        <w:t xml:space="preserve"> </w:t>
+      </w:r>
+      <w:proofErr w:type="spellStart"/>
+      <w:r>
+        <w:rPr>
+          <w:lang w:val="es-ES"/>
+        </w:rPr>
+        <w:t>index</w:t>
+      </w:r>
+      <w:proofErr w:type="spellEnd"/>
+      <w:r>
+        <w:rPr>
+          <w:lang w:val="es-ES"/>
+        </w:rPr>
+        <w:t xml:space="preserve"> </w:t>
+      </w:r>
+      <w:proofErr w:type="spellStart"/>
+      <w:r>
+        <w:rPr>
+          <w:lang w:val="es-ES"/>
+        </w:rPr>
+        <w:t>to</w:t>
+      </w:r>
+      <w:proofErr w:type="spellEnd"/>
+      <w:r>
+        <w:rPr>
+          <w:lang w:val="es-ES"/>
+        </w:rPr>
+        <w:t xml:space="preserve"> </w:t>
+      </w:r>
+      <w:proofErr w:type="spellStart"/>
+      <w:r>
+        <w:rPr>
+          <w:lang w:val="es-ES"/>
+        </w:rPr>
+        <w:t>DetailActivity</w:t>
+      </w:r>
+      <w:proofErr w:type="spellEnd"/>
+      <w:r>
+        <w:rPr>
+          <w:lang w:val="es-ES"/>
+        </w:rPr>
+        <w:t xml:space="preserve">. In </w:t>
+      </w:r>
+      <w:proofErr w:type="spellStart"/>
+      <w:r>
+        <w:rPr>
+          <w:lang w:val="es-ES"/>
+        </w:rPr>
+        <w:t>the</w:t>
+      </w:r>
+      <w:proofErr w:type="spellEnd"/>
+      <w:r>
+        <w:rPr>
+          <w:lang w:val="es-ES"/>
+        </w:rPr>
+        <w:t xml:space="preserve"> </w:t>
+      </w:r>
+      <w:proofErr w:type="spellStart"/>
+      <w:r>
+        <w:rPr>
+          <w:lang w:val="es-ES"/>
+        </w:rPr>
+        <w:t>detail</w:t>
+      </w:r>
+      <w:proofErr w:type="spellEnd"/>
+      <w:r>
+        <w:rPr>
+          <w:lang w:val="es-ES"/>
+        </w:rPr>
+        <w:t xml:space="preserve"> </w:t>
+      </w:r>
+      <w:proofErr w:type="spellStart"/>
+      <w:r>
+        <w:rPr>
+          <w:lang w:val="es-ES"/>
+        </w:rPr>
+        <w:t>screen</w:t>
+      </w:r>
+      <w:proofErr w:type="spellEnd"/>
+      <w:r>
+        <w:rPr>
+          <w:lang w:val="es-ES"/>
+        </w:rPr>
+        <w:t xml:space="preserve">, I </w:t>
+      </w:r>
+      <w:proofErr w:type="spellStart"/>
+      <w:r>
+        <w:rPr>
+          <w:lang w:val="es-ES"/>
+        </w:rPr>
+        <w:t>loaded</w:t>
+      </w:r>
+      <w:proofErr w:type="spellEnd"/>
+      <w:r>
+        <w:rPr>
+          <w:lang w:val="es-ES"/>
+        </w:rPr>
+        <w:t xml:space="preserve"> </w:t>
+      </w:r>
+      <w:proofErr w:type="spellStart"/>
+      <w:r>
+        <w:rPr>
+          <w:lang w:val="es-ES"/>
+        </w:rPr>
+        <w:t>image</w:t>
+      </w:r>
+      <w:proofErr w:type="spellEnd"/>
+      <w:r>
+        <w:rPr>
+          <w:lang w:val="es-ES"/>
+        </w:rPr>
+        <w:t xml:space="preserve"> </w:t>
+      </w:r>
+      <w:proofErr w:type="spellStart"/>
+      <w:r>
+        <w:rPr>
+          <w:lang w:val="es-ES"/>
+        </w:rPr>
+        <w:t>resources</w:t>
+      </w:r>
+      <w:proofErr w:type="spellEnd"/>
+      <w:r>
+        <w:rPr>
+          <w:lang w:val="es-ES"/>
+        </w:rPr>
+        <w:t xml:space="preserve"> (</w:t>
+      </w:r>
+      <w:proofErr w:type="spellStart"/>
+      <w:r>
+        <w:rPr>
+          <w:lang w:val="es-ES"/>
+        </w:rPr>
+        <w:t>peach</w:t>
+      </w:r>
+      <w:proofErr w:type="spellEnd"/>
+      <w:r>
+        <w:rPr>
+          <w:lang w:val="es-ES"/>
+        </w:rPr>
+        <w:t xml:space="preserve">, </w:t>
+      </w:r>
+      <w:proofErr w:type="spellStart"/>
+      <w:r>
+        <w:rPr>
+          <w:lang w:val="es-ES"/>
+        </w:rPr>
+        <w:t>tomato</w:t>
+      </w:r>
+      <w:proofErr w:type="spellEnd"/>
+      <w:r>
+        <w:rPr>
+          <w:lang w:val="es-ES"/>
+        </w:rPr>
+        <w:t xml:space="preserve">, squash) and </w:t>
+      </w:r>
+      <w:proofErr w:type="spellStart"/>
+      <w:r>
+        <w:rPr>
+          <w:lang w:val="es-ES"/>
+        </w:rPr>
+        <w:t>implemented</w:t>
+      </w:r>
+      <w:proofErr w:type="spellEnd"/>
+      <w:r>
+        <w:rPr>
+          <w:lang w:val="es-ES"/>
+        </w:rPr>
+        <w:t xml:space="preserve"> </w:t>
+      </w:r>
+      <w:proofErr w:type="spellStart"/>
+      <w:proofErr w:type="gramStart"/>
+      <w:r>
+        <w:rPr>
+          <w:lang w:val="es-ES"/>
+        </w:rPr>
+        <w:t>an</w:t>
+      </w:r>
+      <w:proofErr w:type="spellEnd"/>
+      <w:r>
+        <w:rPr>
+          <w:lang w:val="es-ES"/>
+        </w:rPr>
+        <w:t xml:space="preserve"> </w:t>
+      </w:r>
+      <w:proofErr w:type="spellStart"/>
+      <w:r>
+        <w:rPr>
+          <w:lang w:val="es-ES"/>
+        </w:rPr>
+        <w:t>in</w:t>
+      </w:r>
+      <w:proofErr w:type="gramEnd"/>
+      <w:r>
+        <w:rPr>
+          <w:lang w:val="es-ES"/>
+        </w:rPr>
+        <w:t>-memory</w:t>
+      </w:r>
+      <w:proofErr w:type="spellEnd"/>
+      <w:r>
+        <w:rPr>
+          <w:lang w:val="es-ES"/>
+        </w:rPr>
+        <w:t xml:space="preserve"> </w:t>
+      </w:r>
+      <w:proofErr w:type="spellStart"/>
+      <w:r>
+        <w:rPr>
+          <w:lang w:val="es-ES"/>
+        </w:rPr>
+        <w:t>image</w:t>
+      </w:r>
+      <w:proofErr w:type="spellEnd"/>
+      <w:r>
+        <w:rPr>
+          <w:lang w:val="es-ES"/>
+        </w:rPr>
+        <w:t xml:space="preserve"> </w:t>
+      </w:r>
+      <w:proofErr w:type="spellStart"/>
+      <w:r>
+        <w:rPr>
+          <w:lang w:val="es-ES"/>
+        </w:rPr>
+        <w:t>scaling</w:t>
+      </w:r>
+      <w:proofErr w:type="spellEnd"/>
+      <w:r>
+        <w:rPr>
+          <w:lang w:val="es-ES"/>
+        </w:rPr>
+        <w:t xml:space="preserve"> </w:t>
+      </w:r>
+      <w:proofErr w:type="spellStart"/>
+      <w:r>
+        <w:rPr>
+          <w:lang w:val="es-ES"/>
+        </w:rPr>
+        <w:t>algorithm</w:t>
+      </w:r>
+      <w:proofErr w:type="spellEnd"/>
+      <w:r>
+        <w:rPr>
+          <w:lang w:val="es-ES"/>
+        </w:rPr>
+        <w:t xml:space="preserve"> </w:t>
+      </w:r>
+      <w:proofErr w:type="spellStart"/>
+      <w:r>
+        <w:rPr>
+          <w:lang w:val="es-ES"/>
+        </w:rPr>
+        <w:t>using</w:t>
+      </w:r>
+      <w:proofErr w:type="spellEnd"/>
+      <w:r>
+        <w:rPr>
+          <w:lang w:val="es-ES"/>
+        </w:rPr>
+        <w:t xml:space="preserve"> </w:t>
+      </w:r>
+      <w:proofErr w:type="spellStart"/>
+      <w:r>
+        <w:rPr>
+          <w:lang w:val="es-ES"/>
+        </w:rPr>
+        <w:t>BitmapFactory.Options</w:t>
+      </w:r>
+      <w:proofErr w:type="spellEnd"/>
+      <w:r>
+        <w:rPr>
+          <w:lang w:val="es-ES"/>
+        </w:rPr>
+        <w:t xml:space="preserve"> and </w:t>
+      </w:r>
+      <w:proofErr w:type="spellStart"/>
+      <w:r>
+        <w:rPr>
+          <w:lang w:val="es-ES"/>
+        </w:rPr>
+        <w:t>inSampleSize</w:t>
+      </w:r>
+      <w:proofErr w:type="spellEnd"/>
+      <w:r>
+        <w:rPr>
+          <w:lang w:val="es-ES"/>
+        </w:rPr>
+        <w:t xml:space="preserve"> </w:t>
+      </w:r>
+      <w:proofErr w:type="spellStart"/>
+      <w:r>
+        <w:rPr>
+          <w:lang w:val="es-ES"/>
+        </w:rPr>
+        <w:t>to</w:t>
+      </w:r>
+      <w:proofErr w:type="spellEnd"/>
+      <w:r>
+        <w:rPr>
+          <w:lang w:val="es-ES"/>
+        </w:rPr>
+        <w:t xml:space="preserve"> match </w:t>
+      </w:r>
+      <w:proofErr w:type="spellStart"/>
+      <w:r>
+        <w:rPr>
+          <w:lang w:val="es-ES"/>
+        </w:rPr>
+        <w:t>the</w:t>
+      </w:r>
+      <w:proofErr w:type="spellEnd"/>
+      <w:r>
+        <w:rPr>
+          <w:lang w:val="es-ES"/>
+        </w:rPr>
+        <w:t xml:space="preserve"> </w:t>
+      </w:r>
+      <w:proofErr w:type="spellStart"/>
+      <w:r>
+        <w:rPr>
+          <w:lang w:val="es-ES"/>
+        </w:rPr>
+        <w:t>device</w:t>
+      </w:r>
+      <w:proofErr w:type="spellEnd"/>
+      <w:r>
+        <w:rPr>
+          <w:lang w:val="es-ES"/>
+        </w:rPr>
+        <w:t xml:space="preserve"> </w:t>
+      </w:r>
+      <w:proofErr w:type="spellStart"/>
+      <w:r>
+        <w:rPr>
+          <w:lang w:val="es-ES"/>
+        </w:rPr>
+        <w:t>screen</w:t>
+      </w:r>
+      <w:proofErr w:type="spellEnd"/>
+      <w:r>
+        <w:rPr>
+          <w:lang w:val="es-ES"/>
+        </w:rPr>
+        <w:t xml:space="preserve"> </w:t>
+      </w:r>
+      <w:proofErr w:type="spellStart"/>
+      <w:r>
+        <w:rPr>
+          <w:lang w:val="es-ES"/>
+        </w:rPr>
+        <w:t>width</w:t>
+      </w:r>
+      <w:proofErr w:type="spellEnd"/>
+      <w:r>
+        <w:rPr>
+          <w:lang w:val="es-ES"/>
+        </w:rPr>
+        <w:t xml:space="preserve">, </w:t>
+      </w:r>
+      <w:proofErr w:type="spellStart"/>
+      <w:r>
+        <w:rPr>
+          <w:lang w:val="es-ES"/>
+        </w:rPr>
+        <w:t>preventing</w:t>
+      </w:r>
+      <w:proofErr w:type="spellEnd"/>
+      <w:r>
+        <w:rPr>
+          <w:lang w:val="es-ES"/>
+        </w:rPr>
+        <w:t xml:space="preserve"> </w:t>
+      </w:r>
+      <w:proofErr w:type="spellStart"/>
+      <w:r>
+        <w:rPr>
+          <w:lang w:val="es-ES"/>
+        </w:rPr>
+        <w:t>memory</w:t>
+      </w:r>
+      <w:proofErr w:type="spellEnd"/>
+      <w:r>
+        <w:rPr>
+          <w:lang w:val="es-ES"/>
+        </w:rPr>
+        <w:t xml:space="preserve"> </w:t>
+      </w:r>
+      <w:proofErr w:type="spellStart"/>
+      <w:r>
+        <w:rPr>
+          <w:lang w:val="es-ES"/>
+        </w:rPr>
+        <w:t>overflow</w:t>
+      </w:r>
+      <w:proofErr w:type="spellEnd"/>
+      <w:r>
+        <w:rPr>
+          <w:lang w:val="es-ES"/>
+        </w:rPr>
+        <w:t xml:space="preserve"> </w:t>
+      </w:r>
+      <w:proofErr w:type="spellStart"/>
+      <w:r>
+        <w:rPr>
+          <w:lang w:val="es-ES"/>
+        </w:rPr>
+        <w:t>issues</w:t>
+      </w:r>
+      <w:proofErr w:type="spellEnd"/>
+      <w:r>
+        <w:rPr>
+          <w:lang w:val="es-ES"/>
+        </w:rPr>
+        <w:t xml:space="preserve">. </w:t>
+      </w:r>
+      <w:proofErr w:type="spellStart"/>
+      <w:r>
+        <w:rPr>
+          <w:lang w:val="es-ES"/>
+        </w:rPr>
+        <w:t>Finally</w:t>
+      </w:r>
+      <w:proofErr w:type="spellEnd"/>
+      <w:r>
+        <w:rPr>
+          <w:lang w:val="es-ES"/>
+        </w:rPr>
+        <w:t xml:space="preserve">, I </w:t>
+      </w:r>
+      <w:proofErr w:type="spellStart"/>
+      <w:r>
+        <w:rPr>
+          <w:lang w:val="es-ES"/>
+        </w:rPr>
+        <w:t>tested</w:t>
+      </w:r>
+      <w:proofErr w:type="spellEnd"/>
+      <w:r>
+        <w:rPr>
+          <w:lang w:val="es-ES"/>
+        </w:rPr>
+        <w:t xml:space="preserve"> </w:t>
+      </w:r>
+      <w:proofErr w:type="spellStart"/>
+      <w:r>
+        <w:rPr>
+          <w:lang w:val="es-ES"/>
+        </w:rPr>
+        <w:t>navigation</w:t>
+      </w:r>
+      <w:proofErr w:type="spellEnd"/>
+      <w:r>
+        <w:rPr>
+          <w:lang w:val="es-ES"/>
+        </w:rPr>
+        <w:t xml:space="preserve"> and </w:t>
+      </w:r>
+      <w:proofErr w:type="spellStart"/>
+      <w:r>
+        <w:rPr>
+          <w:lang w:val="es-ES"/>
+        </w:rPr>
+        <w:t>image</w:t>
+      </w:r>
+      <w:proofErr w:type="spellEnd"/>
+      <w:r>
+        <w:rPr>
+          <w:lang w:val="es-ES"/>
+        </w:rPr>
+        <w:t xml:space="preserve"> </w:t>
+      </w:r>
+      <w:proofErr w:type="spellStart"/>
+      <w:r>
+        <w:rPr>
+          <w:lang w:val="es-ES"/>
+        </w:rPr>
+        <w:t>rendering</w:t>
+      </w:r>
+      <w:proofErr w:type="spellEnd"/>
+      <w:r>
+        <w:rPr>
+          <w:lang w:val="es-ES"/>
+        </w:rPr>
+        <w:t xml:space="preserve"> </w:t>
+      </w:r>
+      <w:proofErr w:type="spellStart"/>
+      <w:r>
+        <w:rPr>
+          <w:lang w:val="es-ES"/>
+        </w:rPr>
+        <w:t>successfully</w:t>
+      </w:r>
+      <w:proofErr w:type="spellEnd"/>
+      <w:r>
+        <w:rPr>
+          <w:lang w:val="es-ES"/>
+        </w:rPr>
+        <w:t xml:space="preserve"> </w:t>
+      </w:r>
+      <w:proofErr w:type="spellStart"/>
+      <w:r>
+        <w:rPr>
+          <w:lang w:val="es-ES"/>
+        </w:rPr>
+        <w:t>on</w:t>
+      </w:r>
+      <w:proofErr w:type="spellEnd"/>
+      <w:r>
+        <w:rPr>
+          <w:lang w:val="es-ES"/>
+        </w:rPr>
+        <w:t xml:space="preserve"> </w:t>
+      </w:r>
+      <w:proofErr w:type="spellStart"/>
+      <w:r>
+        <w:rPr>
+          <w:lang w:val="es-ES"/>
+        </w:rPr>
+        <w:t>my</w:t>
+      </w:r>
+      <w:proofErr w:type="spellEnd"/>
+      <w:r>
+        <w:rPr>
+          <w:lang w:val="es-ES"/>
+        </w:rPr>
+        <w:t xml:space="preserve"> </w:t>
+      </w:r>
+      <w:proofErr w:type="spellStart"/>
+      <w:r>
+        <w:rPr>
+          <w:lang w:val="es-ES"/>
+        </w:rPr>
+        <w:t>physical</w:t>
+      </w:r>
+      <w:proofErr w:type="spellEnd"/>
+      <w:r>
+        <w:rPr>
+          <w:lang w:val="es-ES"/>
+        </w:rPr>
+        <w:t xml:space="preserve"> </w:t>
+      </w:r>
+      <w:proofErr w:type="spellStart"/>
+      <w:r>
+        <w:rPr>
+          <w:lang w:val="es-ES"/>
+        </w:rPr>
+        <w:t>device</w:t>
+      </w:r>
+      <w:proofErr w:type="spellEnd"/>
+      <w:r>
+        <w:rPr>
+          <w:lang w:val="es-ES"/>
+        </w:rPr>
+        <w:t xml:space="preserve"> and </w:t>
+      </w:r>
+      <w:proofErr w:type="spellStart"/>
+      <w:r>
+        <w:rPr>
+          <w:lang w:val="es-ES"/>
+        </w:rPr>
+        <w:t>prepared</w:t>
+      </w:r>
+      <w:proofErr w:type="spellEnd"/>
+      <w:r>
+        <w:rPr>
+          <w:lang w:val="es-ES"/>
+        </w:rPr>
+        <w:t xml:space="preserve"> </w:t>
+      </w:r>
+      <w:proofErr w:type="spellStart"/>
+      <w:r>
+        <w:rPr>
+          <w:lang w:val="es-ES"/>
+        </w:rPr>
+        <w:t>the</w:t>
+      </w:r>
+      <w:proofErr w:type="spellEnd"/>
+      <w:r>
+        <w:rPr>
+          <w:lang w:val="es-ES"/>
+        </w:rPr>
+        <w:t xml:space="preserve"> </w:t>
+      </w:r>
+      <w:proofErr w:type="spellStart"/>
+      <w:r>
+        <w:rPr>
+          <w:lang w:val="es-ES"/>
+        </w:rPr>
+        <w:t>project</w:t>
+      </w:r>
+      <w:proofErr w:type="spellEnd"/>
+      <w:r>
+        <w:rPr>
+          <w:lang w:val="es-ES"/>
+        </w:rPr>
+        <w:t xml:space="preserve"> </w:t>
+      </w:r>
+      <w:proofErr w:type="spellStart"/>
+      <w:r>
+        <w:rPr>
+          <w:lang w:val="es-ES"/>
+        </w:rPr>
+        <w:t>for</w:t>
+      </w:r>
+      <w:proofErr w:type="spellEnd"/>
+      <w:r>
+        <w:rPr>
+          <w:lang w:val="es-ES"/>
+        </w:rPr>
+        <w:t xml:space="preserve"> </w:t>
+      </w:r>
+      <w:proofErr w:type="spellStart"/>
+      <w:r>
+        <w:rPr>
+          <w:lang w:val="es-ES"/>
+        </w:rPr>
+        <w:t>version</w:t>
+      </w:r>
+      <w:proofErr w:type="spellEnd"/>
+      <w:r>
+        <w:rPr>
+          <w:lang w:val="es-ES"/>
+        </w:rPr>
+        <w:t xml:space="preserve"> control.</w:t>
+      </w:r>
     </w:p>
     <w:p>
       <w:pPr>
@@ -1690,7 +3687,6 @@
   <w:style w:type="character" w:default="1" w:styleId="Fuentedeprrafopredeter">
     <w:name w:val="Default Paragraph Font"/>
     <w:uiPriority w:val="1"/>
-    <w:semiHidden/>
     <w:unhideWhenUsed/>
   </w:style>
   <w:style w:type="table" w:default="1" w:styleId="Tablanormal">

</xml_diff>

<commit_message>
update learning diary with final project progress
</commit_message>
<xml_diff>
--- a/Learning_diary.docx
+++ b/Learning_diary.docx
@@ -1699,7 +1699,6 @@
         <w:t xml:space="preserve"> </w:t>
       </w:r>
       <w:proofErr w:type="spellStart"/>
-      <w:proofErr w:type="gramStart"/>
       <w:r>
         <w:rPr>
           <w:lang w:val="es-ES"/>
@@ -1718,14 +1717,7 @@
         <w:rPr>
           <w:lang w:val="es-ES"/>
         </w:rPr>
-        <w:t>in</w:t>
-      </w:r>
-      <w:proofErr w:type="gramEnd"/>
-      <w:r>
-        <w:rPr>
-          <w:lang w:val="es-ES"/>
-        </w:rPr>
-        <w:t>-memory</w:t>
+        <w:t>in-memory</w:t>
       </w:r>
       <w:proofErr w:type="spellEnd"/>
       <w:r>
@@ -2154,6 +2146,4099 @@
         </w:rPr>
         <w:t xml:space="preserve"> control.</w:t>
       </w:r>
+    </w:p>
+    <w:p>
+      <w:pPr>
+        <w:pStyle w:val="Textoindependiente"/>
+        <w:rPr>
+          <w:lang w:val="es-ES"/>
+        </w:rPr>
+      </w:pPr>
+    </w:p>
+    <w:p>
+      <w:pPr>
+        <w:pStyle w:val="Textoindependiente"/>
+        <w:rPr>
+          <w:lang w:val="es-ES"/>
+        </w:rPr>
+      </w:pPr>
+      <w:r>
+        <w:rPr>
+          <w:b/>
+          <w:bCs/>
+          <w:lang w:val="es-ES"/>
+        </w:rPr>
+        <w:t>12.9.2026</w:t>
+      </w:r>
+    </w:p>
+    <w:p>
+      <w:pPr>
+        <w:pStyle w:val="Textoindependiente"/>
+        <w:rPr>
+          <w:lang w:val="es-ES"/>
+        </w:rPr>
+      </w:pPr>
+      <w:r>
+        <w:rPr>
+          <w:lang w:val="es-ES"/>
+        </w:rPr>
+        <w:t xml:space="preserve">I </w:t>
+      </w:r>
+      <w:proofErr w:type="spellStart"/>
+      <w:r>
+        <w:rPr>
+          <w:lang w:val="es-ES"/>
+        </w:rPr>
+        <w:t>started</w:t>
+      </w:r>
+      <w:proofErr w:type="spellEnd"/>
+      <w:r>
+        <w:rPr>
+          <w:lang w:val="es-ES"/>
+        </w:rPr>
+        <w:t xml:space="preserve"> </w:t>
+      </w:r>
+      <w:proofErr w:type="spellStart"/>
+      <w:r>
+        <w:rPr>
+          <w:lang w:val="es-ES"/>
+        </w:rPr>
+        <w:t>planning</w:t>
+      </w:r>
+      <w:proofErr w:type="spellEnd"/>
+      <w:r>
+        <w:rPr>
+          <w:lang w:val="es-ES"/>
+        </w:rPr>
+        <w:t xml:space="preserve"> and </w:t>
+      </w:r>
+      <w:proofErr w:type="spellStart"/>
+      <w:r>
+        <w:rPr>
+          <w:lang w:val="es-ES"/>
+        </w:rPr>
+        <w:t>developing</w:t>
+      </w:r>
+      <w:proofErr w:type="spellEnd"/>
+      <w:r>
+        <w:rPr>
+          <w:lang w:val="es-ES"/>
+        </w:rPr>
+        <w:t xml:space="preserve"> </w:t>
+      </w:r>
+      <w:proofErr w:type="spellStart"/>
+      <w:r>
+        <w:rPr>
+          <w:lang w:val="es-ES"/>
+        </w:rPr>
+        <w:t>my</w:t>
+      </w:r>
+      <w:proofErr w:type="spellEnd"/>
+      <w:r>
+        <w:rPr>
+          <w:lang w:val="es-ES"/>
+        </w:rPr>
+        <w:t xml:space="preserve"> final </w:t>
+      </w:r>
+      <w:proofErr w:type="spellStart"/>
+      <w:r>
+        <w:rPr>
+          <w:lang w:val="es-ES"/>
+        </w:rPr>
+        <w:t>project</w:t>
+      </w:r>
+      <w:proofErr w:type="spellEnd"/>
+      <w:r>
+        <w:rPr>
+          <w:lang w:val="es-ES"/>
+        </w:rPr>
+        <w:t>, "</w:t>
+      </w:r>
+      <w:proofErr w:type="spellStart"/>
+      <w:r>
+        <w:rPr>
+          <w:lang w:val="es-ES"/>
+        </w:rPr>
+        <w:t>RefereeApp</w:t>
+      </w:r>
+      <w:proofErr w:type="spellEnd"/>
+      <w:r>
+        <w:rPr>
+          <w:lang w:val="es-ES"/>
+        </w:rPr>
+        <w:t>" (</w:t>
+      </w:r>
+      <w:proofErr w:type="spellStart"/>
+      <w:r>
+        <w:rPr>
+          <w:lang w:val="es-ES"/>
+        </w:rPr>
+        <w:t>MatchHub</w:t>
+      </w:r>
+      <w:proofErr w:type="spellEnd"/>
+      <w:r>
+        <w:rPr>
+          <w:lang w:val="es-ES"/>
+        </w:rPr>
+        <w:t xml:space="preserve">), a digital </w:t>
+      </w:r>
+      <w:proofErr w:type="spellStart"/>
+      <w:r>
+        <w:rPr>
+          <w:lang w:val="es-ES"/>
+        </w:rPr>
+        <w:t>matchday</w:t>
+      </w:r>
+      <w:proofErr w:type="spellEnd"/>
+      <w:r>
+        <w:rPr>
+          <w:lang w:val="es-ES"/>
+        </w:rPr>
+        <w:t xml:space="preserve"> </w:t>
+      </w:r>
+      <w:proofErr w:type="spellStart"/>
+      <w:r>
+        <w:rPr>
+          <w:lang w:val="es-ES"/>
+        </w:rPr>
+        <w:t>assistant</w:t>
+      </w:r>
+      <w:proofErr w:type="spellEnd"/>
+      <w:r>
+        <w:rPr>
+          <w:lang w:val="es-ES"/>
+        </w:rPr>
+        <w:t xml:space="preserve"> </w:t>
+      </w:r>
+      <w:proofErr w:type="spellStart"/>
+      <w:r>
+        <w:rPr>
+          <w:lang w:val="es-ES"/>
+        </w:rPr>
+        <w:t>designed</w:t>
+      </w:r>
+      <w:proofErr w:type="spellEnd"/>
+      <w:r>
+        <w:rPr>
+          <w:lang w:val="es-ES"/>
+        </w:rPr>
+        <w:t xml:space="preserve"> </w:t>
+      </w:r>
+      <w:proofErr w:type="spellStart"/>
+      <w:r>
+        <w:rPr>
+          <w:lang w:val="es-ES"/>
+        </w:rPr>
+        <w:t>for</w:t>
+      </w:r>
+      <w:proofErr w:type="spellEnd"/>
+      <w:r>
+        <w:rPr>
+          <w:lang w:val="es-ES"/>
+        </w:rPr>
+        <w:t xml:space="preserve"> </w:t>
+      </w:r>
+      <w:proofErr w:type="spellStart"/>
+      <w:r>
+        <w:rPr>
+          <w:lang w:val="es-ES"/>
+        </w:rPr>
+        <w:t>football</w:t>
+      </w:r>
+      <w:proofErr w:type="spellEnd"/>
+      <w:r>
+        <w:rPr>
+          <w:lang w:val="es-ES"/>
+        </w:rPr>
+        <w:t xml:space="preserve"> </w:t>
+      </w:r>
+      <w:proofErr w:type="spellStart"/>
+      <w:r>
+        <w:rPr>
+          <w:lang w:val="es-ES"/>
+        </w:rPr>
+        <w:t>referees</w:t>
+      </w:r>
+      <w:proofErr w:type="spellEnd"/>
+      <w:r>
+        <w:rPr>
+          <w:lang w:val="es-ES"/>
+        </w:rPr>
+        <w:t xml:space="preserve">. After </w:t>
+      </w:r>
+      <w:proofErr w:type="spellStart"/>
+      <w:r>
+        <w:rPr>
+          <w:lang w:val="es-ES"/>
+        </w:rPr>
+        <w:t>reviewing</w:t>
+      </w:r>
+      <w:proofErr w:type="spellEnd"/>
+      <w:r>
+        <w:rPr>
+          <w:lang w:val="es-ES"/>
+        </w:rPr>
+        <w:t xml:space="preserve"> </w:t>
+      </w:r>
+      <w:proofErr w:type="spellStart"/>
+      <w:r>
+        <w:rPr>
+          <w:lang w:val="es-ES"/>
+        </w:rPr>
+        <w:t>the</w:t>
+      </w:r>
+      <w:proofErr w:type="spellEnd"/>
+      <w:r>
+        <w:rPr>
+          <w:lang w:val="es-ES"/>
+        </w:rPr>
+        <w:t xml:space="preserve"> </w:t>
+      </w:r>
+      <w:proofErr w:type="spellStart"/>
+      <w:r>
+        <w:rPr>
+          <w:lang w:val="es-ES"/>
+        </w:rPr>
+        <w:t>project</w:t>
+      </w:r>
+      <w:proofErr w:type="spellEnd"/>
+      <w:r>
+        <w:rPr>
+          <w:lang w:val="es-ES"/>
+        </w:rPr>
+        <w:t xml:space="preserve"> </w:t>
+      </w:r>
+      <w:proofErr w:type="spellStart"/>
+      <w:r>
+        <w:rPr>
+          <w:lang w:val="es-ES"/>
+        </w:rPr>
+        <w:t>requirements</w:t>
+      </w:r>
+      <w:proofErr w:type="spellEnd"/>
+      <w:r>
+        <w:rPr>
+          <w:lang w:val="es-ES"/>
+        </w:rPr>
+        <w:t xml:space="preserve">, I </w:t>
+      </w:r>
+      <w:proofErr w:type="spellStart"/>
+      <w:r>
+        <w:rPr>
+          <w:lang w:val="es-ES"/>
+        </w:rPr>
+        <w:t>structured</w:t>
+      </w:r>
+      <w:proofErr w:type="spellEnd"/>
+      <w:r>
+        <w:rPr>
+          <w:lang w:val="es-ES"/>
+        </w:rPr>
+        <w:t xml:space="preserve"> </w:t>
+      </w:r>
+      <w:proofErr w:type="spellStart"/>
+      <w:r>
+        <w:rPr>
+          <w:lang w:val="es-ES"/>
+        </w:rPr>
+        <w:t>the</w:t>
+      </w:r>
+      <w:proofErr w:type="spellEnd"/>
+      <w:r>
+        <w:rPr>
+          <w:lang w:val="es-ES"/>
+        </w:rPr>
+        <w:t xml:space="preserve"> </w:t>
+      </w:r>
+      <w:proofErr w:type="spellStart"/>
+      <w:r>
+        <w:rPr>
+          <w:lang w:val="es-ES"/>
+        </w:rPr>
+        <w:t>application</w:t>
+      </w:r>
+      <w:proofErr w:type="spellEnd"/>
+      <w:r>
+        <w:rPr>
+          <w:lang w:val="es-ES"/>
+        </w:rPr>
+        <w:t xml:space="preserve"> </w:t>
+      </w:r>
+      <w:proofErr w:type="spellStart"/>
+      <w:r>
+        <w:rPr>
+          <w:lang w:val="es-ES"/>
+        </w:rPr>
+        <w:t>architecture</w:t>
+      </w:r>
+      <w:proofErr w:type="spellEnd"/>
+      <w:r>
+        <w:rPr>
+          <w:lang w:val="es-ES"/>
+        </w:rPr>
+        <w:t xml:space="preserve"> </w:t>
+      </w:r>
+      <w:proofErr w:type="spellStart"/>
+      <w:r>
+        <w:rPr>
+          <w:lang w:val="es-ES"/>
+        </w:rPr>
+        <w:t>to</w:t>
+      </w:r>
+      <w:proofErr w:type="spellEnd"/>
+      <w:r>
+        <w:rPr>
+          <w:lang w:val="es-ES"/>
+        </w:rPr>
+        <w:t xml:space="preserve"> </w:t>
+      </w:r>
+      <w:proofErr w:type="spellStart"/>
+      <w:r>
+        <w:rPr>
+          <w:lang w:val="es-ES"/>
+        </w:rPr>
+        <w:t>integrate</w:t>
+      </w:r>
+      <w:proofErr w:type="spellEnd"/>
+      <w:r>
+        <w:rPr>
+          <w:lang w:val="es-ES"/>
+        </w:rPr>
+        <w:t xml:space="preserve"> interactive UI </w:t>
+      </w:r>
+      <w:proofErr w:type="spellStart"/>
+      <w:r>
+        <w:rPr>
+          <w:lang w:val="es-ES"/>
+        </w:rPr>
+        <w:t>controls</w:t>
+      </w:r>
+      <w:proofErr w:type="spellEnd"/>
+      <w:r>
+        <w:rPr>
+          <w:lang w:val="es-ES"/>
+        </w:rPr>
+        <w:t xml:space="preserve">, </w:t>
+      </w:r>
+      <w:proofErr w:type="spellStart"/>
+      <w:r>
+        <w:rPr>
+          <w:lang w:val="es-ES"/>
+        </w:rPr>
+        <w:t>multi-screen</w:t>
+      </w:r>
+      <w:proofErr w:type="spellEnd"/>
+      <w:r>
+        <w:rPr>
+          <w:lang w:val="es-ES"/>
+        </w:rPr>
+        <w:t xml:space="preserve"> </w:t>
+      </w:r>
+      <w:proofErr w:type="spellStart"/>
+      <w:r>
+        <w:rPr>
+          <w:lang w:val="es-ES"/>
+        </w:rPr>
+        <w:t>navigation</w:t>
+      </w:r>
+      <w:proofErr w:type="spellEnd"/>
+      <w:r>
+        <w:rPr>
+          <w:lang w:val="es-ES"/>
+        </w:rPr>
+        <w:t xml:space="preserve">, and </w:t>
+      </w:r>
+      <w:proofErr w:type="spellStart"/>
+      <w:r>
+        <w:rPr>
+          <w:lang w:val="es-ES"/>
+        </w:rPr>
+        <w:t>custom</w:t>
+      </w:r>
+      <w:proofErr w:type="spellEnd"/>
+      <w:r>
+        <w:rPr>
+          <w:lang w:val="es-ES"/>
+        </w:rPr>
+        <w:t xml:space="preserve"> </w:t>
+      </w:r>
+      <w:proofErr w:type="spellStart"/>
+      <w:r>
+        <w:rPr>
+          <w:lang w:val="es-ES"/>
+        </w:rPr>
+        <w:t>list</w:t>
+      </w:r>
+      <w:proofErr w:type="spellEnd"/>
+      <w:r>
+        <w:rPr>
+          <w:lang w:val="es-ES"/>
+        </w:rPr>
+        <w:t xml:space="preserve"> </w:t>
+      </w:r>
+      <w:proofErr w:type="spellStart"/>
+      <w:r>
+        <w:rPr>
+          <w:lang w:val="es-ES"/>
+        </w:rPr>
+        <w:t>rendering</w:t>
+      </w:r>
+      <w:proofErr w:type="spellEnd"/>
+      <w:r>
+        <w:rPr>
+          <w:lang w:val="es-ES"/>
+        </w:rPr>
+        <w:t xml:space="preserve"> </w:t>
+      </w:r>
+      <w:proofErr w:type="spellStart"/>
+      <w:r>
+        <w:rPr>
+          <w:lang w:val="es-ES"/>
+        </w:rPr>
+        <w:t>using</w:t>
+      </w:r>
+      <w:proofErr w:type="spellEnd"/>
+      <w:r>
+        <w:rPr>
+          <w:lang w:val="es-ES"/>
+        </w:rPr>
+        <w:t xml:space="preserve"> pure Java.</w:t>
+      </w:r>
+    </w:p>
+    <w:p>
+      <w:pPr>
+        <w:pStyle w:val="Textoindependiente"/>
+        <w:rPr>
+          <w:lang w:val="es-ES"/>
+        </w:rPr>
+      </w:pPr>
+      <w:r>
+        <w:rPr>
+          <w:lang w:val="es-ES"/>
+        </w:rPr>
+        <w:t xml:space="preserve">Today, I </w:t>
+      </w:r>
+      <w:proofErr w:type="spellStart"/>
+      <w:r>
+        <w:rPr>
+          <w:lang w:val="es-ES"/>
+        </w:rPr>
+        <w:t>initialized</w:t>
+      </w:r>
+      <w:proofErr w:type="spellEnd"/>
+      <w:r>
+        <w:rPr>
+          <w:lang w:val="es-ES"/>
+        </w:rPr>
+        <w:t xml:space="preserve"> </w:t>
+      </w:r>
+      <w:proofErr w:type="spellStart"/>
+      <w:r>
+        <w:rPr>
+          <w:lang w:val="es-ES"/>
+        </w:rPr>
+        <w:t>the</w:t>
+      </w:r>
+      <w:proofErr w:type="spellEnd"/>
+      <w:r>
+        <w:rPr>
+          <w:lang w:val="es-ES"/>
+        </w:rPr>
+        <w:t xml:space="preserve"> </w:t>
+      </w:r>
+      <w:proofErr w:type="spellStart"/>
+      <w:r>
+        <w:rPr>
+          <w:lang w:val="es-ES"/>
+        </w:rPr>
+        <w:t>project</w:t>
+      </w:r>
+      <w:proofErr w:type="spellEnd"/>
+      <w:r>
+        <w:rPr>
+          <w:lang w:val="es-ES"/>
+        </w:rPr>
+        <w:t xml:space="preserve"> in Android Studio and </w:t>
+      </w:r>
+      <w:proofErr w:type="spellStart"/>
+      <w:r>
+        <w:rPr>
+          <w:lang w:val="es-ES"/>
+        </w:rPr>
+        <w:t>built</w:t>
+      </w:r>
+      <w:proofErr w:type="spellEnd"/>
+      <w:r>
+        <w:rPr>
+          <w:lang w:val="es-ES"/>
+        </w:rPr>
+        <w:t xml:space="preserve"> </w:t>
+      </w:r>
+      <w:proofErr w:type="spellStart"/>
+      <w:r>
+        <w:rPr>
+          <w:lang w:val="es-ES"/>
+        </w:rPr>
+        <w:t>the</w:t>
+      </w:r>
+      <w:proofErr w:type="spellEnd"/>
+      <w:r>
+        <w:rPr>
+          <w:lang w:val="es-ES"/>
+        </w:rPr>
+        <w:t xml:space="preserve"> </w:t>
+      </w:r>
+      <w:proofErr w:type="spellStart"/>
+      <w:r>
+        <w:rPr>
+          <w:lang w:val="es-ES"/>
+        </w:rPr>
+        <w:t>setup</w:t>
+      </w:r>
+      <w:proofErr w:type="spellEnd"/>
+      <w:r>
+        <w:rPr>
+          <w:lang w:val="es-ES"/>
+        </w:rPr>
+        <w:t xml:space="preserve"> </w:t>
+      </w:r>
+      <w:proofErr w:type="spellStart"/>
+      <w:r>
+        <w:rPr>
+          <w:lang w:val="es-ES"/>
+        </w:rPr>
+        <w:t>screen</w:t>
+      </w:r>
+      <w:proofErr w:type="spellEnd"/>
+      <w:r>
+        <w:rPr>
+          <w:lang w:val="es-ES"/>
+        </w:rPr>
+        <w:t xml:space="preserve"> (MainActivity.java and activity_main.xml). I </w:t>
+      </w:r>
+      <w:proofErr w:type="spellStart"/>
+      <w:r>
+        <w:rPr>
+          <w:lang w:val="es-ES"/>
+        </w:rPr>
+        <w:t>designed</w:t>
+      </w:r>
+      <w:proofErr w:type="spellEnd"/>
+      <w:r>
+        <w:rPr>
+          <w:lang w:val="es-ES"/>
+        </w:rPr>
+        <w:t xml:space="preserve"> </w:t>
+      </w:r>
+      <w:proofErr w:type="spellStart"/>
+      <w:r>
+        <w:rPr>
+          <w:lang w:val="es-ES"/>
+        </w:rPr>
+        <w:t>the</w:t>
+      </w:r>
+      <w:proofErr w:type="spellEnd"/>
+      <w:r>
+        <w:rPr>
+          <w:lang w:val="es-ES"/>
+        </w:rPr>
+        <w:t xml:space="preserve"> </w:t>
+      </w:r>
+      <w:proofErr w:type="spellStart"/>
+      <w:r>
+        <w:rPr>
+          <w:lang w:val="es-ES"/>
+        </w:rPr>
+        <w:t>user</w:t>
+      </w:r>
+      <w:proofErr w:type="spellEnd"/>
+      <w:r>
+        <w:rPr>
+          <w:lang w:val="es-ES"/>
+        </w:rPr>
+        <w:t xml:space="preserve"> interface </w:t>
+      </w:r>
+      <w:proofErr w:type="spellStart"/>
+      <w:r>
+        <w:rPr>
+          <w:lang w:val="es-ES"/>
+        </w:rPr>
+        <w:t>using</w:t>
+      </w:r>
+      <w:proofErr w:type="spellEnd"/>
+      <w:r>
+        <w:rPr>
+          <w:lang w:val="es-ES"/>
+        </w:rPr>
+        <w:t xml:space="preserve"> </w:t>
+      </w:r>
+      <w:proofErr w:type="spellStart"/>
+      <w:r>
+        <w:rPr>
+          <w:lang w:val="es-ES"/>
+        </w:rPr>
+        <w:t>ConstraintLayout</w:t>
+      </w:r>
+      <w:proofErr w:type="spellEnd"/>
+      <w:r>
+        <w:rPr>
+          <w:lang w:val="es-ES"/>
+        </w:rPr>
+        <w:t xml:space="preserve"> </w:t>
+      </w:r>
+      <w:proofErr w:type="spellStart"/>
+      <w:r>
+        <w:rPr>
+          <w:lang w:val="es-ES"/>
+        </w:rPr>
+        <w:t>with</w:t>
+      </w:r>
+      <w:proofErr w:type="spellEnd"/>
+      <w:r>
+        <w:rPr>
+          <w:lang w:val="es-ES"/>
+        </w:rPr>
+        <w:t xml:space="preserve"> </w:t>
+      </w:r>
+      <w:proofErr w:type="spellStart"/>
+      <w:r>
+        <w:rPr>
+          <w:lang w:val="es-ES"/>
+        </w:rPr>
+        <w:t>two</w:t>
+      </w:r>
+      <w:proofErr w:type="spellEnd"/>
+      <w:r>
+        <w:rPr>
+          <w:lang w:val="es-ES"/>
+        </w:rPr>
+        <w:t xml:space="preserve"> </w:t>
+      </w:r>
+      <w:proofErr w:type="spellStart"/>
+      <w:r>
+        <w:rPr>
+          <w:lang w:val="es-ES"/>
+        </w:rPr>
+        <w:t>EditText</w:t>
+      </w:r>
+      <w:proofErr w:type="spellEnd"/>
+      <w:r>
+        <w:rPr>
+          <w:lang w:val="es-ES"/>
+        </w:rPr>
+        <w:t xml:space="preserve"> inputs </w:t>
+      </w:r>
+      <w:proofErr w:type="spellStart"/>
+      <w:r>
+        <w:rPr>
+          <w:lang w:val="es-ES"/>
+        </w:rPr>
+        <w:t>for</w:t>
+      </w:r>
+      <w:proofErr w:type="spellEnd"/>
+      <w:r>
+        <w:rPr>
+          <w:lang w:val="es-ES"/>
+        </w:rPr>
+        <w:t xml:space="preserve"> </w:t>
+      </w:r>
+      <w:proofErr w:type="spellStart"/>
+      <w:r>
+        <w:rPr>
+          <w:lang w:val="es-ES"/>
+        </w:rPr>
+        <w:t>the</w:t>
+      </w:r>
+      <w:proofErr w:type="spellEnd"/>
+      <w:r>
+        <w:rPr>
+          <w:lang w:val="es-ES"/>
+        </w:rPr>
+        <w:t xml:space="preserve"> home and </w:t>
+      </w:r>
+      <w:proofErr w:type="spellStart"/>
+      <w:r>
+        <w:rPr>
+          <w:lang w:val="es-ES"/>
+        </w:rPr>
+        <w:t>away</w:t>
+      </w:r>
+      <w:proofErr w:type="spellEnd"/>
+      <w:r>
+        <w:rPr>
+          <w:lang w:val="es-ES"/>
+        </w:rPr>
+        <w:t xml:space="preserve"> </w:t>
+      </w:r>
+      <w:proofErr w:type="spellStart"/>
+      <w:r>
+        <w:rPr>
+          <w:lang w:val="es-ES"/>
+        </w:rPr>
+        <w:t>team</w:t>
+      </w:r>
+      <w:proofErr w:type="spellEnd"/>
+      <w:r>
+        <w:rPr>
+          <w:lang w:val="es-ES"/>
+        </w:rPr>
+        <w:t xml:space="preserve"> </w:t>
+      </w:r>
+      <w:proofErr w:type="spellStart"/>
+      <w:r>
+        <w:rPr>
+          <w:lang w:val="es-ES"/>
+        </w:rPr>
+        <w:t>names</w:t>
+      </w:r>
+      <w:proofErr w:type="spellEnd"/>
+      <w:r>
+        <w:rPr>
+          <w:lang w:val="es-ES"/>
+        </w:rPr>
+        <w:t xml:space="preserve">, descriptive </w:t>
+      </w:r>
+      <w:proofErr w:type="spellStart"/>
+      <w:r>
+        <w:rPr>
+          <w:lang w:val="es-ES"/>
+        </w:rPr>
+        <w:t>labels</w:t>
+      </w:r>
+      <w:proofErr w:type="spellEnd"/>
+      <w:r>
+        <w:rPr>
+          <w:lang w:val="es-ES"/>
+        </w:rPr>
+        <w:t xml:space="preserve">, and a </w:t>
+      </w:r>
+      <w:proofErr w:type="spellStart"/>
+      <w:r>
+        <w:rPr>
+          <w:lang w:val="es-ES"/>
+        </w:rPr>
+        <w:t>button</w:t>
+      </w:r>
+      <w:proofErr w:type="spellEnd"/>
+      <w:r>
+        <w:rPr>
+          <w:lang w:val="es-ES"/>
+        </w:rPr>
+        <w:t xml:space="preserve"> </w:t>
+      </w:r>
+      <w:proofErr w:type="spellStart"/>
+      <w:r>
+        <w:rPr>
+          <w:lang w:val="es-ES"/>
+        </w:rPr>
+        <w:t>to</w:t>
+      </w:r>
+      <w:proofErr w:type="spellEnd"/>
+      <w:r>
+        <w:rPr>
+          <w:lang w:val="es-ES"/>
+        </w:rPr>
+        <w:t xml:space="preserve"> </w:t>
+      </w:r>
+      <w:proofErr w:type="spellStart"/>
+      <w:r>
+        <w:rPr>
+          <w:lang w:val="es-ES"/>
+        </w:rPr>
+        <w:t>initiate</w:t>
+      </w:r>
+      <w:proofErr w:type="spellEnd"/>
+      <w:r>
+        <w:rPr>
+          <w:lang w:val="es-ES"/>
+        </w:rPr>
+        <w:t xml:space="preserve"> </w:t>
+      </w:r>
+      <w:proofErr w:type="spellStart"/>
+      <w:r>
+        <w:rPr>
+          <w:lang w:val="es-ES"/>
+        </w:rPr>
+        <w:t>the</w:t>
+      </w:r>
+      <w:proofErr w:type="spellEnd"/>
+      <w:r>
+        <w:rPr>
+          <w:lang w:val="es-ES"/>
+        </w:rPr>
+        <w:t xml:space="preserve"> match. In </w:t>
+      </w:r>
+      <w:proofErr w:type="spellStart"/>
+      <w:r>
+        <w:rPr>
+          <w:lang w:val="es-ES"/>
+        </w:rPr>
+        <w:t>the</w:t>
+      </w:r>
+      <w:proofErr w:type="spellEnd"/>
+      <w:r>
+        <w:rPr>
+          <w:lang w:val="es-ES"/>
+        </w:rPr>
+        <w:t xml:space="preserve"> Java </w:t>
+      </w:r>
+      <w:proofErr w:type="spellStart"/>
+      <w:r>
+        <w:rPr>
+          <w:lang w:val="es-ES"/>
+        </w:rPr>
+        <w:t>code</w:t>
+      </w:r>
+      <w:proofErr w:type="spellEnd"/>
+      <w:r>
+        <w:rPr>
+          <w:lang w:val="es-ES"/>
+        </w:rPr>
+        <w:t xml:space="preserve">, I </w:t>
+      </w:r>
+      <w:proofErr w:type="spellStart"/>
+      <w:r>
+        <w:rPr>
+          <w:lang w:val="es-ES"/>
+        </w:rPr>
+        <w:t>implemented</w:t>
+      </w:r>
+      <w:proofErr w:type="spellEnd"/>
+      <w:r>
+        <w:rPr>
+          <w:lang w:val="es-ES"/>
+        </w:rPr>
+        <w:t xml:space="preserve"> input </w:t>
+      </w:r>
+      <w:proofErr w:type="spellStart"/>
+      <w:r>
+        <w:rPr>
+          <w:lang w:val="es-ES"/>
+        </w:rPr>
+        <w:t>validation</w:t>
+      </w:r>
+      <w:proofErr w:type="spellEnd"/>
+      <w:r>
+        <w:rPr>
+          <w:lang w:val="es-ES"/>
+        </w:rPr>
+        <w:t xml:space="preserve"> </w:t>
+      </w:r>
+      <w:proofErr w:type="spellStart"/>
+      <w:r>
+        <w:rPr>
+          <w:lang w:val="es-ES"/>
+        </w:rPr>
+        <w:t>logic</w:t>
+      </w:r>
+      <w:proofErr w:type="spellEnd"/>
+      <w:r>
+        <w:rPr>
+          <w:lang w:val="es-ES"/>
+        </w:rPr>
+        <w:t xml:space="preserve"> </w:t>
+      </w:r>
+      <w:proofErr w:type="spellStart"/>
+      <w:r>
+        <w:rPr>
+          <w:lang w:val="es-ES"/>
+        </w:rPr>
+        <w:t>to</w:t>
+      </w:r>
+      <w:proofErr w:type="spellEnd"/>
+      <w:r>
+        <w:rPr>
+          <w:lang w:val="es-ES"/>
+        </w:rPr>
+        <w:t xml:space="preserve"> </w:t>
+      </w:r>
+      <w:proofErr w:type="spellStart"/>
+      <w:r>
+        <w:rPr>
+          <w:lang w:val="es-ES"/>
+        </w:rPr>
+        <w:t>verify</w:t>
+      </w:r>
+      <w:proofErr w:type="spellEnd"/>
+      <w:r>
+        <w:rPr>
+          <w:lang w:val="es-ES"/>
+        </w:rPr>
+        <w:t xml:space="preserve"> </w:t>
+      </w:r>
+      <w:proofErr w:type="spellStart"/>
+      <w:r>
+        <w:rPr>
+          <w:lang w:val="es-ES"/>
+        </w:rPr>
+        <w:t>that</w:t>
+      </w:r>
+      <w:proofErr w:type="spellEnd"/>
+      <w:r>
+        <w:rPr>
+          <w:lang w:val="es-ES"/>
+        </w:rPr>
+        <w:t xml:space="preserve"> </w:t>
+      </w:r>
+      <w:proofErr w:type="spellStart"/>
+      <w:r>
+        <w:rPr>
+          <w:lang w:val="es-ES"/>
+        </w:rPr>
+        <w:t>neither</w:t>
+      </w:r>
+      <w:proofErr w:type="spellEnd"/>
+      <w:r>
+        <w:rPr>
+          <w:lang w:val="es-ES"/>
+        </w:rPr>
+        <w:t xml:space="preserve"> </w:t>
+      </w:r>
+      <w:proofErr w:type="spellStart"/>
+      <w:r>
+        <w:rPr>
+          <w:lang w:val="es-ES"/>
+        </w:rPr>
+        <w:t>team</w:t>
+      </w:r>
+      <w:proofErr w:type="spellEnd"/>
+      <w:r>
+        <w:rPr>
+          <w:lang w:val="es-ES"/>
+        </w:rPr>
+        <w:t xml:space="preserve"> </w:t>
+      </w:r>
+      <w:proofErr w:type="spellStart"/>
+      <w:r>
+        <w:rPr>
+          <w:lang w:val="es-ES"/>
+        </w:rPr>
+        <w:t>name</w:t>
+      </w:r>
+      <w:proofErr w:type="spellEnd"/>
+      <w:r>
+        <w:rPr>
+          <w:lang w:val="es-ES"/>
+        </w:rPr>
+        <w:t xml:space="preserve"> </w:t>
+      </w:r>
+      <w:proofErr w:type="spellStart"/>
+      <w:r>
+        <w:rPr>
+          <w:lang w:val="es-ES"/>
+        </w:rPr>
+        <w:t>was</w:t>
+      </w:r>
+      <w:proofErr w:type="spellEnd"/>
+      <w:r>
+        <w:rPr>
+          <w:lang w:val="es-ES"/>
+        </w:rPr>
+        <w:t xml:space="preserve"> </w:t>
+      </w:r>
+      <w:proofErr w:type="spellStart"/>
+      <w:r>
+        <w:rPr>
+          <w:lang w:val="es-ES"/>
+        </w:rPr>
+        <w:t>left</w:t>
+      </w:r>
+      <w:proofErr w:type="spellEnd"/>
+      <w:r>
+        <w:rPr>
+          <w:lang w:val="es-ES"/>
+        </w:rPr>
+        <w:t xml:space="preserve"> </w:t>
+      </w:r>
+      <w:proofErr w:type="spellStart"/>
+      <w:r>
+        <w:rPr>
+          <w:lang w:val="es-ES"/>
+        </w:rPr>
+        <w:t>blank</w:t>
+      </w:r>
+      <w:proofErr w:type="spellEnd"/>
+      <w:r>
+        <w:rPr>
+          <w:lang w:val="es-ES"/>
+        </w:rPr>
+        <w:t xml:space="preserve"> </w:t>
+      </w:r>
+      <w:proofErr w:type="spellStart"/>
+      <w:r>
+        <w:rPr>
+          <w:lang w:val="es-ES"/>
+        </w:rPr>
+        <w:t>before</w:t>
+      </w:r>
+      <w:proofErr w:type="spellEnd"/>
+      <w:r>
+        <w:rPr>
+          <w:lang w:val="es-ES"/>
+        </w:rPr>
+        <w:t xml:space="preserve"> </w:t>
+      </w:r>
+      <w:proofErr w:type="spellStart"/>
+      <w:r>
+        <w:rPr>
+          <w:lang w:val="es-ES"/>
+        </w:rPr>
+        <w:t>proceeding</w:t>
+      </w:r>
+      <w:proofErr w:type="spellEnd"/>
+      <w:r>
+        <w:rPr>
+          <w:lang w:val="es-ES"/>
+        </w:rPr>
+        <w:t xml:space="preserve">. </w:t>
+      </w:r>
+      <w:proofErr w:type="spellStart"/>
+      <w:r>
+        <w:rPr>
+          <w:lang w:val="es-ES"/>
+        </w:rPr>
+        <w:t>Finally</w:t>
+      </w:r>
+      <w:proofErr w:type="spellEnd"/>
+      <w:r>
+        <w:rPr>
+          <w:lang w:val="es-ES"/>
+        </w:rPr>
+        <w:t xml:space="preserve">, I </w:t>
+      </w:r>
+      <w:proofErr w:type="spellStart"/>
+      <w:r>
+        <w:rPr>
+          <w:lang w:val="es-ES"/>
+        </w:rPr>
+        <w:t>configured</w:t>
+      </w:r>
+      <w:proofErr w:type="spellEnd"/>
+      <w:r>
+        <w:rPr>
+          <w:lang w:val="es-ES"/>
+        </w:rPr>
+        <w:t xml:space="preserve"> </w:t>
+      </w:r>
+      <w:proofErr w:type="spellStart"/>
+      <w:r>
+        <w:rPr>
+          <w:lang w:val="es-ES"/>
+        </w:rPr>
+        <w:t>an</w:t>
+      </w:r>
+      <w:proofErr w:type="spellEnd"/>
+      <w:r>
+        <w:rPr>
+          <w:lang w:val="es-ES"/>
+        </w:rPr>
+        <w:t xml:space="preserve"> </w:t>
+      </w:r>
+      <w:proofErr w:type="spellStart"/>
+      <w:r>
+        <w:rPr>
+          <w:lang w:val="es-ES"/>
+        </w:rPr>
+        <w:t>explicit</w:t>
+      </w:r>
+      <w:proofErr w:type="spellEnd"/>
+      <w:r>
+        <w:rPr>
+          <w:lang w:val="es-ES"/>
+        </w:rPr>
+        <w:t xml:space="preserve"> </w:t>
+      </w:r>
+      <w:proofErr w:type="spellStart"/>
+      <w:r>
+        <w:rPr>
+          <w:lang w:val="es-ES"/>
+        </w:rPr>
+        <w:t>Intent</w:t>
+      </w:r>
+      <w:proofErr w:type="spellEnd"/>
+      <w:r>
+        <w:rPr>
+          <w:lang w:val="es-ES"/>
+        </w:rPr>
+        <w:t xml:space="preserve"> </w:t>
+      </w:r>
+      <w:proofErr w:type="spellStart"/>
+      <w:r>
+        <w:rPr>
+          <w:lang w:val="es-ES"/>
+        </w:rPr>
+        <w:t>to</w:t>
+      </w:r>
+      <w:proofErr w:type="spellEnd"/>
+      <w:r>
+        <w:rPr>
+          <w:lang w:val="es-ES"/>
+        </w:rPr>
+        <w:t xml:space="preserve"> </w:t>
+      </w:r>
+      <w:proofErr w:type="spellStart"/>
+      <w:r>
+        <w:rPr>
+          <w:lang w:val="es-ES"/>
+        </w:rPr>
+        <w:t>handle</w:t>
+      </w:r>
+      <w:proofErr w:type="spellEnd"/>
+      <w:r>
+        <w:rPr>
+          <w:lang w:val="es-ES"/>
+        </w:rPr>
+        <w:t xml:space="preserve"> </w:t>
+      </w:r>
+      <w:proofErr w:type="spellStart"/>
+      <w:r>
+        <w:rPr>
+          <w:lang w:val="es-ES"/>
+        </w:rPr>
+        <w:t>navigation</w:t>
+      </w:r>
+      <w:proofErr w:type="spellEnd"/>
+      <w:r>
+        <w:rPr>
+          <w:lang w:val="es-ES"/>
+        </w:rPr>
+        <w:t xml:space="preserve"> </w:t>
+      </w:r>
+      <w:proofErr w:type="spellStart"/>
+      <w:r>
+        <w:rPr>
+          <w:lang w:val="es-ES"/>
+        </w:rPr>
+        <w:t>to</w:t>
+      </w:r>
+      <w:proofErr w:type="spellEnd"/>
+      <w:r>
+        <w:rPr>
+          <w:lang w:val="es-ES"/>
+        </w:rPr>
+        <w:t xml:space="preserve"> </w:t>
+      </w:r>
+      <w:proofErr w:type="spellStart"/>
+      <w:r>
+        <w:rPr>
+          <w:lang w:val="es-ES"/>
+        </w:rPr>
+        <w:t>the</w:t>
+      </w:r>
+      <w:proofErr w:type="spellEnd"/>
+      <w:r>
+        <w:rPr>
+          <w:lang w:val="es-ES"/>
+        </w:rPr>
+        <w:t xml:space="preserve"> </w:t>
+      </w:r>
+      <w:proofErr w:type="spellStart"/>
+      <w:r>
+        <w:rPr>
+          <w:lang w:val="es-ES"/>
+        </w:rPr>
+        <w:t>live</w:t>
+      </w:r>
+      <w:proofErr w:type="spellEnd"/>
+      <w:r>
+        <w:rPr>
+          <w:lang w:val="es-ES"/>
+        </w:rPr>
+        <w:t xml:space="preserve"> match </w:t>
+      </w:r>
+      <w:proofErr w:type="spellStart"/>
+      <w:r>
+        <w:rPr>
+          <w:lang w:val="es-ES"/>
+        </w:rPr>
+        <w:t>screen</w:t>
+      </w:r>
+      <w:proofErr w:type="spellEnd"/>
+      <w:r>
+        <w:rPr>
+          <w:lang w:val="es-ES"/>
+        </w:rPr>
+        <w:t xml:space="preserve">, passing </w:t>
+      </w:r>
+      <w:proofErr w:type="spellStart"/>
+      <w:r>
+        <w:rPr>
+          <w:lang w:val="es-ES"/>
+        </w:rPr>
+        <w:t>both</w:t>
+      </w:r>
+      <w:proofErr w:type="spellEnd"/>
+      <w:r>
+        <w:rPr>
+          <w:lang w:val="es-ES"/>
+        </w:rPr>
+        <w:t xml:space="preserve"> </w:t>
+      </w:r>
+      <w:proofErr w:type="spellStart"/>
+      <w:r>
+        <w:rPr>
+          <w:lang w:val="es-ES"/>
+        </w:rPr>
+        <w:t>team</w:t>
+      </w:r>
+      <w:proofErr w:type="spellEnd"/>
+      <w:r>
+        <w:rPr>
+          <w:lang w:val="es-ES"/>
+        </w:rPr>
+        <w:t xml:space="preserve"> </w:t>
+      </w:r>
+      <w:proofErr w:type="spellStart"/>
+      <w:r>
+        <w:rPr>
+          <w:lang w:val="es-ES"/>
+        </w:rPr>
+        <w:t>names</w:t>
+      </w:r>
+      <w:proofErr w:type="spellEnd"/>
+      <w:r>
+        <w:rPr>
+          <w:lang w:val="es-ES"/>
+        </w:rPr>
+        <w:t xml:space="preserve"> </w:t>
+      </w:r>
+      <w:proofErr w:type="spellStart"/>
+      <w:r>
+        <w:rPr>
+          <w:lang w:val="es-ES"/>
+        </w:rPr>
+        <w:t>via</w:t>
+      </w:r>
+      <w:proofErr w:type="spellEnd"/>
+      <w:r>
+        <w:rPr>
+          <w:lang w:val="es-ES"/>
+        </w:rPr>
+        <w:t xml:space="preserve"> </w:t>
+      </w:r>
+      <w:proofErr w:type="spellStart"/>
+      <w:r>
+        <w:rPr>
+          <w:lang w:val="es-ES"/>
+        </w:rPr>
+        <w:t>bundle</w:t>
+      </w:r>
+      <w:proofErr w:type="spellEnd"/>
+      <w:r>
+        <w:rPr>
+          <w:lang w:val="es-ES"/>
+        </w:rPr>
+        <w:t xml:space="preserve"> extras.</w:t>
+      </w:r>
+    </w:p>
+    <w:p>
+      <w:pPr>
+        <w:pStyle w:val="Textoindependiente"/>
+        <w:rPr>
+          <w:lang w:val="es-ES"/>
+        </w:rPr>
+      </w:pPr>
+    </w:p>
+    <w:p>
+      <w:pPr>
+        <w:pStyle w:val="Textoindependiente"/>
+        <w:rPr>
+          <w:lang w:val="es-ES"/>
+        </w:rPr>
+      </w:pPr>
+      <w:r>
+        <w:rPr>
+          <w:b/>
+          <w:bCs/>
+          <w:lang w:val="es-ES"/>
+        </w:rPr>
+        <w:t>15.9.2026</w:t>
+      </w:r>
+    </w:p>
+    <w:p>
+      <w:pPr>
+        <w:pStyle w:val="Textoindependiente"/>
+        <w:rPr>
+          <w:lang w:val="es-ES"/>
+        </w:rPr>
+      </w:pPr>
+      <w:r>
+        <w:rPr>
+          <w:lang w:val="es-ES"/>
+        </w:rPr>
+        <w:t xml:space="preserve">I </w:t>
+      </w:r>
+      <w:proofErr w:type="spellStart"/>
+      <w:r>
+        <w:rPr>
+          <w:lang w:val="es-ES"/>
+        </w:rPr>
+        <w:t>focused</w:t>
+      </w:r>
+      <w:proofErr w:type="spellEnd"/>
+      <w:r>
+        <w:rPr>
+          <w:lang w:val="es-ES"/>
+        </w:rPr>
+        <w:t xml:space="preserve"> </w:t>
+      </w:r>
+      <w:proofErr w:type="spellStart"/>
+      <w:r>
+        <w:rPr>
+          <w:lang w:val="es-ES"/>
+        </w:rPr>
+        <w:t>on</w:t>
+      </w:r>
+      <w:proofErr w:type="spellEnd"/>
+      <w:r>
+        <w:rPr>
+          <w:lang w:val="es-ES"/>
+        </w:rPr>
+        <w:t xml:space="preserve"> </w:t>
+      </w:r>
+      <w:proofErr w:type="spellStart"/>
+      <w:r>
+        <w:rPr>
+          <w:lang w:val="es-ES"/>
+        </w:rPr>
+        <w:t>developing</w:t>
+      </w:r>
+      <w:proofErr w:type="spellEnd"/>
+      <w:r>
+        <w:rPr>
+          <w:lang w:val="es-ES"/>
+        </w:rPr>
+        <w:t xml:space="preserve"> </w:t>
+      </w:r>
+      <w:proofErr w:type="spellStart"/>
+      <w:r>
+        <w:rPr>
+          <w:lang w:val="es-ES"/>
+        </w:rPr>
+        <w:t>the</w:t>
+      </w:r>
+      <w:proofErr w:type="spellEnd"/>
+      <w:r>
+        <w:rPr>
+          <w:lang w:val="es-ES"/>
+        </w:rPr>
+        <w:t xml:space="preserve"> </w:t>
+      </w:r>
+      <w:proofErr w:type="spellStart"/>
+      <w:r>
+        <w:rPr>
+          <w:lang w:val="es-ES"/>
+        </w:rPr>
+        <w:t>second</w:t>
+      </w:r>
+      <w:proofErr w:type="spellEnd"/>
+      <w:r>
+        <w:rPr>
+          <w:lang w:val="es-ES"/>
+        </w:rPr>
+        <w:t xml:space="preserve"> </w:t>
+      </w:r>
+      <w:proofErr w:type="spellStart"/>
+      <w:r>
+        <w:rPr>
+          <w:lang w:val="es-ES"/>
+        </w:rPr>
+        <w:t>screen</w:t>
+      </w:r>
+      <w:proofErr w:type="spellEnd"/>
+      <w:r>
+        <w:rPr>
+          <w:lang w:val="es-ES"/>
+        </w:rPr>
+        <w:t xml:space="preserve"> </w:t>
+      </w:r>
+      <w:proofErr w:type="spellStart"/>
+      <w:r>
+        <w:rPr>
+          <w:lang w:val="es-ES"/>
+        </w:rPr>
+        <w:t>of</w:t>
+      </w:r>
+      <w:proofErr w:type="spellEnd"/>
+      <w:r>
+        <w:rPr>
+          <w:lang w:val="es-ES"/>
+        </w:rPr>
+        <w:t xml:space="preserve"> </w:t>
+      </w:r>
+      <w:proofErr w:type="spellStart"/>
+      <w:r>
+        <w:rPr>
+          <w:lang w:val="es-ES"/>
+        </w:rPr>
+        <w:t>the</w:t>
+      </w:r>
+      <w:proofErr w:type="spellEnd"/>
+      <w:r>
+        <w:rPr>
+          <w:lang w:val="es-ES"/>
+        </w:rPr>
+        <w:t xml:space="preserve"> </w:t>
+      </w:r>
+      <w:proofErr w:type="spellStart"/>
+      <w:r>
+        <w:rPr>
+          <w:lang w:val="es-ES"/>
+        </w:rPr>
+        <w:t>application</w:t>
+      </w:r>
+      <w:proofErr w:type="spellEnd"/>
+      <w:r>
+        <w:rPr>
+          <w:lang w:val="es-ES"/>
+        </w:rPr>
+        <w:t xml:space="preserve">, </w:t>
+      </w:r>
+      <w:proofErr w:type="spellStart"/>
+      <w:r>
+        <w:rPr>
+          <w:lang w:val="es-ES"/>
+        </w:rPr>
+        <w:t>MatchActivity</w:t>
+      </w:r>
+      <w:proofErr w:type="spellEnd"/>
+      <w:r>
+        <w:rPr>
+          <w:lang w:val="es-ES"/>
+        </w:rPr>
+        <w:t xml:space="preserve">, </w:t>
+      </w:r>
+      <w:proofErr w:type="spellStart"/>
+      <w:r>
+        <w:rPr>
+          <w:lang w:val="es-ES"/>
+        </w:rPr>
+        <w:t>which</w:t>
+      </w:r>
+      <w:proofErr w:type="spellEnd"/>
+      <w:r>
+        <w:rPr>
+          <w:lang w:val="es-ES"/>
+        </w:rPr>
+        <w:t xml:space="preserve"> </w:t>
+      </w:r>
+      <w:proofErr w:type="spellStart"/>
+      <w:r>
+        <w:rPr>
+          <w:lang w:val="es-ES"/>
+        </w:rPr>
+        <w:t>acts</w:t>
+      </w:r>
+      <w:proofErr w:type="spellEnd"/>
+      <w:r>
+        <w:rPr>
+          <w:lang w:val="es-ES"/>
+        </w:rPr>
+        <w:t xml:space="preserve"> as </w:t>
+      </w:r>
+      <w:proofErr w:type="spellStart"/>
+      <w:r>
+        <w:rPr>
+          <w:lang w:val="es-ES"/>
+        </w:rPr>
+        <w:t>the</w:t>
+      </w:r>
+      <w:proofErr w:type="spellEnd"/>
+      <w:r>
+        <w:rPr>
+          <w:lang w:val="es-ES"/>
+        </w:rPr>
+        <w:t xml:space="preserve"> </w:t>
+      </w:r>
+      <w:proofErr w:type="spellStart"/>
+      <w:r>
+        <w:rPr>
+          <w:lang w:val="es-ES"/>
+        </w:rPr>
+        <w:t>live</w:t>
+      </w:r>
+      <w:proofErr w:type="spellEnd"/>
+      <w:r>
+        <w:rPr>
+          <w:lang w:val="es-ES"/>
+        </w:rPr>
+        <w:t xml:space="preserve"> control center </w:t>
+      </w:r>
+      <w:proofErr w:type="spellStart"/>
+      <w:r>
+        <w:rPr>
+          <w:lang w:val="es-ES"/>
+        </w:rPr>
+        <w:t>during</w:t>
+      </w:r>
+      <w:proofErr w:type="spellEnd"/>
+      <w:r>
+        <w:rPr>
+          <w:lang w:val="es-ES"/>
+        </w:rPr>
+        <w:t xml:space="preserve"> a match. I </w:t>
+      </w:r>
+      <w:proofErr w:type="spellStart"/>
+      <w:r>
+        <w:rPr>
+          <w:lang w:val="es-ES"/>
+        </w:rPr>
+        <w:t>constructed</w:t>
+      </w:r>
+      <w:proofErr w:type="spellEnd"/>
+      <w:r>
+        <w:rPr>
+          <w:lang w:val="es-ES"/>
+        </w:rPr>
+        <w:t xml:space="preserve"> a </w:t>
+      </w:r>
+      <w:proofErr w:type="spellStart"/>
+      <w:r>
+        <w:rPr>
+          <w:lang w:val="es-ES"/>
+        </w:rPr>
+        <w:t>live</w:t>
+      </w:r>
+      <w:proofErr w:type="spellEnd"/>
+      <w:r>
+        <w:rPr>
+          <w:lang w:val="es-ES"/>
+        </w:rPr>
+        <w:t xml:space="preserve"> </w:t>
+      </w:r>
+      <w:proofErr w:type="spellStart"/>
+      <w:r>
+        <w:rPr>
+          <w:lang w:val="es-ES"/>
+        </w:rPr>
+        <w:t>scoreboard</w:t>
+      </w:r>
+      <w:proofErr w:type="spellEnd"/>
+      <w:r>
+        <w:rPr>
+          <w:lang w:val="es-ES"/>
+        </w:rPr>
+        <w:t xml:space="preserve"> </w:t>
+      </w:r>
+      <w:proofErr w:type="spellStart"/>
+      <w:r>
+        <w:rPr>
+          <w:lang w:val="es-ES"/>
+        </w:rPr>
+        <w:t>showing</w:t>
+      </w:r>
+      <w:proofErr w:type="spellEnd"/>
+      <w:r>
+        <w:rPr>
+          <w:lang w:val="es-ES"/>
+        </w:rPr>
+        <w:t xml:space="preserve"> </w:t>
+      </w:r>
+      <w:proofErr w:type="spellStart"/>
+      <w:r>
+        <w:rPr>
+          <w:lang w:val="es-ES"/>
+        </w:rPr>
+        <w:t>team</w:t>
+      </w:r>
+      <w:proofErr w:type="spellEnd"/>
+      <w:r>
+        <w:rPr>
+          <w:lang w:val="es-ES"/>
+        </w:rPr>
+        <w:t xml:space="preserve"> </w:t>
+      </w:r>
+      <w:proofErr w:type="spellStart"/>
+      <w:r>
+        <w:rPr>
+          <w:lang w:val="es-ES"/>
+        </w:rPr>
+        <w:t>names</w:t>
+      </w:r>
+      <w:proofErr w:type="spellEnd"/>
+      <w:r>
+        <w:rPr>
+          <w:lang w:val="es-ES"/>
+        </w:rPr>
+        <w:t xml:space="preserve"> and </w:t>
+      </w:r>
+      <w:proofErr w:type="spellStart"/>
+      <w:r>
+        <w:rPr>
+          <w:lang w:val="es-ES"/>
+        </w:rPr>
+        <w:t>dynamic</w:t>
+      </w:r>
+      <w:proofErr w:type="spellEnd"/>
+      <w:r>
+        <w:rPr>
+          <w:lang w:val="es-ES"/>
+        </w:rPr>
+        <w:t xml:space="preserve"> </w:t>
+      </w:r>
+      <w:proofErr w:type="spellStart"/>
+      <w:r>
+        <w:rPr>
+          <w:lang w:val="es-ES"/>
+        </w:rPr>
+        <w:t>goal</w:t>
+      </w:r>
+      <w:proofErr w:type="spellEnd"/>
+      <w:r>
+        <w:rPr>
+          <w:lang w:val="es-ES"/>
+        </w:rPr>
+        <w:t xml:space="preserve"> </w:t>
+      </w:r>
+      <w:proofErr w:type="spellStart"/>
+      <w:r>
+        <w:rPr>
+          <w:lang w:val="es-ES"/>
+        </w:rPr>
+        <w:t>counters</w:t>
+      </w:r>
+      <w:proofErr w:type="spellEnd"/>
+      <w:r>
+        <w:rPr>
+          <w:lang w:val="es-ES"/>
+        </w:rPr>
+        <w:t xml:space="preserve"> </w:t>
+      </w:r>
+      <w:proofErr w:type="spellStart"/>
+      <w:r>
+        <w:rPr>
+          <w:lang w:val="es-ES"/>
+        </w:rPr>
+        <w:t>that</w:t>
+      </w:r>
+      <w:proofErr w:type="spellEnd"/>
+      <w:r>
+        <w:rPr>
+          <w:lang w:val="es-ES"/>
+        </w:rPr>
+        <w:t xml:space="preserve"> </w:t>
+      </w:r>
+      <w:proofErr w:type="spellStart"/>
+      <w:r>
+        <w:rPr>
+          <w:lang w:val="es-ES"/>
+        </w:rPr>
+        <w:t>update</w:t>
+      </w:r>
+      <w:proofErr w:type="spellEnd"/>
+      <w:r>
+        <w:rPr>
+          <w:lang w:val="es-ES"/>
+        </w:rPr>
+        <w:t xml:space="preserve"> </w:t>
+      </w:r>
+      <w:proofErr w:type="spellStart"/>
+      <w:r>
+        <w:rPr>
+          <w:lang w:val="es-ES"/>
+        </w:rPr>
+        <w:t>whenever</w:t>
+      </w:r>
+      <w:proofErr w:type="spellEnd"/>
+      <w:r>
+        <w:rPr>
+          <w:lang w:val="es-ES"/>
+        </w:rPr>
+        <w:t xml:space="preserve"> a </w:t>
+      </w:r>
+      <w:proofErr w:type="spellStart"/>
+      <w:r>
+        <w:rPr>
+          <w:lang w:val="es-ES"/>
+        </w:rPr>
+        <w:t>team</w:t>
+      </w:r>
+      <w:proofErr w:type="spellEnd"/>
+      <w:r>
+        <w:rPr>
+          <w:lang w:val="es-ES"/>
+        </w:rPr>
+        <w:t xml:space="preserve"> scores.</w:t>
+      </w:r>
+    </w:p>
+    <w:p>
+      <w:pPr>
+        <w:pStyle w:val="Textoindependiente"/>
+        <w:rPr>
+          <w:lang w:val="es-ES"/>
+        </w:rPr>
+      </w:pPr>
+      <w:r>
+        <w:rPr>
+          <w:lang w:val="es-ES"/>
+        </w:rPr>
+        <w:t xml:space="preserve">A </w:t>
+      </w:r>
+      <w:proofErr w:type="spellStart"/>
+      <w:r>
+        <w:rPr>
+          <w:lang w:val="es-ES"/>
+        </w:rPr>
+        <w:t>major</w:t>
+      </w:r>
+      <w:proofErr w:type="spellEnd"/>
+      <w:r>
+        <w:rPr>
+          <w:lang w:val="es-ES"/>
+        </w:rPr>
+        <w:t xml:space="preserve"> </w:t>
+      </w:r>
+      <w:proofErr w:type="spellStart"/>
+      <w:r>
+        <w:rPr>
+          <w:lang w:val="es-ES"/>
+        </w:rPr>
+        <w:t>feature</w:t>
+      </w:r>
+      <w:proofErr w:type="spellEnd"/>
+      <w:r>
+        <w:rPr>
+          <w:lang w:val="es-ES"/>
+        </w:rPr>
+        <w:t xml:space="preserve"> I </w:t>
+      </w:r>
+      <w:proofErr w:type="spellStart"/>
+      <w:r>
+        <w:rPr>
+          <w:lang w:val="es-ES"/>
+        </w:rPr>
+        <w:t>implemented</w:t>
+      </w:r>
+      <w:proofErr w:type="spellEnd"/>
+      <w:r>
+        <w:rPr>
+          <w:lang w:val="es-ES"/>
+        </w:rPr>
+        <w:t xml:space="preserve"> </w:t>
+      </w:r>
+      <w:proofErr w:type="spellStart"/>
+      <w:r>
+        <w:rPr>
+          <w:lang w:val="es-ES"/>
+        </w:rPr>
+        <w:t>today</w:t>
+      </w:r>
+      <w:proofErr w:type="spellEnd"/>
+      <w:r>
+        <w:rPr>
+          <w:lang w:val="es-ES"/>
+        </w:rPr>
+        <w:t xml:space="preserve"> </w:t>
+      </w:r>
+      <w:proofErr w:type="spellStart"/>
+      <w:r>
+        <w:rPr>
+          <w:lang w:val="es-ES"/>
+        </w:rPr>
+        <w:t>was</w:t>
+      </w:r>
+      <w:proofErr w:type="spellEnd"/>
+      <w:r>
+        <w:rPr>
+          <w:lang w:val="es-ES"/>
+        </w:rPr>
+        <w:t xml:space="preserve"> </w:t>
+      </w:r>
+      <w:proofErr w:type="spellStart"/>
+      <w:r>
+        <w:rPr>
+          <w:lang w:val="es-ES"/>
+        </w:rPr>
+        <w:t>an</w:t>
+      </w:r>
+      <w:proofErr w:type="spellEnd"/>
+      <w:r>
+        <w:rPr>
+          <w:lang w:val="es-ES"/>
+        </w:rPr>
+        <w:t xml:space="preserve"> active match </w:t>
+      </w:r>
+      <w:proofErr w:type="spellStart"/>
+      <w:r>
+        <w:rPr>
+          <w:lang w:val="es-ES"/>
+        </w:rPr>
+        <w:t>timer</w:t>
+      </w:r>
+      <w:proofErr w:type="spellEnd"/>
+      <w:r>
+        <w:rPr>
+          <w:lang w:val="es-ES"/>
+        </w:rPr>
+        <w:t xml:space="preserve"> </w:t>
+      </w:r>
+      <w:proofErr w:type="spellStart"/>
+      <w:r>
+        <w:rPr>
+          <w:lang w:val="es-ES"/>
+        </w:rPr>
+        <w:t>using</w:t>
+      </w:r>
+      <w:proofErr w:type="spellEnd"/>
+      <w:r>
+        <w:rPr>
+          <w:lang w:val="es-ES"/>
+        </w:rPr>
+        <w:t xml:space="preserve"> </w:t>
+      </w:r>
+      <w:proofErr w:type="spellStart"/>
+      <w:r>
+        <w:rPr>
+          <w:lang w:val="es-ES"/>
+        </w:rPr>
+        <w:t>Android's</w:t>
+      </w:r>
+      <w:proofErr w:type="spellEnd"/>
+      <w:r>
+        <w:rPr>
+          <w:lang w:val="es-ES"/>
+        </w:rPr>
+        <w:t xml:space="preserve"> </w:t>
+      </w:r>
+      <w:proofErr w:type="spellStart"/>
+      <w:r>
+        <w:rPr>
+          <w:lang w:val="es-ES"/>
+        </w:rPr>
+        <w:t>Chronometer</w:t>
+      </w:r>
+      <w:proofErr w:type="spellEnd"/>
+      <w:r>
+        <w:rPr>
+          <w:lang w:val="es-ES"/>
+        </w:rPr>
+        <w:t xml:space="preserve"> </w:t>
+      </w:r>
+      <w:proofErr w:type="spellStart"/>
+      <w:r>
+        <w:rPr>
+          <w:lang w:val="es-ES"/>
+        </w:rPr>
+        <w:t>component</w:t>
+      </w:r>
+      <w:proofErr w:type="spellEnd"/>
+      <w:r>
+        <w:rPr>
+          <w:lang w:val="es-ES"/>
+        </w:rPr>
+        <w:t xml:space="preserve">. I </w:t>
+      </w:r>
+      <w:proofErr w:type="spellStart"/>
+      <w:r>
+        <w:rPr>
+          <w:lang w:val="es-ES"/>
+        </w:rPr>
+        <w:t>programmed</w:t>
+      </w:r>
+      <w:proofErr w:type="spellEnd"/>
+      <w:r>
+        <w:rPr>
+          <w:lang w:val="es-ES"/>
+        </w:rPr>
+        <w:t xml:space="preserve"> control </w:t>
+      </w:r>
+      <w:proofErr w:type="spellStart"/>
+      <w:r>
+        <w:rPr>
+          <w:lang w:val="es-ES"/>
+        </w:rPr>
+        <w:t>buttons</w:t>
+      </w:r>
+      <w:proofErr w:type="spellEnd"/>
+      <w:r>
+        <w:rPr>
+          <w:lang w:val="es-ES"/>
+        </w:rPr>
+        <w:t xml:space="preserve"> </w:t>
+      </w:r>
+      <w:proofErr w:type="spellStart"/>
+      <w:r>
+        <w:rPr>
+          <w:lang w:val="es-ES"/>
+        </w:rPr>
+        <w:t>to</w:t>
+      </w:r>
+      <w:proofErr w:type="spellEnd"/>
+      <w:r>
+        <w:rPr>
+          <w:lang w:val="es-ES"/>
+        </w:rPr>
+        <w:t xml:space="preserve"> </w:t>
+      </w:r>
+      <w:proofErr w:type="spellStart"/>
+      <w:r>
+        <w:rPr>
+          <w:lang w:val="es-ES"/>
+        </w:rPr>
+        <w:t>start</w:t>
+      </w:r>
+      <w:proofErr w:type="spellEnd"/>
+      <w:r>
+        <w:rPr>
+          <w:lang w:val="es-ES"/>
+        </w:rPr>
+        <w:t xml:space="preserve">, pause, and resume </w:t>
+      </w:r>
+      <w:proofErr w:type="spellStart"/>
+      <w:r>
+        <w:rPr>
+          <w:lang w:val="es-ES"/>
+        </w:rPr>
+        <w:t>the</w:t>
+      </w:r>
+      <w:proofErr w:type="spellEnd"/>
+      <w:r>
+        <w:rPr>
+          <w:lang w:val="es-ES"/>
+        </w:rPr>
+        <w:t xml:space="preserve"> </w:t>
+      </w:r>
+      <w:proofErr w:type="spellStart"/>
+      <w:r>
+        <w:rPr>
+          <w:lang w:val="es-ES"/>
+        </w:rPr>
+        <w:t>clock</w:t>
+      </w:r>
+      <w:proofErr w:type="spellEnd"/>
+      <w:r>
+        <w:rPr>
+          <w:lang w:val="es-ES"/>
+        </w:rPr>
+        <w:t xml:space="preserve"> </w:t>
+      </w:r>
+      <w:r>
+        <w:rPr>
+          <w:lang w:val="es-ES"/>
+        </w:rPr>
+        <w:lastRenderedPageBreak/>
+        <w:t xml:space="preserve">as </w:t>
+      </w:r>
+      <w:proofErr w:type="spellStart"/>
+      <w:r>
+        <w:rPr>
+          <w:lang w:val="es-ES"/>
+        </w:rPr>
+        <w:t>needed</w:t>
+      </w:r>
+      <w:proofErr w:type="spellEnd"/>
+      <w:r>
+        <w:rPr>
+          <w:lang w:val="es-ES"/>
+        </w:rPr>
+        <w:t xml:space="preserve"> </w:t>
+      </w:r>
+      <w:proofErr w:type="spellStart"/>
+      <w:r>
+        <w:rPr>
+          <w:lang w:val="es-ES"/>
+        </w:rPr>
+        <w:t>during</w:t>
+      </w:r>
+      <w:proofErr w:type="spellEnd"/>
+      <w:r>
+        <w:rPr>
+          <w:lang w:val="es-ES"/>
+        </w:rPr>
+        <w:t xml:space="preserve"> </w:t>
+      </w:r>
+      <w:proofErr w:type="spellStart"/>
+      <w:r>
+        <w:rPr>
+          <w:lang w:val="es-ES"/>
+        </w:rPr>
+        <w:t>play</w:t>
+      </w:r>
+      <w:proofErr w:type="spellEnd"/>
+      <w:r>
+        <w:rPr>
+          <w:lang w:val="es-ES"/>
+        </w:rPr>
+        <w:t xml:space="preserve">. </w:t>
+      </w:r>
+      <w:proofErr w:type="spellStart"/>
+      <w:r>
+        <w:rPr>
+          <w:lang w:val="es-ES"/>
+        </w:rPr>
+        <w:t>Integrating</w:t>
+      </w:r>
+      <w:proofErr w:type="spellEnd"/>
+      <w:r>
+        <w:rPr>
+          <w:lang w:val="es-ES"/>
+        </w:rPr>
+        <w:t xml:space="preserve"> </w:t>
+      </w:r>
+      <w:proofErr w:type="spellStart"/>
+      <w:r>
+        <w:rPr>
+          <w:lang w:val="es-ES"/>
+        </w:rPr>
+        <w:t>this</w:t>
+      </w:r>
+      <w:proofErr w:type="spellEnd"/>
+      <w:r>
+        <w:rPr>
+          <w:lang w:val="es-ES"/>
+        </w:rPr>
+        <w:t xml:space="preserve"> </w:t>
+      </w:r>
+      <w:proofErr w:type="spellStart"/>
+      <w:r>
+        <w:rPr>
+          <w:lang w:val="es-ES"/>
+        </w:rPr>
+        <w:t>live</w:t>
+      </w:r>
+      <w:proofErr w:type="spellEnd"/>
+      <w:r>
+        <w:rPr>
+          <w:lang w:val="es-ES"/>
+        </w:rPr>
+        <w:t xml:space="preserve"> </w:t>
+      </w:r>
+      <w:proofErr w:type="spellStart"/>
+      <w:r>
+        <w:rPr>
+          <w:lang w:val="es-ES"/>
+        </w:rPr>
+        <w:t>timer</w:t>
+      </w:r>
+      <w:proofErr w:type="spellEnd"/>
+      <w:r>
+        <w:rPr>
+          <w:lang w:val="es-ES"/>
+        </w:rPr>
+        <w:t xml:space="preserve"> </w:t>
+      </w:r>
+      <w:proofErr w:type="spellStart"/>
+      <w:r>
+        <w:rPr>
+          <w:lang w:val="es-ES"/>
+        </w:rPr>
+        <w:t>allows</w:t>
+      </w:r>
+      <w:proofErr w:type="spellEnd"/>
+      <w:r>
+        <w:rPr>
+          <w:lang w:val="es-ES"/>
+        </w:rPr>
+        <w:t xml:space="preserve"> </w:t>
+      </w:r>
+      <w:proofErr w:type="spellStart"/>
+      <w:r>
+        <w:rPr>
+          <w:lang w:val="es-ES"/>
+        </w:rPr>
+        <w:t>the</w:t>
+      </w:r>
+      <w:proofErr w:type="spellEnd"/>
+      <w:r>
+        <w:rPr>
+          <w:lang w:val="es-ES"/>
+        </w:rPr>
+        <w:t xml:space="preserve"> </w:t>
+      </w:r>
+      <w:proofErr w:type="spellStart"/>
+      <w:r>
+        <w:rPr>
+          <w:lang w:val="es-ES"/>
+        </w:rPr>
+        <w:t>application</w:t>
+      </w:r>
+      <w:proofErr w:type="spellEnd"/>
+      <w:r>
+        <w:rPr>
+          <w:lang w:val="es-ES"/>
+        </w:rPr>
+        <w:t xml:space="preserve"> </w:t>
+      </w:r>
+      <w:proofErr w:type="spellStart"/>
+      <w:r>
+        <w:rPr>
+          <w:lang w:val="es-ES"/>
+        </w:rPr>
+        <w:t>to</w:t>
+      </w:r>
+      <w:proofErr w:type="spellEnd"/>
+      <w:r>
+        <w:rPr>
+          <w:lang w:val="es-ES"/>
+        </w:rPr>
+        <w:t xml:space="preserve"> </w:t>
+      </w:r>
+      <w:proofErr w:type="spellStart"/>
+      <w:r>
+        <w:rPr>
+          <w:lang w:val="es-ES"/>
+        </w:rPr>
+        <w:t>automatically</w:t>
+      </w:r>
+      <w:proofErr w:type="spellEnd"/>
+      <w:r>
+        <w:rPr>
+          <w:lang w:val="es-ES"/>
+        </w:rPr>
+        <w:t xml:space="preserve"> capture </w:t>
+      </w:r>
+      <w:proofErr w:type="spellStart"/>
+      <w:r>
+        <w:rPr>
+          <w:lang w:val="es-ES"/>
+        </w:rPr>
+        <w:t>the</w:t>
+      </w:r>
+      <w:proofErr w:type="spellEnd"/>
+      <w:r>
+        <w:rPr>
+          <w:lang w:val="es-ES"/>
+        </w:rPr>
+        <w:t xml:space="preserve"> </w:t>
+      </w:r>
+      <w:proofErr w:type="spellStart"/>
+      <w:r>
+        <w:rPr>
+          <w:lang w:val="es-ES"/>
+        </w:rPr>
+        <w:t>exact</w:t>
+      </w:r>
+      <w:proofErr w:type="spellEnd"/>
+      <w:r>
+        <w:rPr>
+          <w:lang w:val="es-ES"/>
+        </w:rPr>
+        <w:t xml:space="preserve"> match minute </w:t>
+      </w:r>
+      <w:proofErr w:type="spellStart"/>
+      <w:r>
+        <w:rPr>
+          <w:lang w:val="es-ES"/>
+        </w:rPr>
+        <w:t>whenever</w:t>
+      </w:r>
+      <w:proofErr w:type="spellEnd"/>
+      <w:r>
+        <w:rPr>
+          <w:lang w:val="es-ES"/>
+        </w:rPr>
+        <w:t xml:space="preserve"> </w:t>
+      </w:r>
+      <w:proofErr w:type="spellStart"/>
+      <w:r>
+        <w:rPr>
+          <w:lang w:val="es-ES"/>
+        </w:rPr>
+        <w:t>an</w:t>
+      </w:r>
+      <w:proofErr w:type="spellEnd"/>
+      <w:r>
+        <w:rPr>
+          <w:lang w:val="es-ES"/>
+        </w:rPr>
+        <w:t xml:space="preserve"> </w:t>
+      </w:r>
+      <w:proofErr w:type="spellStart"/>
+      <w:r>
+        <w:rPr>
+          <w:lang w:val="es-ES"/>
+        </w:rPr>
+        <w:t>incident</w:t>
+      </w:r>
+      <w:proofErr w:type="spellEnd"/>
+      <w:r>
+        <w:rPr>
+          <w:lang w:val="es-ES"/>
+        </w:rPr>
+        <w:t xml:space="preserve"> </w:t>
+      </w:r>
+      <w:proofErr w:type="spellStart"/>
+      <w:r>
+        <w:rPr>
+          <w:lang w:val="es-ES"/>
+        </w:rPr>
+        <w:t>occurs</w:t>
+      </w:r>
+      <w:proofErr w:type="spellEnd"/>
+      <w:r>
+        <w:rPr>
+          <w:lang w:val="es-ES"/>
+        </w:rPr>
+        <w:t>—</w:t>
+      </w:r>
+      <w:proofErr w:type="spellStart"/>
+      <w:r>
+        <w:rPr>
+          <w:lang w:val="es-ES"/>
+        </w:rPr>
+        <w:t>such</w:t>
+      </w:r>
+      <w:proofErr w:type="spellEnd"/>
+      <w:r>
+        <w:rPr>
+          <w:lang w:val="es-ES"/>
+        </w:rPr>
+        <w:t xml:space="preserve"> as a </w:t>
+      </w:r>
+      <w:proofErr w:type="spellStart"/>
+      <w:r>
+        <w:rPr>
+          <w:lang w:val="es-ES"/>
+        </w:rPr>
+        <w:t>goal</w:t>
+      </w:r>
+      <w:proofErr w:type="spellEnd"/>
+      <w:r>
+        <w:rPr>
+          <w:lang w:val="es-ES"/>
+        </w:rPr>
+        <w:t xml:space="preserve"> </w:t>
+      </w:r>
+      <w:proofErr w:type="spellStart"/>
+      <w:r>
+        <w:rPr>
+          <w:lang w:val="es-ES"/>
+        </w:rPr>
+        <w:t>or</w:t>
+      </w:r>
+      <w:proofErr w:type="spellEnd"/>
+      <w:r>
+        <w:rPr>
+          <w:lang w:val="es-ES"/>
+        </w:rPr>
+        <w:t xml:space="preserve"> a </w:t>
+      </w:r>
+      <w:proofErr w:type="spellStart"/>
+      <w:r>
+        <w:rPr>
+          <w:lang w:val="es-ES"/>
+        </w:rPr>
+        <w:t>disciplinary</w:t>
+      </w:r>
+      <w:proofErr w:type="spellEnd"/>
+      <w:r>
+        <w:rPr>
+          <w:lang w:val="es-ES"/>
+        </w:rPr>
+        <w:t xml:space="preserve"> </w:t>
+      </w:r>
+      <w:proofErr w:type="spellStart"/>
+      <w:r>
+        <w:rPr>
+          <w:lang w:val="es-ES"/>
+        </w:rPr>
+        <w:t>card</w:t>
+      </w:r>
+      <w:proofErr w:type="spellEnd"/>
+      <w:r>
+        <w:rPr>
+          <w:lang w:val="es-ES"/>
+        </w:rPr>
+        <w:t>—</w:t>
+      </w:r>
+      <w:proofErr w:type="spellStart"/>
+      <w:r>
+        <w:rPr>
+          <w:lang w:val="es-ES"/>
+        </w:rPr>
+        <w:t>without</w:t>
+      </w:r>
+      <w:proofErr w:type="spellEnd"/>
+      <w:r>
+        <w:rPr>
+          <w:lang w:val="es-ES"/>
+        </w:rPr>
+        <w:t xml:space="preserve"> </w:t>
+      </w:r>
+      <w:proofErr w:type="spellStart"/>
+      <w:r>
+        <w:rPr>
+          <w:lang w:val="es-ES"/>
+        </w:rPr>
+        <w:t>requiring</w:t>
+      </w:r>
+      <w:proofErr w:type="spellEnd"/>
+      <w:r>
+        <w:rPr>
+          <w:lang w:val="es-ES"/>
+        </w:rPr>
+        <w:t xml:space="preserve"> manual </w:t>
+      </w:r>
+      <w:proofErr w:type="spellStart"/>
+      <w:r>
+        <w:rPr>
+          <w:lang w:val="es-ES"/>
+        </w:rPr>
+        <w:t>user</w:t>
+      </w:r>
+      <w:proofErr w:type="spellEnd"/>
+      <w:r>
+        <w:rPr>
+          <w:lang w:val="es-ES"/>
+        </w:rPr>
+        <w:t xml:space="preserve"> </w:t>
+      </w:r>
+      <w:proofErr w:type="spellStart"/>
+      <w:r>
+        <w:rPr>
+          <w:lang w:val="es-ES"/>
+        </w:rPr>
+        <w:t>entry</w:t>
+      </w:r>
+      <w:proofErr w:type="spellEnd"/>
+      <w:r>
+        <w:rPr>
+          <w:lang w:val="es-ES"/>
+        </w:rPr>
+        <w:t xml:space="preserve">. In </w:t>
+      </w:r>
+      <w:proofErr w:type="spellStart"/>
+      <w:r>
+        <w:rPr>
+          <w:lang w:val="es-ES"/>
+        </w:rPr>
+        <w:t>addition</w:t>
+      </w:r>
+      <w:proofErr w:type="spellEnd"/>
+      <w:r>
+        <w:rPr>
+          <w:lang w:val="es-ES"/>
+        </w:rPr>
+        <w:t xml:space="preserve">, I </w:t>
+      </w:r>
+      <w:proofErr w:type="spellStart"/>
+      <w:r>
+        <w:rPr>
+          <w:lang w:val="es-ES"/>
+        </w:rPr>
+        <w:t>created</w:t>
+      </w:r>
+      <w:proofErr w:type="spellEnd"/>
+      <w:r>
+        <w:rPr>
+          <w:lang w:val="es-ES"/>
+        </w:rPr>
+        <w:t xml:space="preserve"> a </w:t>
+      </w:r>
+      <w:proofErr w:type="spellStart"/>
+      <w:r>
+        <w:rPr>
+          <w:lang w:val="es-ES"/>
+        </w:rPr>
+        <w:t>MatchEvent</w:t>
+      </w:r>
+      <w:proofErr w:type="spellEnd"/>
+      <w:r>
+        <w:rPr>
+          <w:lang w:val="es-ES"/>
+        </w:rPr>
+        <w:t xml:space="preserve"> </w:t>
+      </w:r>
+      <w:proofErr w:type="spellStart"/>
+      <w:r>
+        <w:rPr>
+          <w:lang w:val="es-ES"/>
+        </w:rPr>
+        <w:t>model</w:t>
+      </w:r>
+      <w:proofErr w:type="spellEnd"/>
+      <w:r>
+        <w:rPr>
+          <w:lang w:val="es-ES"/>
+        </w:rPr>
+        <w:t xml:space="preserve"> </w:t>
+      </w:r>
+      <w:proofErr w:type="spellStart"/>
+      <w:r>
+        <w:rPr>
+          <w:lang w:val="es-ES"/>
+        </w:rPr>
+        <w:t>class</w:t>
+      </w:r>
+      <w:proofErr w:type="spellEnd"/>
+      <w:r>
+        <w:rPr>
+          <w:lang w:val="es-ES"/>
+        </w:rPr>
+        <w:t xml:space="preserve"> and </w:t>
+      </w:r>
+      <w:proofErr w:type="spellStart"/>
+      <w:r>
+        <w:rPr>
+          <w:lang w:val="es-ES"/>
+        </w:rPr>
+        <w:t>implemented</w:t>
+      </w:r>
+      <w:proofErr w:type="spellEnd"/>
+      <w:r>
+        <w:rPr>
+          <w:lang w:val="es-ES"/>
+        </w:rPr>
+        <w:t xml:space="preserve"> </w:t>
+      </w:r>
+      <w:proofErr w:type="spellStart"/>
+      <w:r>
+        <w:rPr>
+          <w:lang w:val="es-ES"/>
+        </w:rPr>
+        <w:t>action</w:t>
+      </w:r>
+      <w:proofErr w:type="spellEnd"/>
+      <w:r>
+        <w:rPr>
+          <w:lang w:val="es-ES"/>
+        </w:rPr>
+        <w:t xml:space="preserve"> </w:t>
+      </w:r>
+      <w:proofErr w:type="spellStart"/>
+      <w:r>
+        <w:rPr>
+          <w:lang w:val="es-ES"/>
+        </w:rPr>
+        <w:t>buttons</w:t>
+      </w:r>
+      <w:proofErr w:type="spellEnd"/>
+      <w:r>
+        <w:rPr>
+          <w:lang w:val="es-ES"/>
+        </w:rPr>
+        <w:t xml:space="preserve"> (+ </w:t>
+      </w:r>
+      <w:proofErr w:type="spellStart"/>
+      <w:r>
+        <w:rPr>
+          <w:lang w:val="es-ES"/>
+        </w:rPr>
+        <w:t>Goal</w:t>
+      </w:r>
+      <w:proofErr w:type="spellEnd"/>
+      <w:r>
+        <w:rPr>
+          <w:lang w:val="es-ES"/>
+        </w:rPr>
+        <w:t xml:space="preserve">, Yellow Card, Red Card) </w:t>
+      </w:r>
+      <w:proofErr w:type="spellStart"/>
+      <w:r>
+        <w:rPr>
+          <w:lang w:val="es-ES"/>
+        </w:rPr>
+        <w:t>that</w:t>
+      </w:r>
+      <w:proofErr w:type="spellEnd"/>
+      <w:r>
+        <w:rPr>
+          <w:lang w:val="es-ES"/>
+        </w:rPr>
+        <w:t xml:space="preserve"> </w:t>
+      </w:r>
+      <w:proofErr w:type="spellStart"/>
+      <w:r>
+        <w:rPr>
+          <w:lang w:val="es-ES"/>
+        </w:rPr>
+        <w:t>instantiate</w:t>
+      </w:r>
+      <w:proofErr w:type="spellEnd"/>
+      <w:r>
+        <w:rPr>
+          <w:lang w:val="es-ES"/>
+        </w:rPr>
+        <w:t xml:space="preserve"> and </w:t>
+      </w:r>
+      <w:proofErr w:type="spellStart"/>
+      <w:r>
+        <w:rPr>
+          <w:lang w:val="es-ES"/>
+        </w:rPr>
+        <w:t>append</w:t>
+      </w:r>
+      <w:proofErr w:type="spellEnd"/>
+      <w:r>
+        <w:rPr>
+          <w:lang w:val="es-ES"/>
+        </w:rPr>
+        <w:t xml:space="preserve"> </w:t>
+      </w:r>
+      <w:proofErr w:type="spellStart"/>
+      <w:r>
+        <w:rPr>
+          <w:lang w:val="es-ES"/>
+        </w:rPr>
+        <w:t>these</w:t>
+      </w:r>
+      <w:proofErr w:type="spellEnd"/>
+      <w:r>
+        <w:rPr>
+          <w:lang w:val="es-ES"/>
+        </w:rPr>
+        <w:t xml:space="preserve"> </w:t>
+      </w:r>
+      <w:proofErr w:type="spellStart"/>
+      <w:r>
+        <w:rPr>
+          <w:lang w:val="es-ES"/>
+        </w:rPr>
+        <w:t>events</w:t>
+      </w:r>
+      <w:proofErr w:type="spellEnd"/>
+      <w:r>
+        <w:rPr>
+          <w:lang w:val="es-ES"/>
+        </w:rPr>
+        <w:t xml:space="preserve"> </w:t>
+      </w:r>
+      <w:proofErr w:type="spellStart"/>
+      <w:r>
+        <w:rPr>
+          <w:lang w:val="es-ES"/>
+        </w:rPr>
+        <w:t>into</w:t>
+      </w:r>
+      <w:proofErr w:type="spellEnd"/>
+      <w:r>
+        <w:rPr>
+          <w:lang w:val="es-ES"/>
+        </w:rPr>
+        <w:t xml:space="preserve"> </w:t>
+      </w:r>
+      <w:proofErr w:type="spellStart"/>
+      <w:r>
+        <w:rPr>
+          <w:lang w:val="es-ES"/>
+        </w:rPr>
+        <w:t>an</w:t>
+      </w:r>
+      <w:proofErr w:type="spellEnd"/>
+      <w:r>
+        <w:rPr>
+          <w:lang w:val="es-ES"/>
+        </w:rPr>
+        <w:t xml:space="preserve"> </w:t>
+      </w:r>
+      <w:proofErr w:type="spellStart"/>
+      <w:r>
+        <w:rPr>
+          <w:lang w:val="es-ES"/>
+        </w:rPr>
+        <w:t>in-memory</w:t>
+      </w:r>
+      <w:proofErr w:type="spellEnd"/>
+      <w:r>
+        <w:rPr>
+          <w:lang w:val="es-ES"/>
+        </w:rPr>
+        <w:t xml:space="preserve"> </w:t>
+      </w:r>
+      <w:proofErr w:type="spellStart"/>
+      <w:r>
+        <w:rPr>
+          <w:lang w:val="es-ES"/>
+        </w:rPr>
+        <w:t>ArrayList</w:t>
+      </w:r>
+      <w:proofErr w:type="spellEnd"/>
+      <w:r>
+        <w:rPr>
+          <w:lang w:val="es-ES"/>
+        </w:rPr>
+        <w:t>&lt;</w:t>
+      </w:r>
+      <w:proofErr w:type="spellStart"/>
+      <w:r>
+        <w:rPr>
+          <w:lang w:val="es-ES"/>
+        </w:rPr>
+        <w:t>MatchEvent</w:t>
+      </w:r>
+      <w:proofErr w:type="spellEnd"/>
+      <w:r>
+        <w:rPr>
+          <w:lang w:val="es-ES"/>
+        </w:rPr>
+        <w:t>&gt;.</w:t>
+      </w:r>
+    </w:p>
+    <w:p>
+      <w:pPr>
+        <w:pStyle w:val="Textoindependiente"/>
+        <w:rPr>
+          <w:lang w:val="es-ES"/>
+        </w:rPr>
+      </w:pPr>
+    </w:p>
+    <w:p>
+      <w:pPr>
+        <w:pStyle w:val="Textoindependiente"/>
+        <w:rPr>
+          <w:lang w:val="es-ES"/>
+        </w:rPr>
+      </w:pPr>
+      <w:r>
+        <w:rPr>
+          <w:b/>
+          <w:bCs/>
+          <w:lang w:val="es-ES"/>
+        </w:rPr>
+        <w:t>17.9.2026</w:t>
+      </w:r>
+    </w:p>
+    <w:p>
+      <w:pPr>
+        <w:pStyle w:val="Textoindependiente"/>
+        <w:rPr>
+          <w:lang w:val="es-ES"/>
+        </w:rPr>
+      </w:pPr>
+      <w:r>
+        <w:rPr>
+          <w:lang w:val="es-ES"/>
+        </w:rPr>
+        <w:t xml:space="preserve">I </w:t>
+      </w:r>
+      <w:proofErr w:type="spellStart"/>
+      <w:r>
+        <w:rPr>
+          <w:lang w:val="es-ES"/>
+        </w:rPr>
+        <w:t>completed</w:t>
+      </w:r>
+      <w:proofErr w:type="spellEnd"/>
+      <w:r>
+        <w:rPr>
+          <w:lang w:val="es-ES"/>
+        </w:rPr>
+        <w:t xml:space="preserve"> </w:t>
+      </w:r>
+      <w:proofErr w:type="spellStart"/>
+      <w:r>
+        <w:rPr>
+          <w:lang w:val="es-ES"/>
+        </w:rPr>
+        <w:t>the</w:t>
+      </w:r>
+      <w:proofErr w:type="spellEnd"/>
+      <w:r>
+        <w:rPr>
+          <w:lang w:val="es-ES"/>
+        </w:rPr>
+        <w:t xml:space="preserve"> final </w:t>
+      </w:r>
+      <w:proofErr w:type="spellStart"/>
+      <w:r>
+        <w:rPr>
+          <w:lang w:val="es-ES"/>
+        </w:rPr>
+        <w:t>phase</w:t>
+      </w:r>
+      <w:proofErr w:type="spellEnd"/>
+      <w:r>
+        <w:rPr>
+          <w:lang w:val="es-ES"/>
+        </w:rPr>
+        <w:t xml:space="preserve"> </w:t>
+      </w:r>
+      <w:proofErr w:type="spellStart"/>
+      <w:r>
+        <w:rPr>
+          <w:lang w:val="es-ES"/>
+        </w:rPr>
+        <w:t>of</w:t>
+      </w:r>
+      <w:proofErr w:type="spellEnd"/>
+      <w:r>
+        <w:rPr>
+          <w:lang w:val="es-ES"/>
+        </w:rPr>
+        <w:t xml:space="preserve"> </w:t>
+      </w:r>
+      <w:proofErr w:type="spellStart"/>
+      <w:r>
+        <w:rPr>
+          <w:lang w:val="es-ES"/>
+        </w:rPr>
+        <w:t>the</w:t>
+      </w:r>
+      <w:proofErr w:type="spellEnd"/>
+      <w:r>
+        <w:rPr>
+          <w:lang w:val="es-ES"/>
+        </w:rPr>
+        <w:t xml:space="preserve"> </w:t>
+      </w:r>
+      <w:proofErr w:type="spellStart"/>
+      <w:r>
+        <w:rPr>
+          <w:lang w:val="es-ES"/>
+        </w:rPr>
+        <w:t>project</w:t>
+      </w:r>
+      <w:proofErr w:type="spellEnd"/>
+      <w:r>
+        <w:rPr>
+          <w:lang w:val="es-ES"/>
+        </w:rPr>
+        <w:t xml:space="preserve"> </w:t>
+      </w:r>
+      <w:proofErr w:type="spellStart"/>
+      <w:r>
+        <w:rPr>
+          <w:lang w:val="es-ES"/>
+        </w:rPr>
+        <w:t>by</w:t>
+      </w:r>
+      <w:proofErr w:type="spellEnd"/>
+      <w:r>
+        <w:rPr>
+          <w:lang w:val="es-ES"/>
+        </w:rPr>
+        <w:t xml:space="preserve"> </w:t>
+      </w:r>
+      <w:proofErr w:type="spellStart"/>
+      <w:r>
+        <w:rPr>
+          <w:lang w:val="es-ES"/>
+        </w:rPr>
+        <w:t>implementing</w:t>
+      </w:r>
+      <w:proofErr w:type="spellEnd"/>
+      <w:r>
+        <w:rPr>
+          <w:lang w:val="es-ES"/>
+        </w:rPr>
+        <w:t xml:space="preserve"> </w:t>
+      </w:r>
+      <w:proofErr w:type="spellStart"/>
+      <w:r>
+        <w:rPr>
+          <w:lang w:val="es-ES"/>
+        </w:rPr>
+        <w:t>ReportActivity</w:t>
+      </w:r>
+      <w:proofErr w:type="spellEnd"/>
+      <w:r>
+        <w:rPr>
+          <w:lang w:val="es-ES"/>
+        </w:rPr>
+        <w:t xml:space="preserve"> and </w:t>
+      </w:r>
+      <w:proofErr w:type="spellStart"/>
+      <w:r>
+        <w:rPr>
+          <w:lang w:val="es-ES"/>
+        </w:rPr>
+        <w:t>the</w:t>
+      </w:r>
+      <w:proofErr w:type="spellEnd"/>
+      <w:r>
+        <w:rPr>
+          <w:lang w:val="es-ES"/>
+        </w:rPr>
+        <w:t xml:space="preserve"> </w:t>
+      </w:r>
+      <w:proofErr w:type="spellStart"/>
+      <w:r>
+        <w:rPr>
+          <w:lang w:val="es-ES"/>
+        </w:rPr>
+        <w:t>custom</w:t>
+      </w:r>
+      <w:proofErr w:type="spellEnd"/>
+      <w:r>
+        <w:rPr>
+          <w:lang w:val="es-ES"/>
+        </w:rPr>
+        <w:t xml:space="preserve"> </w:t>
+      </w:r>
+      <w:proofErr w:type="spellStart"/>
+      <w:r>
+        <w:rPr>
+          <w:lang w:val="es-ES"/>
+        </w:rPr>
+        <w:t>adapter</w:t>
+      </w:r>
+      <w:proofErr w:type="spellEnd"/>
+      <w:r>
+        <w:rPr>
+          <w:lang w:val="es-ES"/>
+        </w:rPr>
+        <w:t xml:space="preserve"> </w:t>
+      </w:r>
+      <w:proofErr w:type="spellStart"/>
+      <w:r>
+        <w:rPr>
+          <w:lang w:val="es-ES"/>
+        </w:rPr>
+        <w:t>architecture</w:t>
+      </w:r>
+      <w:proofErr w:type="spellEnd"/>
+      <w:r>
+        <w:rPr>
+          <w:lang w:val="es-ES"/>
+        </w:rPr>
+        <w:t xml:space="preserve"> </w:t>
+      </w:r>
+      <w:proofErr w:type="spellStart"/>
+      <w:r>
+        <w:rPr>
+          <w:lang w:val="es-ES"/>
+        </w:rPr>
+        <w:t>for</w:t>
+      </w:r>
+      <w:proofErr w:type="spellEnd"/>
+      <w:r>
+        <w:rPr>
+          <w:lang w:val="es-ES"/>
+        </w:rPr>
+        <w:t xml:space="preserve"> </w:t>
+      </w:r>
+      <w:proofErr w:type="spellStart"/>
+      <w:r>
+        <w:rPr>
+          <w:lang w:val="es-ES"/>
+        </w:rPr>
+        <w:t>the</w:t>
+      </w:r>
+      <w:proofErr w:type="spellEnd"/>
+      <w:r>
+        <w:rPr>
+          <w:lang w:val="es-ES"/>
+        </w:rPr>
+        <w:t xml:space="preserve"> </w:t>
+      </w:r>
+      <w:proofErr w:type="spellStart"/>
+      <w:r>
+        <w:rPr>
+          <w:lang w:val="es-ES"/>
+        </w:rPr>
+        <w:t>post-match</w:t>
+      </w:r>
+      <w:proofErr w:type="spellEnd"/>
+      <w:r>
+        <w:rPr>
+          <w:lang w:val="es-ES"/>
+        </w:rPr>
+        <w:t xml:space="preserve"> </w:t>
+      </w:r>
+      <w:proofErr w:type="spellStart"/>
+      <w:r>
+        <w:rPr>
+          <w:lang w:val="es-ES"/>
+        </w:rPr>
+        <w:t>summary</w:t>
+      </w:r>
+      <w:proofErr w:type="spellEnd"/>
+      <w:r>
+        <w:rPr>
+          <w:lang w:val="es-ES"/>
+        </w:rPr>
+        <w:t xml:space="preserve">. </w:t>
+      </w:r>
+      <w:proofErr w:type="spellStart"/>
+      <w:r>
+        <w:rPr>
+          <w:lang w:val="es-ES"/>
+        </w:rPr>
+        <w:t>When</w:t>
+      </w:r>
+      <w:proofErr w:type="spellEnd"/>
+      <w:r>
+        <w:rPr>
+          <w:lang w:val="es-ES"/>
+        </w:rPr>
+        <w:t xml:space="preserve"> </w:t>
+      </w:r>
+      <w:proofErr w:type="spellStart"/>
+      <w:r>
+        <w:rPr>
+          <w:lang w:val="es-ES"/>
+        </w:rPr>
+        <w:t>the</w:t>
+      </w:r>
+      <w:proofErr w:type="spellEnd"/>
+      <w:r>
+        <w:rPr>
+          <w:lang w:val="es-ES"/>
+        </w:rPr>
+        <w:t xml:space="preserve"> </w:t>
+      </w:r>
+      <w:proofErr w:type="spellStart"/>
+      <w:r>
+        <w:rPr>
+          <w:lang w:val="es-ES"/>
+        </w:rPr>
+        <w:t>referee</w:t>
+      </w:r>
+      <w:proofErr w:type="spellEnd"/>
+      <w:r>
+        <w:rPr>
+          <w:lang w:val="es-ES"/>
+        </w:rPr>
+        <w:t xml:space="preserve"> </w:t>
+      </w:r>
+      <w:proofErr w:type="spellStart"/>
+      <w:r>
+        <w:rPr>
+          <w:lang w:val="es-ES"/>
+        </w:rPr>
+        <w:t>finishes</w:t>
+      </w:r>
+      <w:proofErr w:type="spellEnd"/>
+      <w:r>
+        <w:rPr>
+          <w:lang w:val="es-ES"/>
+        </w:rPr>
+        <w:t xml:space="preserve"> </w:t>
+      </w:r>
+      <w:proofErr w:type="spellStart"/>
+      <w:r>
+        <w:rPr>
+          <w:lang w:val="es-ES"/>
+        </w:rPr>
+        <w:t>the</w:t>
+      </w:r>
+      <w:proofErr w:type="spellEnd"/>
+      <w:r>
+        <w:rPr>
+          <w:lang w:val="es-ES"/>
+        </w:rPr>
+        <w:t xml:space="preserve"> </w:t>
+      </w:r>
+      <w:proofErr w:type="spellStart"/>
+      <w:r>
+        <w:rPr>
+          <w:lang w:val="es-ES"/>
+        </w:rPr>
+        <w:t>game</w:t>
+      </w:r>
+      <w:proofErr w:type="spellEnd"/>
+      <w:r>
+        <w:rPr>
+          <w:lang w:val="es-ES"/>
+        </w:rPr>
+        <w:t xml:space="preserve">, </w:t>
+      </w:r>
+      <w:proofErr w:type="spellStart"/>
+      <w:r>
+        <w:rPr>
+          <w:lang w:val="es-ES"/>
+        </w:rPr>
+        <w:t>an</w:t>
+      </w:r>
+      <w:proofErr w:type="spellEnd"/>
+      <w:r>
+        <w:rPr>
+          <w:lang w:val="es-ES"/>
+        </w:rPr>
+        <w:t xml:space="preserve"> </w:t>
+      </w:r>
+      <w:proofErr w:type="spellStart"/>
+      <w:r>
+        <w:rPr>
+          <w:lang w:val="es-ES"/>
+        </w:rPr>
+        <w:t>explicit</w:t>
+      </w:r>
+      <w:proofErr w:type="spellEnd"/>
+      <w:r>
+        <w:rPr>
+          <w:lang w:val="es-ES"/>
+        </w:rPr>
+        <w:t xml:space="preserve"> </w:t>
+      </w:r>
+      <w:proofErr w:type="spellStart"/>
+      <w:r>
+        <w:rPr>
+          <w:lang w:val="es-ES"/>
+        </w:rPr>
+        <w:t>Intent</w:t>
+      </w:r>
+      <w:proofErr w:type="spellEnd"/>
+      <w:r>
+        <w:rPr>
+          <w:lang w:val="es-ES"/>
+        </w:rPr>
+        <w:t xml:space="preserve"> </w:t>
+      </w:r>
+      <w:proofErr w:type="spellStart"/>
+      <w:r>
+        <w:rPr>
+          <w:lang w:val="es-ES"/>
+        </w:rPr>
+        <w:t>transfers</w:t>
+      </w:r>
+      <w:proofErr w:type="spellEnd"/>
+      <w:r>
+        <w:rPr>
+          <w:lang w:val="es-ES"/>
+        </w:rPr>
+        <w:t xml:space="preserve"> </w:t>
+      </w:r>
+      <w:proofErr w:type="spellStart"/>
+      <w:r>
+        <w:rPr>
+          <w:lang w:val="es-ES"/>
+        </w:rPr>
+        <w:t>the</w:t>
+      </w:r>
+      <w:proofErr w:type="spellEnd"/>
+      <w:r>
+        <w:rPr>
+          <w:lang w:val="es-ES"/>
+        </w:rPr>
+        <w:t xml:space="preserve"> </w:t>
+      </w:r>
+      <w:proofErr w:type="spellStart"/>
+      <w:r>
+        <w:rPr>
+          <w:lang w:val="es-ES"/>
+        </w:rPr>
+        <w:t>team</w:t>
+      </w:r>
+      <w:proofErr w:type="spellEnd"/>
+      <w:r>
+        <w:rPr>
+          <w:lang w:val="es-ES"/>
+        </w:rPr>
+        <w:t xml:space="preserve"> </w:t>
+      </w:r>
+      <w:proofErr w:type="spellStart"/>
+      <w:r>
+        <w:rPr>
+          <w:lang w:val="es-ES"/>
+        </w:rPr>
+        <w:t>names</w:t>
+      </w:r>
+      <w:proofErr w:type="spellEnd"/>
+      <w:r>
+        <w:rPr>
+          <w:lang w:val="es-ES"/>
+        </w:rPr>
+        <w:t xml:space="preserve">, final score, and full </w:t>
+      </w:r>
+      <w:proofErr w:type="spellStart"/>
+      <w:r>
+        <w:rPr>
+          <w:lang w:val="es-ES"/>
+        </w:rPr>
+        <w:t>event</w:t>
+      </w:r>
+      <w:proofErr w:type="spellEnd"/>
+      <w:r>
+        <w:rPr>
+          <w:lang w:val="es-ES"/>
+        </w:rPr>
+        <w:t xml:space="preserve"> log </w:t>
+      </w:r>
+      <w:proofErr w:type="spellStart"/>
+      <w:r>
+        <w:rPr>
+          <w:lang w:val="es-ES"/>
+        </w:rPr>
+        <w:t>to</w:t>
+      </w:r>
+      <w:proofErr w:type="spellEnd"/>
+      <w:r>
+        <w:rPr>
+          <w:lang w:val="es-ES"/>
+        </w:rPr>
+        <w:t xml:space="preserve"> </w:t>
+      </w:r>
+      <w:proofErr w:type="spellStart"/>
+      <w:r>
+        <w:rPr>
+          <w:lang w:val="es-ES"/>
+        </w:rPr>
+        <w:t>the</w:t>
+      </w:r>
+      <w:proofErr w:type="spellEnd"/>
+      <w:r>
+        <w:rPr>
+          <w:lang w:val="es-ES"/>
+        </w:rPr>
+        <w:t xml:space="preserve"> </w:t>
+      </w:r>
+      <w:proofErr w:type="spellStart"/>
+      <w:r>
+        <w:rPr>
+          <w:lang w:val="es-ES"/>
+        </w:rPr>
+        <w:t>report</w:t>
+      </w:r>
+      <w:proofErr w:type="spellEnd"/>
+      <w:r>
+        <w:rPr>
+          <w:lang w:val="es-ES"/>
+        </w:rPr>
+        <w:t xml:space="preserve"> </w:t>
+      </w:r>
+      <w:proofErr w:type="spellStart"/>
+      <w:r>
+        <w:rPr>
+          <w:lang w:val="es-ES"/>
+        </w:rPr>
+        <w:t>screen</w:t>
+      </w:r>
+      <w:proofErr w:type="spellEnd"/>
+      <w:r>
+        <w:rPr>
+          <w:lang w:val="es-ES"/>
+        </w:rPr>
+        <w:t>.</w:t>
+      </w:r>
+    </w:p>
+    <w:p>
+      <w:pPr>
+        <w:pStyle w:val="Textoindependiente"/>
+        <w:rPr>
+          <w:lang w:val="es-ES"/>
+        </w:rPr>
+      </w:pPr>
+      <w:proofErr w:type="spellStart"/>
+      <w:r>
+        <w:rPr>
+          <w:lang w:val="es-ES"/>
+        </w:rPr>
+        <w:t>To</w:t>
+      </w:r>
+      <w:proofErr w:type="spellEnd"/>
+      <w:r>
+        <w:rPr>
+          <w:lang w:val="es-ES"/>
+        </w:rPr>
+        <w:t xml:space="preserve"> </w:t>
+      </w:r>
+      <w:proofErr w:type="spellStart"/>
+      <w:r>
+        <w:rPr>
+          <w:lang w:val="es-ES"/>
+        </w:rPr>
+        <w:t>present</w:t>
+      </w:r>
+      <w:proofErr w:type="spellEnd"/>
+      <w:r>
+        <w:rPr>
+          <w:lang w:val="es-ES"/>
+        </w:rPr>
+        <w:t xml:space="preserve"> </w:t>
+      </w:r>
+      <w:proofErr w:type="spellStart"/>
+      <w:r>
+        <w:rPr>
+          <w:lang w:val="es-ES"/>
+        </w:rPr>
+        <w:t>the</w:t>
+      </w:r>
+      <w:proofErr w:type="spellEnd"/>
+      <w:r>
+        <w:rPr>
+          <w:lang w:val="es-ES"/>
+        </w:rPr>
+        <w:t xml:space="preserve"> </w:t>
+      </w:r>
+      <w:proofErr w:type="spellStart"/>
+      <w:r>
+        <w:rPr>
+          <w:lang w:val="es-ES"/>
+        </w:rPr>
+        <w:t>recorded</w:t>
+      </w:r>
+      <w:proofErr w:type="spellEnd"/>
+      <w:r>
+        <w:rPr>
+          <w:lang w:val="es-ES"/>
+        </w:rPr>
+        <w:t xml:space="preserve"> match </w:t>
+      </w:r>
+      <w:proofErr w:type="spellStart"/>
+      <w:r>
+        <w:rPr>
+          <w:lang w:val="es-ES"/>
+        </w:rPr>
+        <w:t>events</w:t>
+      </w:r>
+      <w:proofErr w:type="spellEnd"/>
+      <w:r>
+        <w:rPr>
+          <w:lang w:val="es-ES"/>
+        </w:rPr>
+        <w:t xml:space="preserve"> </w:t>
+      </w:r>
+      <w:proofErr w:type="spellStart"/>
+      <w:r>
+        <w:rPr>
+          <w:lang w:val="es-ES"/>
+        </w:rPr>
+        <w:t>chronologically</w:t>
+      </w:r>
+      <w:proofErr w:type="spellEnd"/>
+      <w:r>
+        <w:rPr>
+          <w:lang w:val="es-ES"/>
+        </w:rPr>
+        <w:t xml:space="preserve">, I </w:t>
+      </w:r>
+      <w:proofErr w:type="spellStart"/>
+      <w:r>
+        <w:rPr>
+          <w:lang w:val="es-ES"/>
+        </w:rPr>
+        <w:t>designed</w:t>
+      </w:r>
+      <w:proofErr w:type="spellEnd"/>
+      <w:r>
+        <w:rPr>
+          <w:lang w:val="es-ES"/>
+        </w:rPr>
+        <w:t xml:space="preserve"> a </w:t>
+      </w:r>
+      <w:proofErr w:type="spellStart"/>
+      <w:r>
+        <w:rPr>
+          <w:lang w:val="es-ES"/>
+        </w:rPr>
+        <w:t>custom</w:t>
+      </w:r>
+      <w:proofErr w:type="spellEnd"/>
+      <w:r>
+        <w:rPr>
+          <w:lang w:val="es-ES"/>
+        </w:rPr>
+        <w:t xml:space="preserve"> </w:t>
+      </w:r>
+      <w:proofErr w:type="spellStart"/>
+      <w:r>
+        <w:rPr>
+          <w:lang w:val="es-ES"/>
+        </w:rPr>
+        <w:t>row</w:t>
+      </w:r>
+      <w:proofErr w:type="spellEnd"/>
+      <w:r>
+        <w:rPr>
+          <w:lang w:val="es-ES"/>
+        </w:rPr>
+        <w:t xml:space="preserve"> </w:t>
+      </w:r>
+      <w:proofErr w:type="spellStart"/>
+      <w:r>
+        <w:rPr>
+          <w:lang w:val="es-ES"/>
+        </w:rPr>
+        <w:t>layout</w:t>
+      </w:r>
+      <w:proofErr w:type="spellEnd"/>
+      <w:r>
+        <w:rPr>
+          <w:lang w:val="es-ES"/>
+        </w:rPr>
+        <w:t xml:space="preserve"> (event_item_row.xml) </w:t>
+      </w:r>
+      <w:proofErr w:type="spellStart"/>
+      <w:r>
+        <w:rPr>
+          <w:lang w:val="es-ES"/>
+        </w:rPr>
+        <w:t>using</w:t>
+      </w:r>
+      <w:proofErr w:type="spellEnd"/>
+      <w:r>
+        <w:rPr>
+          <w:lang w:val="es-ES"/>
+        </w:rPr>
+        <w:t xml:space="preserve"> </w:t>
+      </w:r>
+      <w:proofErr w:type="spellStart"/>
+      <w:r>
+        <w:rPr>
+          <w:lang w:val="es-ES"/>
+        </w:rPr>
+        <w:t>RelativeLayout</w:t>
+      </w:r>
+      <w:proofErr w:type="spellEnd"/>
+      <w:r>
+        <w:rPr>
+          <w:lang w:val="es-ES"/>
+        </w:rPr>
+        <w:t xml:space="preserve"> and </w:t>
+      </w:r>
+      <w:proofErr w:type="spellStart"/>
+      <w:r>
+        <w:rPr>
+          <w:lang w:val="es-ES"/>
+        </w:rPr>
+        <w:t>implemented</w:t>
+      </w:r>
+      <w:proofErr w:type="spellEnd"/>
+      <w:r>
+        <w:rPr>
+          <w:lang w:val="es-ES"/>
+        </w:rPr>
+        <w:t xml:space="preserve"> a </w:t>
+      </w:r>
+      <w:proofErr w:type="spellStart"/>
+      <w:r>
+        <w:rPr>
+          <w:lang w:val="es-ES"/>
+        </w:rPr>
+        <w:t>custom</w:t>
+      </w:r>
+      <w:proofErr w:type="spellEnd"/>
+      <w:r>
+        <w:rPr>
+          <w:lang w:val="es-ES"/>
+        </w:rPr>
+        <w:t xml:space="preserve"> </w:t>
+      </w:r>
+      <w:proofErr w:type="spellStart"/>
+      <w:r>
+        <w:rPr>
+          <w:lang w:val="es-ES"/>
+        </w:rPr>
+        <w:t>BaseAdapter</w:t>
+      </w:r>
+      <w:proofErr w:type="spellEnd"/>
+      <w:r>
+        <w:rPr>
+          <w:lang w:val="es-ES"/>
+        </w:rPr>
+        <w:t xml:space="preserve"> (</w:t>
+      </w:r>
+      <w:proofErr w:type="spellStart"/>
+      <w:r>
+        <w:rPr>
+          <w:lang w:val="es-ES"/>
+        </w:rPr>
+        <w:t>EventAdapter</w:t>
+      </w:r>
+      <w:proofErr w:type="spellEnd"/>
+      <w:r>
+        <w:rPr>
+          <w:lang w:val="es-ES"/>
+        </w:rPr>
+        <w:t xml:space="preserve">). </w:t>
+      </w:r>
+      <w:proofErr w:type="spellStart"/>
+      <w:r>
+        <w:rPr>
+          <w:lang w:val="es-ES"/>
+        </w:rPr>
+        <w:t>Inside</w:t>
+      </w:r>
+      <w:proofErr w:type="spellEnd"/>
+      <w:r>
+        <w:rPr>
+          <w:lang w:val="es-ES"/>
+        </w:rPr>
+        <w:t xml:space="preserve"> </w:t>
+      </w:r>
+      <w:proofErr w:type="spellStart"/>
+      <w:r>
+        <w:rPr>
+          <w:lang w:val="es-ES"/>
+        </w:rPr>
+        <w:t>the</w:t>
+      </w:r>
+      <w:proofErr w:type="spellEnd"/>
+      <w:r>
+        <w:rPr>
+          <w:lang w:val="es-ES"/>
+        </w:rPr>
+        <w:t xml:space="preserve"> </w:t>
+      </w:r>
+      <w:proofErr w:type="spellStart"/>
+      <w:r>
+        <w:rPr>
+          <w:lang w:val="es-ES"/>
+        </w:rPr>
+        <w:t>adapter's</w:t>
+      </w:r>
+      <w:proofErr w:type="spellEnd"/>
+      <w:r>
+        <w:rPr>
+          <w:lang w:val="es-ES"/>
+        </w:rPr>
+        <w:t xml:space="preserve"> </w:t>
+      </w:r>
+      <w:proofErr w:type="spellStart"/>
+      <w:r>
+        <w:rPr>
+          <w:lang w:val="es-ES"/>
+        </w:rPr>
+        <w:t>getView</w:t>
+      </w:r>
+      <w:proofErr w:type="spellEnd"/>
+      <w:r>
+        <w:rPr>
+          <w:lang w:val="es-ES"/>
+        </w:rPr>
+        <w:t xml:space="preserve">() </w:t>
+      </w:r>
+      <w:proofErr w:type="spellStart"/>
+      <w:r>
+        <w:rPr>
+          <w:lang w:val="es-ES"/>
+        </w:rPr>
+        <w:t>method</w:t>
+      </w:r>
+      <w:proofErr w:type="spellEnd"/>
+      <w:r>
+        <w:rPr>
+          <w:lang w:val="es-ES"/>
+        </w:rPr>
+        <w:t xml:space="preserve">, I </w:t>
+      </w:r>
+      <w:proofErr w:type="spellStart"/>
+      <w:r>
+        <w:rPr>
+          <w:lang w:val="es-ES"/>
+        </w:rPr>
+        <w:t>used</w:t>
+      </w:r>
+      <w:proofErr w:type="spellEnd"/>
+      <w:r>
+        <w:rPr>
+          <w:lang w:val="es-ES"/>
+        </w:rPr>
+        <w:t xml:space="preserve"> </w:t>
+      </w:r>
+      <w:proofErr w:type="spellStart"/>
+      <w:r>
+        <w:rPr>
+          <w:lang w:val="es-ES"/>
+        </w:rPr>
+        <w:t>LayoutInflater</w:t>
+      </w:r>
+      <w:proofErr w:type="spellEnd"/>
+      <w:r>
+        <w:rPr>
+          <w:lang w:val="es-ES"/>
+        </w:rPr>
+        <w:t xml:space="preserve"> </w:t>
+      </w:r>
+      <w:proofErr w:type="spellStart"/>
+      <w:r>
+        <w:rPr>
+          <w:lang w:val="es-ES"/>
+        </w:rPr>
+        <w:t>to</w:t>
+      </w:r>
+      <w:proofErr w:type="spellEnd"/>
+      <w:r>
+        <w:rPr>
+          <w:lang w:val="es-ES"/>
+        </w:rPr>
+        <w:t xml:space="preserve"> </w:t>
+      </w:r>
+      <w:proofErr w:type="spellStart"/>
+      <w:r>
+        <w:rPr>
+          <w:lang w:val="es-ES"/>
+        </w:rPr>
+        <w:t>inflate</w:t>
+      </w:r>
+      <w:proofErr w:type="spellEnd"/>
+      <w:r>
+        <w:rPr>
+          <w:lang w:val="es-ES"/>
+        </w:rPr>
+        <w:t xml:space="preserve"> </w:t>
+      </w:r>
+      <w:proofErr w:type="spellStart"/>
+      <w:r>
+        <w:rPr>
+          <w:lang w:val="es-ES"/>
+        </w:rPr>
+        <w:t>the</w:t>
+      </w:r>
+      <w:proofErr w:type="spellEnd"/>
+      <w:r>
+        <w:rPr>
+          <w:lang w:val="es-ES"/>
+        </w:rPr>
+        <w:t xml:space="preserve"> </w:t>
+      </w:r>
+      <w:proofErr w:type="spellStart"/>
+      <w:r>
+        <w:rPr>
+          <w:lang w:val="es-ES"/>
+        </w:rPr>
+        <w:t>views</w:t>
+      </w:r>
+      <w:proofErr w:type="spellEnd"/>
+      <w:r>
+        <w:rPr>
+          <w:lang w:val="es-ES"/>
+        </w:rPr>
+        <w:t xml:space="preserve"> and </w:t>
+      </w:r>
+      <w:proofErr w:type="spellStart"/>
+      <w:r>
+        <w:rPr>
+          <w:lang w:val="es-ES"/>
+        </w:rPr>
+        <w:t>dynamically</w:t>
+      </w:r>
+      <w:proofErr w:type="spellEnd"/>
+      <w:r>
+        <w:rPr>
+          <w:lang w:val="es-ES"/>
+        </w:rPr>
+        <w:t xml:space="preserve"> </w:t>
+      </w:r>
+      <w:proofErr w:type="spellStart"/>
+      <w:r>
+        <w:rPr>
+          <w:lang w:val="es-ES"/>
+        </w:rPr>
+        <w:t>bind</w:t>
+      </w:r>
+      <w:proofErr w:type="spellEnd"/>
+      <w:r>
+        <w:rPr>
+          <w:lang w:val="es-ES"/>
+        </w:rPr>
+        <w:t xml:space="preserve"> </w:t>
+      </w:r>
+      <w:proofErr w:type="spellStart"/>
+      <w:r>
+        <w:rPr>
+          <w:lang w:val="es-ES"/>
+        </w:rPr>
+        <w:t>the</w:t>
+      </w:r>
+      <w:proofErr w:type="spellEnd"/>
+      <w:r>
+        <w:rPr>
+          <w:lang w:val="es-ES"/>
+        </w:rPr>
+        <w:t xml:space="preserve"> </w:t>
+      </w:r>
+      <w:proofErr w:type="spellStart"/>
+      <w:r>
+        <w:rPr>
+          <w:lang w:val="es-ES"/>
+        </w:rPr>
+        <w:t>event</w:t>
+      </w:r>
+      <w:proofErr w:type="spellEnd"/>
+      <w:r>
+        <w:rPr>
+          <w:lang w:val="es-ES"/>
+        </w:rPr>
+        <w:t xml:space="preserve"> minute, </w:t>
+      </w:r>
+      <w:proofErr w:type="spellStart"/>
+      <w:r>
+        <w:rPr>
+          <w:lang w:val="es-ES"/>
+        </w:rPr>
+        <w:t>incident</w:t>
+      </w:r>
+      <w:proofErr w:type="spellEnd"/>
+      <w:r>
+        <w:rPr>
+          <w:lang w:val="es-ES"/>
+        </w:rPr>
+        <w:t xml:space="preserve"> </w:t>
+      </w:r>
+      <w:proofErr w:type="spellStart"/>
+      <w:r>
+        <w:rPr>
+          <w:lang w:val="es-ES"/>
+        </w:rPr>
+        <w:t>description</w:t>
+      </w:r>
+      <w:proofErr w:type="spellEnd"/>
+      <w:r>
+        <w:rPr>
+          <w:lang w:val="es-ES"/>
+        </w:rPr>
+        <w:t xml:space="preserve">, and contextual </w:t>
+      </w:r>
+      <w:proofErr w:type="spellStart"/>
+      <w:r>
+        <w:rPr>
+          <w:lang w:val="es-ES"/>
+        </w:rPr>
+        <w:t>icons</w:t>
+      </w:r>
+      <w:proofErr w:type="spellEnd"/>
+      <w:r>
+        <w:rPr>
+          <w:lang w:val="es-ES"/>
+        </w:rPr>
+        <w:t xml:space="preserve"> (</w:t>
+      </w:r>
+      <w:proofErr w:type="spellStart"/>
+      <w:r>
+        <w:rPr>
+          <w:lang w:val="es-ES"/>
+        </w:rPr>
+        <w:t>rendering</w:t>
+      </w:r>
+      <w:proofErr w:type="spellEnd"/>
+      <w:r>
+        <w:rPr>
+          <w:lang w:val="es-ES"/>
+        </w:rPr>
+        <w:t xml:space="preserve"> </w:t>
+      </w:r>
+      <w:proofErr w:type="spellStart"/>
+      <w:r>
+        <w:rPr>
+          <w:lang w:val="es-ES"/>
+        </w:rPr>
+        <w:t>distinct</w:t>
+      </w:r>
+      <w:proofErr w:type="spellEnd"/>
+      <w:r>
+        <w:rPr>
+          <w:lang w:val="es-ES"/>
+        </w:rPr>
+        <w:t xml:space="preserve"> </w:t>
+      </w:r>
+      <w:proofErr w:type="spellStart"/>
+      <w:r>
+        <w:rPr>
+          <w:lang w:val="es-ES"/>
+        </w:rPr>
+        <w:t>graphics</w:t>
+      </w:r>
+      <w:proofErr w:type="spellEnd"/>
+      <w:r>
+        <w:rPr>
+          <w:lang w:val="es-ES"/>
+        </w:rPr>
+        <w:t xml:space="preserve"> </w:t>
+      </w:r>
+      <w:proofErr w:type="spellStart"/>
+      <w:r>
+        <w:rPr>
+          <w:lang w:val="es-ES"/>
+        </w:rPr>
+        <w:t>for</w:t>
+      </w:r>
+      <w:proofErr w:type="spellEnd"/>
+      <w:r>
+        <w:rPr>
+          <w:lang w:val="es-ES"/>
+        </w:rPr>
+        <w:t xml:space="preserve"> </w:t>
+      </w:r>
+      <w:proofErr w:type="spellStart"/>
+      <w:r>
+        <w:rPr>
+          <w:lang w:val="es-ES"/>
+        </w:rPr>
+        <w:t>goals</w:t>
+      </w:r>
+      <w:proofErr w:type="spellEnd"/>
+      <w:r>
+        <w:rPr>
+          <w:lang w:val="es-ES"/>
+        </w:rPr>
+        <w:t xml:space="preserve">, </w:t>
+      </w:r>
+      <w:proofErr w:type="spellStart"/>
+      <w:r>
+        <w:rPr>
+          <w:lang w:val="es-ES"/>
+        </w:rPr>
+        <w:t>yellow</w:t>
+      </w:r>
+      <w:proofErr w:type="spellEnd"/>
+      <w:r>
+        <w:rPr>
+          <w:lang w:val="es-ES"/>
+        </w:rPr>
+        <w:t xml:space="preserve"> </w:t>
+      </w:r>
+      <w:proofErr w:type="spellStart"/>
+      <w:r>
+        <w:rPr>
+          <w:lang w:val="es-ES"/>
+        </w:rPr>
+        <w:t>cards</w:t>
+      </w:r>
+      <w:proofErr w:type="spellEnd"/>
+      <w:r>
+        <w:rPr>
+          <w:lang w:val="es-ES"/>
+        </w:rPr>
+        <w:t xml:space="preserve">, and red </w:t>
+      </w:r>
+      <w:proofErr w:type="spellStart"/>
+      <w:r>
+        <w:rPr>
+          <w:lang w:val="es-ES"/>
+        </w:rPr>
+        <w:t>cards</w:t>
+      </w:r>
+      <w:proofErr w:type="spellEnd"/>
+      <w:r>
+        <w:rPr>
+          <w:lang w:val="es-ES"/>
+        </w:rPr>
+        <w:t xml:space="preserve">). </w:t>
+      </w:r>
+      <w:proofErr w:type="spellStart"/>
+      <w:r>
+        <w:rPr>
+          <w:lang w:val="es-ES"/>
+        </w:rPr>
+        <w:t>Lastly</w:t>
+      </w:r>
+      <w:proofErr w:type="spellEnd"/>
+      <w:r>
+        <w:rPr>
+          <w:lang w:val="es-ES"/>
+        </w:rPr>
+        <w:t xml:space="preserve">, I </w:t>
+      </w:r>
+      <w:proofErr w:type="spellStart"/>
+      <w:r>
+        <w:rPr>
+          <w:lang w:val="es-ES"/>
+        </w:rPr>
+        <w:t>performed</w:t>
+      </w:r>
+      <w:proofErr w:type="spellEnd"/>
+      <w:r>
+        <w:rPr>
+          <w:lang w:val="es-ES"/>
+        </w:rPr>
+        <w:t xml:space="preserve"> </w:t>
+      </w:r>
+      <w:proofErr w:type="spellStart"/>
+      <w:r>
+        <w:rPr>
+          <w:lang w:val="es-ES"/>
+        </w:rPr>
+        <w:t>end-to-end</w:t>
+      </w:r>
+      <w:proofErr w:type="spellEnd"/>
+      <w:r>
+        <w:rPr>
+          <w:lang w:val="es-ES"/>
+        </w:rPr>
+        <w:t xml:space="preserve"> </w:t>
+      </w:r>
+      <w:proofErr w:type="spellStart"/>
+      <w:r>
+        <w:rPr>
+          <w:lang w:val="es-ES"/>
+        </w:rPr>
+        <w:t>testing</w:t>
+      </w:r>
+      <w:proofErr w:type="spellEnd"/>
+      <w:r>
+        <w:rPr>
+          <w:lang w:val="es-ES"/>
+        </w:rPr>
+        <w:t xml:space="preserve"> </w:t>
+      </w:r>
+      <w:proofErr w:type="spellStart"/>
+      <w:r>
+        <w:rPr>
+          <w:lang w:val="es-ES"/>
+        </w:rPr>
+        <w:t>on</w:t>
+      </w:r>
+      <w:proofErr w:type="spellEnd"/>
+      <w:r>
+        <w:rPr>
+          <w:lang w:val="es-ES"/>
+        </w:rPr>
+        <w:t xml:space="preserve"> </w:t>
+      </w:r>
+      <w:proofErr w:type="spellStart"/>
+      <w:r>
+        <w:rPr>
+          <w:lang w:val="es-ES"/>
+        </w:rPr>
+        <w:t>my</w:t>
+      </w:r>
+      <w:proofErr w:type="spellEnd"/>
+      <w:r>
+        <w:rPr>
+          <w:lang w:val="es-ES"/>
+        </w:rPr>
+        <w:t xml:space="preserve"> </w:t>
+      </w:r>
+      <w:proofErr w:type="spellStart"/>
+      <w:r>
+        <w:rPr>
+          <w:lang w:val="es-ES"/>
+        </w:rPr>
+        <w:t>physical</w:t>
+      </w:r>
+      <w:proofErr w:type="spellEnd"/>
+      <w:r>
+        <w:rPr>
+          <w:lang w:val="es-ES"/>
+        </w:rPr>
+        <w:t xml:space="preserve"> Android </w:t>
+      </w:r>
+      <w:proofErr w:type="spellStart"/>
+      <w:r>
+        <w:rPr>
+          <w:lang w:val="es-ES"/>
+        </w:rPr>
+        <w:t>device</w:t>
+      </w:r>
+      <w:proofErr w:type="spellEnd"/>
+      <w:r>
+        <w:rPr>
+          <w:lang w:val="es-ES"/>
+        </w:rPr>
+        <w:t xml:space="preserve"> </w:t>
+      </w:r>
+      <w:proofErr w:type="spellStart"/>
+      <w:r>
+        <w:rPr>
+          <w:lang w:val="es-ES"/>
+        </w:rPr>
+        <w:t>to</w:t>
+      </w:r>
+      <w:proofErr w:type="spellEnd"/>
+      <w:r>
+        <w:rPr>
+          <w:lang w:val="es-ES"/>
+        </w:rPr>
+        <w:t xml:space="preserve"> </w:t>
+      </w:r>
+      <w:proofErr w:type="spellStart"/>
+      <w:r>
+        <w:rPr>
+          <w:lang w:val="es-ES"/>
+        </w:rPr>
+        <w:t>verify</w:t>
+      </w:r>
+      <w:proofErr w:type="spellEnd"/>
+      <w:r>
+        <w:rPr>
+          <w:lang w:val="es-ES"/>
+        </w:rPr>
+        <w:t xml:space="preserve"> </w:t>
+      </w:r>
+      <w:proofErr w:type="spellStart"/>
+      <w:r>
+        <w:rPr>
+          <w:lang w:val="es-ES"/>
+        </w:rPr>
+        <w:t>timer</w:t>
+      </w:r>
+      <w:proofErr w:type="spellEnd"/>
+      <w:r>
+        <w:rPr>
+          <w:lang w:val="es-ES"/>
+        </w:rPr>
+        <w:t xml:space="preserve"> </w:t>
+      </w:r>
+      <w:proofErr w:type="spellStart"/>
+      <w:r>
+        <w:rPr>
+          <w:lang w:val="es-ES"/>
+        </w:rPr>
+        <w:t>accuracy</w:t>
+      </w:r>
+      <w:proofErr w:type="spellEnd"/>
+      <w:r>
+        <w:rPr>
+          <w:lang w:val="es-ES"/>
+        </w:rPr>
+        <w:t xml:space="preserve">, </w:t>
+      </w:r>
+      <w:proofErr w:type="spellStart"/>
+      <w:r>
+        <w:rPr>
+          <w:lang w:val="es-ES"/>
+        </w:rPr>
+        <w:t>state</w:t>
+      </w:r>
+      <w:proofErr w:type="spellEnd"/>
+      <w:r>
+        <w:rPr>
+          <w:lang w:val="es-ES"/>
+        </w:rPr>
+        <w:t xml:space="preserve"> </w:t>
+      </w:r>
+      <w:proofErr w:type="spellStart"/>
+      <w:r>
+        <w:rPr>
+          <w:lang w:val="es-ES"/>
+        </w:rPr>
+        <w:t>transitions</w:t>
+      </w:r>
+      <w:proofErr w:type="spellEnd"/>
+      <w:r>
+        <w:rPr>
+          <w:lang w:val="es-ES"/>
+        </w:rPr>
+        <w:t xml:space="preserve">, and UI </w:t>
+      </w:r>
+      <w:proofErr w:type="spellStart"/>
+      <w:r>
+        <w:rPr>
+          <w:lang w:val="es-ES"/>
+        </w:rPr>
+        <w:t>responsiveness</w:t>
+      </w:r>
+      <w:proofErr w:type="spellEnd"/>
+      <w:r>
+        <w:rPr>
+          <w:lang w:val="es-ES"/>
+        </w:rPr>
+        <w:t xml:space="preserve">. The </w:t>
+      </w:r>
+      <w:proofErr w:type="spellStart"/>
+      <w:r>
+        <w:rPr>
+          <w:lang w:val="es-ES"/>
+        </w:rPr>
+        <w:t>application</w:t>
+      </w:r>
+      <w:proofErr w:type="spellEnd"/>
+      <w:r>
+        <w:rPr>
+          <w:lang w:val="es-ES"/>
+        </w:rPr>
+        <w:t xml:space="preserve"> </w:t>
+      </w:r>
+      <w:proofErr w:type="spellStart"/>
+      <w:r>
+        <w:rPr>
+          <w:lang w:val="es-ES"/>
+        </w:rPr>
+        <w:t>is</w:t>
+      </w:r>
+      <w:proofErr w:type="spellEnd"/>
+      <w:r>
+        <w:rPr>
+          <w:lang w:val="es-ES"/>
+        </w:rPr>
+        <w:t xml:space="preserve"> </w:t>
+      </w:r>
+      <w:proofErr w:type="spellStart"/>
+      <w:r>
+        <w:rPr>
+          <w:lang w:val="es-ES"/>
+        </w:rPr>
+        <w:t>fully</w:t>
+      </w:r>
+      <w:proofErr w:type="spellEnd"/>
+      <w:r>
+        <w:rPr>
+          <w:lang w:val="es-ES"/>
+        </w:rPr>
+        <w:t xml:space="preserve"> </w:t>
+      </w:r>
+      <w:proofErr w:type="spellStart"/>
+      <w:r>
+        <w:rPr>
+          <w:lang w:val="es-ES"/>
+        </w:rPr>
+        <w:t>functional</w:t>
+      </w:r>
+      <w:proofErr w:type="spellEnd"/>
+      <w:r>
+        <w:rPr>
+          <w:lang w:val="es-ES"/>
+        </w:rPr>
+        <w:t xml:space="preserve">, </w:t>
+      </w:r>
+      <w:proofErr w:type="spellStart"/>
+      <w:r>
+        <w:rPr>
+          <w:lang w:val="es-ES"/>
+        </w:rPr>
+        <w:t>properly</w:t>
+      </w:r>
+      <w:proofErr w:type="spellEnd"/>
+      <w:r>
+        <w:rPr>
+          <w:lang w:val="es-ES"/>
+        </w:rPr>
+        <w:t xml:space="preserve"> </w:t>
+      </w:r>
+      <w:proofErr w:type="spellStart"/>
+      <w:r>
+        <w:rPr>
+          <w:lang w:val="es-ES"/>
+        </w:rPr>
+        <w:t>structured</w:t>
+      </w:r>
+      <w:proofErr w:type="spellEnd"/>
+      <w:r>
+        <w:rPr>
+          <w:lang w:val="es-ES"/>
+        </w:rPr>
+        <w:t xml:space="preserve">, and </w:t>
+      </w:r>
+      <w:proofErr w:type="spellStart"/>
+      <w:r>
+        <w:rPr>
+          <w:lang w:val="es-ES"/>
+        </w:rPr>
+        <w:t>ready</w:t>
+      </w:r>
+      <w:proofErr w:type="spellEnd"/>
+      <w:r>
+        <w:rPr>
+          <w:lang w:val="es-ES"/>
+        </w:rPr>
+        <w:t xml:space="preserve"> </w:t>
+      </w:r>
+      <w:proofErr w:type="spellStart"/>
+      <w:r>
+        <w:rPr>
+          <w:lang w:val="es-ES"/>
+        </w:rPr>
+        <w:t>for</w:t>
+      </w:r>
+      <w:proofErr w:type="spellEnd"/>
+      <w:r>
+        <w:rPr>
+          <w:lang w:val="es-ES"/>
+        </w:rPr>
+        <w:t xml:space="preserve"> </w:t>
+      </w:r>
+      <w:proofErr w:type="spellStart"/>
+      <w:r>
+        <w:rPr>
+          <w:lang w:val="es-ES"/>
+        </w:rPr>
+        <w:t>submission</w:t>
+      </w:r>
+      <w:proofErr w:type="spellEnd"/>
+      <w:r>
+        <w:rPr>
+          <w:lang w:val="es-ES"/>
+        </w:rPr>
+        <w:t>.</w:t>
+      </w:r>
+    </w:p>
+    <w:p>
+      <w:pPr>
+        <w:pStyle w:val="Textoindependiente"/>
+        <w:rPr>
+          <w:lang w:val="es-ES"/>
+        </w:rPr>
+      </w:pPr>
+    </w:p>
+    <w:p>
+      <w:pPr>
+        <w:pStyle w:val="Textoindependiente"/>
+        <w:rPr>
+          <w:lang w:val="es-ES"/>
+        </w:rPr>
+      </w:pPr>
     </w:p>
     <w:p>
       <w:pPr>
@@ -4607,24 +8692,6 @@
 </file>
 
 <file path=customXml/item1.xml><?xml version="1.0" encoding="utf-8"?>
-<p:properties xmlns:p="http://schemas.microsoft.com/office/2006/metadata/properties" xmlns:xsi="http://www.w3.org/2001/XMLSchema-instance" xmlns:pc="http://schemas.microsoft.com/office/infopath/2007/PartnerControls">
-  <documentManagement>
-    <PublishingExpirationDate xmlns="http://schemas.microsoft.com/sharepoint/v3" xsi:nil="true"/>
-    <PublishingStartDate xmlns="http://schemas.microsoft.com/sharepoint/v3" xsi:nil="true"/>
-  </documentManagement>
-</p:properties>
-</file>
-
-<file path=customXml/item2.xml><?xml version="1.0" encoding="utf-8"?>
-<?mso-contentType ?>
-<FormTemplates xmlns="http://schemas.microsoft.com/sharepoint/v3/contenttype/forms">
-  <Display>DocumentLibraryForm</Display>
-  <Edit>DocumentLibraryForm</Edit>
-  <New>DocumentLibraryForm</New>
-</FormTemplates>
-</file>
-
-<file path=customXml/item3.xml><?xml version="1.0" encoding="utf-8"?>
 <ct:contentTypeSchema xmlns:ct="http://schemas.microsoft.com/office/2006/metadata/contentType" xmlns:ma="http://schemas.microsoft.com/office/2006/metadata/properties/metaAttributes" ct:_="" ma:_="" ma:contentTypeName="Asiakirja" ma:contentTypeID="0x01010017418C401CCB2042A3A99A19F43F356D" ma:contentTypeVersion="1" ma:contentTypeDescription="Luo uusi asiakirja." ma:contentTypeScope="" ma:versionID="f4b075d3ca74a5dbaed73e767a156aa0">
   <xsd:schema xmlns:xsd="http://www.w3.org/2001/XMLSchema" xmlns:p="http://schemas.microsoft.com/office/2006/metadata/properties" xmlns:ns1="http://schemas.microsoft.com/sharepoint/v3" targetNamespace="http://schemas.microsoft.com/office/2006/metadata/properties" ma:root="true" ma:fieldsID="4340a008e99365d80b71206bae222996" ns1:_="">
     <xsd:import namespace="http://schemas.microsoft.com/sharepoint/v3"/>
@@ -4690,25 +8757,25 @@
 </ct:contentTypeSchema>
 </file>
 
-<file path=customXml/itemProps1.xml><?xml version="1.0" encoding="utf-8"?>
-<ds:datastoreItem xmlns:ds="http://schemas.openxmlformats.org/officeDocument/2006/customXml" ds:itemID="{FA8F0064-303C-446D-896E-46EEB9A79DC3}">
-  <ds:schemaRefs>
-    <ds:schemaRef ds:uri="http://schemas.microsoft.com/office/2006/metadata/properties"/>
-    <ds:schemaRef ds:uri="http://schemas.microsoft.com/office/infopath/2007/PartnerControls"/>
-    <ds:schemaRef ds:uri="http://schemas.microsoft.com/sharepoint/v3"/>
-  </ds:schemaRefs>
-</ds:datastoreItem>
+<file path=customXml/item2.xml><?xml version="1.0" encoding="utf-8"?>
+<?mso-contentType ?>
+<FormTemplates xmlns="http://schemas.microsoft.com/sharepoint/v3/contenttype/forms">
+  <Display>DocumentLibraryForm</Display>
+  <Edit>DocumentLibraryForm</Edit>
+  <New>DocumentLibraryForm</New>
+</FormTemplates>
 </file>
 
-<file path=customXml/itemProps2.xml><?xml version="1.0" encoding="utf-8"?>
-<ds:datastoreItem xmlns:ds="http://schemas.openxmlformats.org/officeDocument/2006/customXml" ds:itemID="{13FBD2FA-5696-460D-A278-9A302A0F72AE}">
-  <ds:schemaRefs>
-    <ds:schemaRef ds:uri="http://schemas.microsoft.com/sharepoint/v3/contenttype/forms"/>
-  </ds:schemaRefs>
-</ds:datastoreItem>
+<file path=customXml/item3.xml><?xml version="1.0" encoding="utf-8"?>
+<p:properties xmlns:p="http://schemas.microsoft.com/office/2006/metadata/properties" xmlns:xsi="http://www.w3.org/2001/XMLSchema-instance" xmlns:pc="http://schemas.microsoft.com/office/infopath/2007/PartnerControls">
+  <documentManagement>
+    <PublishingExpirationDate xmlns="http://schemas.microsoft.com/sharepoint/v3" xsi:nil="true"/>
+    <PublishingStartDate xmlns="http://schemas.microsoft.com/sharepoint/v3" xsi:nil="true"/>
+  </documentManagement>
+</p:properties>
 </file>
 
-<file path=customXml/itemProps3.xml><?xml version="1.0" encoding="utf-8"?>
+<file path=customXml/itemProps1.xml><?xml version="1.0" encoding="utf-8"?>
 <ds:datastoreItem xmlns:ds="http://schemas.openxmlformats.org/officeDocument/2006/customXml" ds:itemID="{B9A87442-5A7B-46FD-BD28-170CE9B7256F}">
   <ds:schemaRefs>
     <ds:schemaRef ds:uri="http://schemas.microsoft.com/office/2006/metadata/contentType"/>
@@ -4723,4 +8790,22 @@
     <ds:schemaRef ds:uri="http://schemas.microsoft.com/office/internal/2005/internalDocumentation"/>
   </ds:schemaRefs>
 </ds:datastoreItem>
+</file>
+
+<file path=customXml/itemProps2.xml><?xml version="1.0" encoding="utf-8"?>
+<ds:datastoreItem xmlns:ds="http://schemas.openxmlformats.org/officeDocument/2006/customXml" ds:itemID="{13FBD2FA-5696-460D-A278-9A302A0F72AE}">
+  <ds:schemaRefs>
+    <ds:schemaRef ds:uri="http://schemas.microsoft.com/sharepoint/v3/contenttype/forms"/>
+  </ds:schemaRefs>
+</ds:datastoreItem>
+</file>
+
+<file path=customXml/itemProps3.xml><?xml version="1.0" encoding="utf-8"?>
+<ds:datastoreItem xmlns:ds="http://schemas.openxmlformats.org/officeDocument/2006/customXml" ds:itemID="{FA8F0064-303C-446D-896E-46EEB9A79DC3}">
+  <ds:schemaRefs>
+    <ds:schemaRef ds:uri="http://schemas.microsoft.com/office/2006/metadata/properties"/>
+    <ds:schemaRef ds:uri="http://schemas.microsoft.com/office/infopath/2007/PartnerControls"/>
+    <ds:schemaRef ds:uri="http://schemas.microsoft.com/sharepoint/v3"/>
+  </ds:schemaRefs>
+</ds:datastoreItem>
 </file>
</xml_diff>